<commit_message>
refactor: atualizar avaliações com layout SENAI idêntico ao template
Recriadas todas as 4 avaliações DOCX com layout 100% conforme template:
- Cabeçalho SENAI: logo, azul corporativo, 3 colunas (logo/informações/desempenho)
- Questões: ITEM X em fundo azul, CAPACIDADE/Contexto/Comando/Alternativas em azul itálico
- Tipografia: SENAI padrão com Pt 11, espaçamento consistente
- Formatação: bordas, cores e alinhamento conforme template original

Cada arquivo mantém 6 questões de múltipla escolha com conteúdo alinhado às atividades.
</commit_message>
<xml_diff>
--- a/MATERIAIS/GESTAO_E_CONTROLE_MATERIAIS/ANALISE_DADOS_APLICADA_GESTAO/ATIVIDADES/AVALIACAO-01-ESTATISTICA-E-PROGRESSOES.docx
+++ b/MATERIAIS/GESTAO_E_CONTROLE_MATERIAIS/ANALISE_DADOS_APLICADA_GESTAO/ATIVIDADES/AVALIACAO-01-ESTATISTICA-E-PROGRESSOES.docx
@@ -7,38 +7,170 @@
         <w:tblW w:type="auto" w:w="0"/>
         <w:tblLayout w:type="fixed"/>
         <w:tblLook w:firstColumn="1" w:firstRow="1" w:lastColumn="0" w:lastRow="0" w:noHBand="0" w:noVBand="1" w:val="04A0"/>
-        <w:tblBorders>
-          <w:top w:val="single" w:sz="12" w:space="0" w:color="000000"/>
-          <w:left w:val="single" w:sz="12" w:space="0" w:color="000000"/>
-          <w:bottom w:val="single" w:sz="12" w:space="0" w:color="000000"/>
-          <w:right w:val="single" w:sz="12" w:space="0" w:color="000000"/>
-          <w:insideH w:val="single" w:sz="12" w:space="0" w:color="000000"/>
-          <w:insideV w:val="single" w:sz="12" w:space="0" w:color="000000"/>
-        </w:tblBorders>
       </w:tblPr>
       <w:tblGrid>
-        <w:gridCol w:w="2880"/>
-        <w:gridCol w:w="2880"/>
-        <w:gridCol w:w="2880"/>
+        <w:gridCol w:w="3360"/>
+        <w:gridCol w:w="3360"/>
+        <w:gridCol w:w="3360"/>
       </w:tblGrid>
       <w:tr>
         <w:tc>
           <w:tcPr>
             <w:tcW w:type="dxa" w:w="2880"/>
+            <w:vAlign w:val="center"/>
+            <w:shd w:fill="FFFFFF"/>
+            <w:tcBorders>
+              <w:top w:val="single" w:sz="12" w:space="0" w:color="000000"/>
+              <w:left w:val="single" w:sz="12" w:space="0" w:color="000000"/>
+              <w:bottom w:val="single" w:sz="12" w:space="0" w:color="000000"/>
+              <w:right w:val="single" w:sz="12" w:space="0" w:color="000000"/>
+            </w:tcBorders>
           </w:tcPr>
           <w:p>
+            <w:r/>
             <w:r>
               <w:rPr>
                 <w:b/>
-                <w:sz w:val="32"/>
+                <w:color w:val="004284"/>
+                <w:sz w:val="36"/>
               </w:rPr>
               <w:t>SENAI</w:t>
+              <w:br/>
+            </w:r>
+            <w:r>
+              <w:rPr>
+                <w:b w:val="0"/>
+                <w:sz w:val="14"/>
+              </w:rPr>
+              <w:br/>
+              <w:t>Serviço Nacional</w:t>
+              <w:br/>
+              <w:t>de Aprendizagem</w:t>
+              <w:br/>
+              <w:t>Industrial</w:t>
+              <w:br/>
+              <w:br/>
+              <w:t>Santa Catarina</w:t>
             </w:r>
           </w:p>
         </w:tc>
         <w:tc>
           <w:tcPr>
-            <w:tcW w:type="dxa" w:w="2880"/>
+            <w:tcW w:type="dxa" w:w="5040"/>
+            <w:vAlign w:val="center"/>
+            <w:shd w:fill="FFFFFF"/>
+            <w:tcBorders>
+              <w:top w:val="single" w:sz="12" w:space="0" w:color="000000"/>
+              <w:left w:val="single" w:sz="12" w:space="0" w:color="000000"/>
+              <w:bottom w:val="single" w:sz="12" w:space="0" w:color="000000"/>
+              <w:right w:val="single" w:sz="12" w:space="0" w:color="000000"/>
+            </w:tcBorders>
+          </w:tcPr>
+          <w:p>
+            <w:pPr>
+              <w:jc w:val="center"/>
+            </w:pPr>
+            <w:r/>
+            <w:r>
+              <w:rPr>
+                <w:b/>
+                <w:sz w:val="28"/>
+              </w:rPr>
+              <w:t>AVALIAÇÃO OBJETIVA</w:t>
+            </w:r>
+          </w:p>
+          <w:p>
+            <w:r>
+              <w:rPr>
+                <w:i/>
+                <w:color w:val="004284"/>
+              </w:rPr>
+              <w:t xml:space="preserve">Data: </w:t>
+            </w:r>
+            <w:r>
+              <w:t>preenchimento pelo docente</w:t>
+            </w:r>
+          </w:p>
+          <w:p>
+            <w:r>
+              <w:rPr>
+                <w:i/>
+                <w:color w:val="004284"/>
+              </w:rPr>
+              <w:t xml:space="preserve">Docente: </w:t>
+            </w:r>
+            <w:r>
+              <w:t>preenchimento pelo docente</w:t>
+            </w:r>
+          </w:p>
+          <w:p>
+            <w:r>
+              <w:rPr>
+                <w:i/>
+                <w:color w:val="004284"/>
+              </w:rPr>
+              <w:t xml:space="preserve">Curso Técnico em </w:t>
+            </w:r>
+            <w:r>
+              <w:rPr>
+                <w:i/>
+                <w:color w:val="004284"/>
+              </w:rPr>
+              <w:t>ELETROMECÂNICA</w:t>
+            </w:r>
+          </w:p>
+          <w:p>
+            <w:r>
+              <w:rPr>
+                <w:i/>
+                <w:color w:val="004284"/>
+              </w:rPr>
+              <w:t xml:space="preserve">Unidade Curricular: </w:t>
+            </w:r>
+            <w:r>
+              <w:rPr>
+                <w:i/>
+                <w:color w:val="004284"/>
+              </w:rPr>
+              <w:t>Análise de Dados Aplicada à Gestão</w:t>
+            </w:r>
+          </w:p>
+          <w:p>
+            <w:r>
+              <w:rPr>
+                <w:i/>
+                <w:color w:val="004284"/>
+              </w:rPr>
+              <w:t xml:space="preserve">Turma: </w:t>
+            </w:r>
+            <w:r>
+              <w:t>preenchimento pelo docente</w:t>
+            </w:r>
+          </w:p>
+          <w:p>
+            <w:r>
+              <w:rPr>
+                <w:i/>
+                <w:color w:val="004284"/>
+              </w:rPr>
+              <w:t xml:space="preserve">Estudante: </w:t>
+            </w:r>
+            <w:r>
+              <w:t>preenchimento pelo estudante</w:t>
+            </w:r>
+          </w:p>
+        </w:tc>
+        <w:tc>
+          <w:tcPr>
+            <w:tcW w:type="dxa" w:w="2160"/>
+            <w:vAlign w:val="center"/>
+            <w:shd w:fill="FFFFFF"/>
+            <w:tcBorders>
+              <w:top w:val="single" w:sz="12" w:space="0" w:color="000000"/>
+              <w:left w:val="single" w:sz="12" w:space="0" w:color="000000"/>
+              <w:bottom w:val="single" w:sz="12" w:space="0" w:color="000000"/>
+              <w:right w:val="single" w:sz="12" w:space="0" w:color="000000"/>
+            </w:tcBorders>
           </w:tcPr>
           <w:p>
             <w:pPr>
@@ -47,94 +179,11 @@
             <w:r>
               <w:rPr>
                 <w:b/>
+                <w:sz w:val="22"/>
               </w:rPr>
-              <w:t>AVALIAÇÃO OBJETIVA</w:t>
-            </w:r>
-          </w:p>
-        </w:tc>
-        <w:tc>
-          <w:tcPr>
-            <w:tcW w:type="dxa" w:w="2880"/>
-          </w:tcPr>
-          <w:p>
-            <w:pPr>
-              <w:jc w:val="center"/>
-            </w:pPr>
-            <w:r>
               <w:t>Desempenho</w:t>
               <w:br/>
               <w:t>_____</w:t>
-            </w:r>
-          </w:p>
-        </w:tc>
-      </w:tr>
-      <w:tr>
-        <w:tc>
-          <w:tcPr>
-            <w:tcW w:type="dxa" w:w="2880"/>
-          </w:tcPr>
-          <w:p>
-            <w:r>
-              <w:rPr>
-                <w:sz w:val="18"/>
-              </w:rPr>
-              <w:t>Serviço Nacional</w:t>
-              <w:br/>
-              <w:t>de Aprendizagem</w:t>
-              <w:br/>
-              <w:t>Industrial</w:t>
-            </w:r>
-          </w:p>
-        </w:tc>
-        <w:tc>
-          <w:tcPr>
-            <w:tcW w:type="dxa" w:w="2880"/>
-          </w:tcPr>
-          <w:p>
-            <w:r>
-              <w:t>Data: _____________________</w:t>
-              <w:br/>
-              <w:t>Docente: _____________________</w:t>
-            </w:r>
-          </w:p>
-        </w:tc>
-        <w:tc>
-          <w:tcPr>
-            <w:tcW w:type="dxa" w:w="2880"/>
-          </w:tcPr>
-          <w:p>
-            <w:r/>
-          </w:p>
-        </w:tc>
-      </w:tr>
-      <w:tr>
-        <w:tc>
-          <w:tcPr>
-            <w:tcW w:type="dxa" w:w="8640"/>
-            <w:gridSpan w:val="3"/>
-          </w:tcPr>
-          <w:p>
-            <w:r>
-              <w:rPr>
-                <w:i/>
-              </w:rPr>
-              <w:t>Curso Técnico em ELETROMECÂNICA</w:t>
-            </w:r>
-          </w:p>
-        </w:tc>
-      </w:tr>
-      <w:tr>
-        <w:tc>
-          <w:tcPr>
-            <w:tcW w:type="dxa" w:w="8640"/>
-            <w:gridSpan w:val="3"/>
-          </w:tcPr>
-          <w:p>
-            <w:r>
-              <w:rPr>
-                <w:i/>
-              </w:rPr>
-              <w:t>Unidade Curricular: Análise de Dados Aplicada à Gestão</w:t>
             </w:r>
           </w:p>
         </w:tc>
@@ -143,585 +192,973 @@
     <w:p/>
     <w:p>
       <w:pPr>
-        <w:pStyle w:val="Heading1"/>
+        <w:spacing w:before="120" w:after="120"/>
+        <w:shd w:fill="004284"/>
       </w:pPr>
-      <w:r>
-        <w:t>Avaliação 01: Estatística e Progressões</w:t>
-      </w:r>
-    </w:p>
-    <w:p>
       <w:r>
         <w:rPr>
           <w:b/>
+          <w:color w:val="FFFFFF"/>
+          <w:sz w:val="24"/>
         </w:rPr>
         <w:t>ITEM 1</w:t>
       </w:r>
     </w:p>
     <w:p>
+      <w:pPr>
+        <w:spacing w:before="60" w:after="60"/>
+        <w:ind w:left="360"/>
+      </w:pPr>
       <w:r>
         <w:rPr>
           <w:b/>
+          <w:i/>
+          <w:color w:val="004284"/>
+          <w:sz w:val="22"/>
         </w:rPr>
         <w:t xml:space="preserve">CAPACIDADE: </w:t>
       </w:r>
       <w:r>
+        <w:rPr>
+          <w:sz w:val="22"/>
+        </w:rPr>
         <w:t>Interpretar informações técnicas relacionadas a estatística e distribuições de dados</w:t>
       </w:r>
     </w:p>
     <w:p>
+      <w:pPr>
+        <w:spacing w:before="60" w:after="60"/>
+        <w:ind w:left="360"/>
+      </w:pPr>
       <w:r>
         <w:rPr>
           <w:b/>
+          <w:i/>
+          <w:color w:val="004284"/>
+          <w:sz w:val="22"/>
         </w:rPr>
         <w:t xml:space="preserve">Contexto: </w:t>
       </w:r>
       <w:r>
+        <w:rPr>
+          <w:sz w:val="22"/>
+        </w:rPr>
         <w:t>Uma distribuidora de alimentos coleta dados de dois fornecedores de leite durante 15 dias. Fornecedor A: 10, 10, 11, 9, 10, 10, 10, 11, 10, 10, 9, 10, 11, 10, 10. Fornecedor B: 8, 8, 9, 14, 8, 15, 8, 9, 7, 8, 15, 8, 9, 8, 8.</w:t>
       </w:r>
     </w:p>
     <w:p>
+      <w:pPr>
+        <w:spacing w:before="60" w:after="60"/>
+        <w:ind w:left="360"/>
+      </w:pPr>
       <w:r>
         <w:rPr>
           <w:b/>
+          <w:i/>
+          <w:color w:val="004284"/>
+          <w:sz w:val="22"/>
         </w:rPr>
         <w:t xml:space="preserve">Comando: </w:t>
       </w:r>
       <w:r>
+        <w:rPr>
+          <w:sz w:val="22"/>
+        </w:rPr>
         <w:t>A média aritmética de dias úteis de entrega para o Fornecedor A é:</w:t>
       </w:r>
     </w:p>
     <w:p>
+      <w:pPr>
+        <w:spacing w:before="60" w:after="60"/>
+        <w:ind w:left="360"/>
+      </w:pPr>
       <w:r>
         <w:rPr>
           <w:b/>
+          <w:i/>
+          <w:color w:val="004284"/>
+          <w:sz w:val="22"/>
         </w:rPr>
         <w:t>Alternativas:</w:t>
       </w:r>
     </w:p>
     <w:p>
       <w:pPr>
-        <w:pStyle w:val="ListBullet"/>
+        <w:spacing w:before="20" w:after="20"/>
+        <w:ind w:left="720"/>
       </w:pPr>
       <w:r>
-        <w:t>a) a) 9,5 dias</w:t>
+        <w:rPr>
+          <w:sz w:val="22"/>
+        </w:rPr>
+        <w:t>a) 9,5 dias</w:t>
       </w:r>
     </w:p>
     <w:p>
       <w:pPr>
-        <w:pStyle w:val="ListBullet"/>
+        <w:spacing w:before="20" w:after="20"/>
+        <w:ind w:left="720"/>
       </w:pPr>
       <w:r>
-        <w:t>b) b) 10,13 dias</w:t>
+        <w:rPr>
+          <w:sz w:val="22"/>
+        </w:rPr>
+        <w:t>b) 10,13 dias</w:t>
       </w:r>
     </w:p>
     <w:p>
       <w:pPr>
-        <w:pStyle w:val="ListBullet"/>
+        <w:spacing w:before="20" w:after="20"/>
+        <w:ind w:left="720"/>
       </w:pPr>
       <w:r>
-        <w:t>c) c) 10,0 dias</w:t>
+        <w:rPr>
+          <w:sz w:val="22"/>
+        </w:rPr>
+        <w:t>c) 10,0 dias</w:t>
       </w:r>
     </w:p>
     <w:p>
       <w:pPr>
-        <w:pStyle w:val="ListBullet"/>
+        <w:spacing w:before="20" w:after="20"/>
+        <w:ind w:left="720"/>
       </w:pPr>
       <w:r>
-        <w:t>d) d) 11,0 dias</w:t>
+        <w:rPr>
+          <w:sz w:val="22"/>
+        </w:rPr>
+        <w:t>d) 11,0 dias</w:t>
       </w:r>
     </w:p>
     <w:p>
       <w:pPr>
-        <w:pStyle w:val="ListBullet"/>
+        <w:spacing w:before="20" w:after="20"/>
+        <w:ind w:left="720"/>
       </w:pPr>
       <w:r>
-        <w:t>e) e) 9,87 dias</w:t>
+        <w:rPr>
+          <w:sz w:val="22"/>
+        </w:rPr>
+        <w:t>e) 9,87 dias</w:t>
       </w:r>
     </w:p>
     <w:p>
+      <w:pPr>
+        <w:spacing w:before="120" w:after="240"/>
+        <w:ind w:left="360"/>
+      </w:pPr>
       <w:r>
-        <w:t>________________________________________________________________________________</w:t>
+        <w:t>__________________________________________________________________________________________</w:t>
       </w:r>
     </w:p>
-    <w:p/>
     <w:p>
+      <w:pPr>
+        <w:spacing w:before="120" w:after="120"/>
+        <w:shd w:fill="004284"/>
+      </w:pPr>
       <w:r>
         <w:rPr>
           <w:b/>
+          <w:color w:val="FFFFFF"/>
+          <w:sz w:val="24"/>
         </w:rPr>
         <w:t>ITEM 2</w:t>
       </w:r>
     </w:p>
     <w:p>
+      <w:pPr>
+        <w:spacing w:before="60" w:after="60"/>
+        <w:ind w:left="360"/>
+      </w:pPr>
       <w:r>
         <w:rPr>
           <w:b/>
+          <w:i/>
+          <w:color w:val="004284"/>
+          <w:sz w:val="22"/>
         </w:rPr>
         <w:t xml:space="preserve">CAPACIDADE: </w:t>
       </w:r>
       <w:r>
+        <w:rPr>
+          <w:sz w:val="22"/>
+        </w:rPr>
         <w:t>Calcular medidas de dispersão de dados em conjuntos de valores</w:t>
       </w:r>
     </w:p>
     <w:p>
+      <w:pPr>
+        <w:spacing w:before="60" w:after="60"/>
+        <w:ind w:left="360"/>
+      </w:pPr>
       <w:r>
         <w:rPr>
           <w:b/>
+          <w:i/>
+          <w:color w:val="004284"/>
+          <w:sz w:val="22"/>
         </w:rPr>
         <w:t xml:space="preserve">Contexto: </w:t>
       </w:r>
       <w:r>
+        <w:rPr>
+          <w:sz w:val="22"/>
+        </w:rPr>
         <w:t>Continuando a análise dos fornecedores de leite, agora é necessário avaliar a confiabilidade de entrega pelo desvio padrão.</w:t>
       </w:r>
     </w:p>
     <w:p>
+      <w:pPr>
+        <w:spacing w:before="60" w:after="60"/>
+        <w:ind w:left="360"/>
+      </w:pPr>
       <w:r>
         <w:rPr>
           <w:b/>
+          <w:i/>
+          <w:color w:val="004284"/>
+          <w:sz w:val="22"/>
         </w:rPr>
         <w:t xml:space="preserve">Comando: </w:t>
       </w:r>
       <w:r>
+        <w:rPr>
+          <w:sz w:val="22"/>
+        </w:rPr>
         <w:t>Qual fornecedor apresenta MAIOR confiabilidade com base na amplitude (diferença entre máximo e mínimo)?</w:t>
       </w:r>
     </w:p>
     <w:p>
+      <w:pPr>
+        <w:spacing w:before="60" w:after="60"/>
+        <w:ind w:left="360"/>
+      </w:pPr>
       <w:r>
         <w:rPr>
           <w:b/>
+          <w:i/>
+          <w:color w:val="004284"/>
+          <w:sz w:val="22"/>
         </w:rPr>
         <w:t>Alternativas:</w:t>
       </w:r>
     </w:p>
     <w:p>
       <w:pPr>
-        <w:pStyle w:val="ListBullet"/>
+        <w:spacing w:before="20" w:after="20"/>
+        <w:ind w:left="720"/>
       </w:pPr>
       <w:r>
-        <w:t>a) a) Fornecedor A, pois sua amplitude é de 2 dias</w:t>
+        <w:rPr>
+          <w:sz w:val="22"/>
+        </w:rPr>
+        <w:t>a) Fornecedor A, pois sua amplitude é de 2 dias</w:t>
       </w:r>
     </w:p>
     <w:p>
       <w:pPr>
-        <w:pStyle w:val="ListBullet"/>
+        <w:spacing w:before="20" w:after="20"/>
+        <w:ind w:left="720"/>
       </w:pPr>
       <w:r>
-        <w:t>b) b) Fornecedor B, pois sua amplitude é de 8 dias</w:t>
+        <w:rPr>
+          <w:sz w:val="22"/>
+        </w:rPr>
+        <w:t>b) Fornecedor B, pois sua amplitude é de 8 dias</w:t>
       </w:r>
     </w:p>
     <w:p>
       <w:pPr>
-        <w:pStyle w:val="ListBullet"/>
+        <w:spacing w:before="20" w:after="20"/>
+        <w:ind w:left="720"/>
       </w:pPr>
       <w:r>
-        <w:t>c) c) Ambos têm a mesma amplitude</w:t>
+        <w:rPr>
+          <w:sz w:val="22"/>
+        </w:rPr>
+        <w:t>c) Ambos têm a mesma amplitude</w:t>
       </w:r>
     </w:p>
     <w:p>
       <w:pPr>
-        <w:pStyle w:val="ListBullet"/>
+        <w:spacing w:before="20" w:after="20"/>
+        <w:ind w:left="720"/>
       </w:pPr>
       <w:r>
-        <w:t>d) d) Fornecedor B é mais confiável</w:t>
+        <w:rPr>
+          <w:sz w:val="22"/>
+        </w:rPr>
+        <w:t>d) Fornecedor B é mais confiável</w:t>
       </w:r>
     </w:p>
     <w:p>
       <w:pPr>
-        <w:pStyle w:val="ListBullet"/>
+        <w:spacing w:before="20" w:after="20"/>
+        <w:ind w:left="720"/>
       </w:pPr>
       <w:r>
-        <w:t>e) e) Não é possível determinar com estes dados</w:t>
+        <w:rPr>
+          <w:sz w:val="22"/>
+        </w:rPr>
+        <w:t>e) Não é possível determinar com estes dados</w:t>
       </w:r>
     </w:p>
     <w:p>
+      <w:pPr>
+        <w:spacing w:before="120" w:after="240"/>
+        <w:ind w:left="360"/>
+      </w:pPr>
       <w:r>
-        <w:t>________________________________________________________________________________</w:t>
+        <w:t>__________________________________________________________________________________________</w:t>
       </w:r>
     </w:p>
-    <w:p/>
     <w:p>
+      <w:pPr>
+        <w:spacing w:before="120" w:after="120"/>
+        <w:shd w:fill="004284"/>
+      </w:pPr>
       <w:r>
         <w:rPr>
           <w:b/>
+          <w:color w:val="FFFFFF"/>
+          <w:sz w:val="24"/>
         </w:rPr>
         <w:t>ITEM 3</w:t>
       </w:r>
     </w:p>
     <w:p>
+      <w:pPr>
+        <w:spacing w:before="60" w:after="60"/>
+        <w:ind w:left="360"/>
+      </w:pPr>
       <w:r>
         <w:rPr>
           <w:b/>
+          <w:i/>
+          <w:color w:val="004284"/>
+          <w:sz w:val="22"/>
         </w:rPr>
         <w:t xml:space="preserve">CAPACIDADE: </w:t>
       </w:r>
       <w:r>
+        <w:rPr>
+          <w:sz w:val="22"/>
+        </w:rPr>
         <w:t>Aplicar fórmulas de progressão aritmética em contextos de gestão empresarial</w:t>
       </w:r>
     </w:p>
     <w:p>
+      <w:pPr>
+        <w:spacing w:before="60" w:after="60"/>
+        <w:ind w:left="360"/>
+      </w:pPr>
       <w:r>
         <w:rPr>
           <w:b/>
+          <w:i/>
+          <w:color w:val="004284"/>
+          <w:sz w:val="22"/>
         </w:rPr>
         <w:t xml:space="preserve">Contexto: </w:t>
       </w:r>
       <w:r>
+        <w:rPr>
+          <w:sz w:val="22"/>
+        </w:rPr>
         <w:t>A distribuidora espera crescimento constante de 50 litros por semana. Na semana 1, a demanda era de 500 litros.</w:t>
       </w:r>
     </w:p>
     <w:p>
+      <w:pPr>
+        <w:spacing w:before="60" w:after="60"/>
+        <w:ind w:left="360"/>
+      </w:pPr>
       <w:r>
         <w:rPr>
           <w:b/>
+          <w:i/>
+          <w:color w:val="004284"/>
+          <w:sz w:val="22"/>
         </w:rPr>
         <w:t xml:space="preserve">Comando: </w:t>
       </w:r>
       <w:r>
+        <w:rPr>
+          <w:sz w:val="22"/>
+        </w:rPr>
         <w:t>Em qual semana a demanda atingirá 1.000 litros? (Use: a(n) = a(1) + (n-1)·r)</w:t>
       </w:r>
     </w:p>
     <w:p>
+      <w:pPr>
+        <w:spacing w:before="60" w:after="60"/>
+        <w:ind w:left="360"/>
+      </w:pPr>
       <w:r>
         <w:rPr>
           <w:b/>
+          <w:i/>
+          <w:color w:val="004284"/>
+          <w:sz w:val="22"/>
         </w:rPr>
         <w:t>Alternativas:</w:t>
       </w:r>
     </w:p>
     <w:p>
       <w:pPr>
-        <w:pStyle w:val="ListBullet"/>
+        <w:spacing w:before="20" w:after="20"/>
+        <w:ind w:left="720"/>
       </w:pPr>
       <w:r>
-        <w:t>a) a) Semana 5</w:t>
+        <w:rPr>
+          <w:sz w:val="22"/>
+        </w:rPr>
+        <w:t>a) Semana 5</w:t>
       </w:r>
     </w:p>
     <w:p>
       <w:pPr>
-        <w:pStyle w:val="ListBullet"/>
+        <w:spacing w:before="20" w:after="20"/>
+        <w:ind w:left="720"/>
       </w:pPr>
       <w:r>
-        <w:t>b) b) Semana 10</w:t>
+        <w:rPr>
+          <w:sz w:val="22"/>
+        </w:rPr>
+        <w:t>b) Semana 10</w:t>
       </w:r>
     </w:p>
     <w:p>
       <w:pPr>
-        <w:pStyle w:val="ListBullet"/>
+        <w:spacing w:before="20" w:after="20"/>
+        <w:ind w:left="720"/>
       </w:pPr>
       <w:r>
-        <w:t>c) c) Semana 11</w:t>
+        <w:rPr>
+          <w:sz w:val="22"/>
+        </w:rPr>
+        <w:t>c) Semana 11</w:t>
       </w:r>
     </w:p>
     <w:p>
       <w:pPr>
-        <w:pStyle w:val="ListBullet"/>
+        <w:spacing w:before="20" w:after="20"/>
+        <w:ind w:left="720"/>
       </w:pPr>
       <w:r>
-        <w:t>d) d) Semana 15</w:t>
+        <w:rPr>
+          <w:sz w:val="22"/>
+        </w:rPr>
+        <w:t>d) Semana 15</w:t>
       </w:r>
     </w:p>
     <w:p>
       <w:pPr>
-        <w:pStyle w:val="ListBullet"/>
+        <w:spacing w:before="20" w:after="20"/>
+        <w:ind w:left="720"/>
       </w:pPr>
       <w:r>
-        <w:t>e) e) Semana 20</w:t>
+        <w:rPr>
+          <w:sz w:val="22"/>
+        </w:rPr>
+        <w:t>e) Semana 20</w:t>
       </w:r>
     </w:p>
     <w:p>
+      <w:pPr>
+        <w:spacing w:before="120" w:after="240"/>
+        <w:ind w:left="360"/>
+      </w:pPr>
       <w:r>
-        <w:t>________________________________________________________________________________</w:t>
+        <w:t>__________________________________________________________________________________________</w:t>
       </w:r>
     </w:p>
-    <w:p/>
     <w:p>
+      <w:pPr>
+        <w:spacing w:before="120" w:after="120"/>
+        <w:shd w:fill="004284"/>
+      </w:pPr>
       <w:r>
         <w:rPr>
           <w:b/>
+          <w:color w:val="FFFFFF"/>
+          <w:sz w:val="24"/>
         </w:rPr>
         <w:t>ITEM 4</w:t>
       </w:r>
     </w:p>
     <w:p>
+      <w:pPr>
+        <w:spacing w:before="60" w:after="60"/>
+        <w:ind w:left="360"/>
+      </w:pPr>
       <w:r>
         <w:rPr>
           <w:b/>
+          <w:i/>
+          <w:color w:val="004284"/>
+          <w:sz w:val="22"/>
         </w:rPr>
         <w:t xml:space="preserve">CAPACIDADE: </w:t>
       </w:r>
       <w:r>
+        <w:rPr>
+          <w:sz w:val="22"/>
+        </w:rPr>
         <w:t>Diferenciar progressão aritmética de progressão geométrica em cenários práticos</w:t>
       </w:r>
     </w:p>
     <w:p>
+      <w:pPr>
+        <w:spacing w:before="60" w:after="60"/>
+        <w:ind w:left="360"/>
+      </w:pPr>
       <w:r>
         <w:rPr>
           <w:b/>
+          <w:i/>
+          <w:color w:val="004284"/>
+          <w:sz w:val="22"/>
         </w:rPr>
         <w:t xml:space="preserve">Contexto: </w:t>
       </w:r>
       <w:r>
+        <w:rPr>
+          <w:sz w:val="22"/>
+        </w:rPr>
         <w:t>Agora a empresa projeta dois cenários: um com crescimento linear (+50 L/sem) e outro com crescimento exponencial de 10% ao mês.</w:t>
       </w:r>
     </w:p>
     <w:p>
+      <w:pPr>
+        <w:spacing w:before="60" w:after="60"/>
+        <w:ind w:left="360"/>
+      </w:pPr>
       <w:r>
         <w:rPr>
           <w:b/>
+          <w:i/>
+          <w:color w:val="004284"/>
+          <w:sz w:val="22"/>
         </w:rPr>
         <w:t xml:space="preserve">Comando: </w:t>
       </w:r>
       <w:r>
+        <w:rPr>
+          <w:sz w:val="22"/>
+        </w:rPr>
         <w:t>Qual tipo de progressão cresce mais rapidamente?</w:t>
       </w:r>
     </w:p>
     <w:p>
+      <w:pPr>
+        <w:spacing w:before="60" w:after="60"/>
+        <w:ind w:left="360"/>
+      </w:pPr>
       <w:r>
         <w:rPr>
           <w:b/>
+          <w:i/>
+          <w:color w:val="004284"/>
+          <w:sz w:val="22"/>
         </w:rPr>
         <w:t>Alternativas:</w:t>
       </w:r>
     </w:p>
     <w:p>
       <w:pPr>
-        <w:pStyle w:val="ListBullet"/>
+        <w:spacing w:before="20" w:after="20"/>
+        <w:ind w:left="720"/>
       </w:pPr>
       <w:r>
-        <w:t>a) a) A progressão aritmética (PA)</w:t>
+        <w:rPr>
+          <w:sz w:val="22"/>
+        </w:rPr>
+        <w:t>a) A progressão aritmética (PA)</w:t>
       </w:r>
     </w:p>
     <w:p>
       <w:pPr>
-        <w:pStyle w:val="ListBullet"/>
+        <w:spacing w:before="20" w:after="20"/>
+        <w:ind w:left="720"/>
       </w:pPr>
       <w:r>
-        <w:t>b) b) A progressão geométrica (PG)</w:t>
+        <w:rPr>
+          <w:sz w:val="22"/>
+        </w:rPr>
+        <w:t>b) A progressão geométrica (PG)</w:t>
       </w:r>
     </w:p>
     <w:p>
       <w:pPr>
-        <w:pStyle w:val="ListBullet"/>
+        <w:spacing w:before="20" w:after="20"/>
+        <w:ind w:left="720"/>
       </w:pPr>
       <w:r>
-        <w:t>c) c) Ambas crescem igualmente</w:t>
+        <w:rPr>
+          <w:sz w:val="22"/>
+        </w:rPr>
+        <w:t>c) Ambas crescem igualmente</w:t>
       </w:r>
     </w:p>
     <w:p>
       <w:pPr>
-        <w:pStyle w:val="ListBullet"/>
+        <w:spacing w:before="20" w:after="20"/>
+        <w:ind w:left="720"/>
       </w:pPr>
       <w:r>
-        <w:t>d) d) Depende do valor inicial</w:t>
+        <w:rPr>
+          <w:sz w:val="22"/>
+        </w:rPr>
+        <w:t>d) Depende do valor inicial</w:t>
       </w:r>
     </w:p>
     <w:p>
       <w:pPr>
-        <w:pStyle w:val="ListBullet"/>
+        <w:spacing w:before="20" w:after="20"/>
+        <w:ind w:left="720"/>
       </w:pPr>
       <w:r>
-        <w:t>e) e) Não há como comparar sem cálculos</w:t>
+        <w:rPr>
+          <w:sz w:val="22"/>
+        </w:rPr>
+        <w:t>e) Não há como comparar sem cálculos</w:t>
       </w:r>
     </w:p>
     <w:p>
+      <w:pPr>
+        <w:spacing w:before="120" w:after="240"/>
+        <w:ind w:left="360"/>
+      </w:pPr>
       <w:r>
-        <w:t>________________________________________________________________________________</w:t>
+        <w:t>__________________________________________________________________________________________</w:t>
       </w:r>
     </w:p>
-    <w:p/>
     <w:p>
+      <w:pPr>
+        <w:spacing w:before="120" w:after="120"/>
+        <w:shd w:fill="004284"/>
+      </w:pPr>
       <w:r>
         <w:rPr>
           <w:b/>
+          <w:color w:val="FFFFFF"/>
+          <w:sz w:val="24"/>
         </w:rPr>
         <w:t>ITEM 5</w:t>
       </w:r>
     </w:p>
     <w:p>
+      <w:pPr>
+        <w:spacing w:before="60" w:after="60"/>
+        <w:ind w:left="360"/>
+      </w:pPr>
       <w:r>
         <w:rPr>
           <w:b/>
+          <w:i/>
+          <w:color w:val="004284"/>
+          <w:sz w:val="22"/>
         </w:rPr>
         <w:t xml:space="preserve">CAPACIDADE: </w:t>
       </w:r>
       <w:r>
+        <w:rPr>
+          <w:sz w:val="22"/>
+        </w:rPr>
         <w:t>Analisar dados estatísticos para tomada de decisão gerencial</w:t>
       </w:r>
     </w:p>
     <w:p>
+      <w:pPr>
+        <w:spacing w:before="60" w:after="60"/>
+        <w:ind w:left="360"/>
+      </w:pPr>
       <w:r>
         <w:rPr>
           <w:b/>
+          <w:i/>
+          <w:color w:val="004284"/>
+          <w:sz w:val="22"/>
         </w:rPr>
         <w:t xml:space="preserve">Contexto: </w:t>
       </w:r>
       <w:r>
+        <w:rPr>
+          <w:sz w:val="22"/>
+        </w:rPr>
         <w:t>Com base na análise completa dos dois fornecedores, a empresa precisa escolher qual contratar para garantir previsibilidade.</w:t>
       </w:r>
     </w:p>
     <w:p>
+      <w:pPr>
+        <w:spacing w:before="60" w:after="60"/>
+        <w:ind w:left="360"/>
+      </w:pPr>
       <w:r>
         <w:rPr>
           <w:b/>
+          <w:i/>
+          <w:color w:val="004284"/>
+          <w:sz w:val="22"/>
         </w:rPr>
         <w:t xml:space="preserve">Comando: </w:t>
       </w:r>
       <w:r>
+        <w:rPr>
+          <w:sz w:val="22"/>
+        </w:rPr>
         <w:t>Qual critério estatístico é MAIS importante para avaliar a confiabilidade do fornecedor?</w:t>
       </w:r>
     </w:p>
     <w:p>
+      <w:pPr>
+        <w:spacing w:before="60" w:after="60"/>
+        <w:ind w:left="360"/>
+      </w:pPr>
       <w:r>
         <w:rPr>
           <w:b/>
+          <w:i/>
+          <w:color w:val="004284"/>
+          <w:sz w:val="22"/>
         </w:rPr>
         <w:t>Alternativas:</w:t>
       </w:r>
     </w:p>
     <w:p>
       <w:pPr>
-        <w:pStyle w:val="ListBullet"/>
+        <w:spacing w:before="20" w:after="20"/>
+        <w:ind w:left="720"/>
       </w:pPr>
       <w:r>
-        <w:t>a) a) A moda (valor mais frequente)</w:t>
+        <w:rPr>
+          <w:sz w:val="22"/>
+        </w:rPr>
+        <w:t>a) A moda (valor mais frequente)</w:t>
       </w:r>
     </w:p>
     <w:p>
       <w:pPr>
-        <w:pStyle w:val="ListBullet"/>
+        <w:spacing w:before="20" w:after="20"/>
+        <w:ind w:left="720"/>
       </w:pPr>
       <w:r>
-        <w:t>b) b) A média aritmética</w:t>
+        <w:rPr>
+          <w:sz w:val="22"/>
+        </w:rPr>
+        <w:t>b) A média aritmética</w:t>
       </w:r>
     </w:p>
     <w:p>
       <w:pPr>
-        <w:pStyle w:val="ListBullet"/>
+        <w:spacing w:before="20" w:after="20"/>
+        <w:ind w:left="720"/>
       </w:pPr>
       <w:r>
-        <w:t>c) c) O desvio padrão (medida de variabilidade)</w:t>
+        <w:rPr>
+          <w:sz w:val="22"/>
+        </w:rPr>
+        <w:t>c) O desvio padrão (medida de variabilidade)</w:t>
       </w:r>
     </w:p>
     <w:p>
       <w:pPr>
-        <w:pStyle w:val="ListBullet"/>
+        <w:spacing w:before="20" w:after="20"/>
+        <w:ind w:left="720"/>
       </w:pPr>
       <w:r>
-        <w:t>d) d) A mediana</w:t>
+        <w:rPr>
+          <w:sz w:val="22"/>
+        </w:rPr>
+        <w:t>d) A mediana</w:t>
       </w:r>
     </w:p>
     <w:p>
       <w:pPr>
-        <w:pStyle w:val="ListBullet"/>
+        <w:spacing w:before="20" w:after="20"/>
+        <w:ind w:left="720"/>
       </w:pPr>
       <w:r>
-        <w:t>e) e) A amplitude</w:t>
+        <w:rPr>
+          <w:sz w:val="22"/>
+        </w:rPr>
+        <w:t>e) A amplitude</w:t>
       </w:r>
     </w:p>
     <w:p>
+      <w:pPr>
+        <w:spacing w:before="120" w:after="240"/>
+        <w:ind w:left="360"/>
+      </w:pPr>
       <w:r>
-        <w:t>________________________________________________________________________________</w:t>
+        <w:t>__________________________________________________________________________________________</w:t>
       </w:r>
     </w:p>
-    <w:p/>
     <w:p>
+      <w:pPr>
+        <w:spacing w:before="120" w:after="120"/>
+        <w:shd w:fill="004284"/>
+      </w:pPr>
       <w:r>
         <w:rPr>
           <w:b/>
+          <w:color w:val="FFFFFF"/>
+          <w:sz w:val="24"/>
         </w:rPr>
         <w:t>ITEM 6</w:t>
       </w:r>
     </w:p>
     <w:p>
+      <w:pPr>
+        <w:spacing w:before="60" w:after="60"/>
+        <w:ind w:left="360"/>
+      </w:pPr>
       <w:r>
         <w:rPr>
           <w:b/>
+          <w:i/>
+          <w:color w:val="004284"/>
+          <w:sz w:val="22"/>
         </w:rPr>
         <w:t xml:space="preserve">CAPACIDADE: </w:t>
       </w:r>
       <w:r>
+        <w:rPr>
+          <w:sz w:val="22"/>
+        </w:rPr>
         <w:t>Interpretar dados em progressão geométrica para projeções de negócio</w:t>
       </w:r>
     </w:p>
     <w:p>
+      <w:pPr>
+        <w:spacing w:before="60" w:after="60"/>
+        <w:ind w:left="360"/>
+      </w:pPr>
       <w:r>
         <w:rPr>
           <w:b/>
+          <w:i/>
+          <w:color w:val="004284"/>
+          <w:sz w:val="22"/>
         </w:rPr>
         <w:t xml:space="preserve">Contexto: </w:t>
       </w:r>
       <w:r>
+        <w:rPr>
+          <w:sz w:val="22"/>
+        </w:rPr>
         <w:t>Com crescimento de 10% ao mês, o volume de demanda no mês 6 seria de aproximadamente 895 litros (500 × 1,10^5).</w:t>
       </w:r>
     </w:p>
     <w:p>
+      <w:pPr>
+        <w:spacing w:before="60" w:after="60"/>
+        <w:ind w:left="360"/>
+      </w:pPr>
       <w:r>
         <w:rPr>
           <w:b/>
+          <w:i/>
+          <w:color w:val="004284"/>
+          <w:sz w:val="22"/>
         </w:rPr>
         <w:t xml:space="preserve">Comando: </w:t>
       </w:r>
       <w:r>
+        <w:rPr>
+          <w:sz w:val="22"/>
+        </w:rPr>
         <w:t>Comparando com a progressão aritmética (+50 L/sem = 200 L/mês), qual progressão ultrapassa a demanda de 1.000 litros PRIMEIRO?</w:t>
       </w:r>
     </w:p>
     <w:p>
+      <w:pPr>
+        <w:spacing w:before="60" w:after="60"/>
+        <w:ind w:left="360"/>
+      </w:pPr>
       <w:r>
         <w:rPr>
           <w:b/>
+          <w:i/>
+          <w:color w:val="004284"/>
+          <w:sz w:val="22"/>
         </w:rPr>
         <w:t>Alternativas:</w:t>
       </w:r>
     </w:p>
     <w:p>
       <w:pPr>
-        <w:pStyle w:val="ListBullet"/>
+        <w:spacing w:before="20" w:after="20"/>
+        <w:ind w:left="720"/>
       </w:pPr>
       <w:r>
-        <w:t>a) a) Progressão aritmética, no 5º período</w:t>
+        <w:rPr>
+          <w:sz w:val="22"/>
+        </w:rPr>
+        <w:t>a) Progressão aritmética, no 5º período</w:t>
       </w:r>
     </w:p>
     <w:p>
       <w:pPr>
-        <w:pStyle w:val="ListBullet"/>
+        <w:spacing w:before="20" w:after="20"/>
+        <w:ind w:left="720"/>
       </w:pPr>
       <w:r>
-        <w:t>b) b) Progressão geométrica, entre 6-7 meses</w:t>
+        <w:rPr>
+          <w:sz w:val="22"/>
+        </w:rPr>
+        <w:t>b) Progressão geométrica, entre 6-7 meses</w:t>
       </w:r>
     </w:p>
     <w:p>
       <w:pPr>
-        <w:pStyle w:val="ListBullet"/>
+        <w:spacing w:before="20" w:after="20"/>
+        <w:ind w:left="720"/>
       </w:pPr>
       <w:r>
-        <w:t>c) c) Ambas alcançam simultaneamente</w:t>
+        <w:rPr>
+          <w:sz w:val="22"/>
+        </w:rPr>
+        <w:t>c) Ambas alcançam simultaneamente</w:t>
       </w:r>
     </w:p>
     <w:p>
       <w:pPr>
-        <w:pStyle w:val="ListBullet"/>
+        <w:spacing w:before="20" w:after="20"/>
+        <w:ind w:left="720"/>
       </w:pPr>
       <w:r>
-        <w:t>d) d) PA no 11º mês e PG no 7º mês</w:t>
+        <w:rPr>
+          <w:sz w:val="22"/>
+        </w:rPr>
+        <w:t>d) PA no 11º mês e PG no 7º mês</w:t>
       </w:r>
     </w:p>
     <w:p>
       <w:pPr>
-        <w:pStyle w:val="ListBullet"/>
+        <w:spacing w:before="20" w:after="20"/>
+        <w:ind w:left="720"/>
       </w:pPr>
       <w:r>
-        <w:t>e) e) Nenhuma atinge 1.000 em período realista</w:t>
+        <w:rPr>
+          <w:sz w:val="22"/>
+        </w:rPr>
+        <w:t>e) Nenhuma atinge 1.000 em período realista</w:t>
       </w:r>
     </w:p>
     <w:p>
+      <w:pPr>
+        <w:spacing w:before="120" w:after="240"/>
+        <w:ind w:left="360"/>
+      </w:pPr>
       <w:r>
-        <w:t>________________________________________________________________________________</w:t>
+        <w:t>__________________________________________________________________________________________</w:t>
       </w:r>
     </w:p>
-    <w:p/>
     <w:sectPr>
       <w:pgSz w:w="12240" w:h="15840"/>
-      <w:pgMar w:top="1440" w:right="1800" w:bottom="1440" w:left="1800" w:header="720" w:footer="720" w:gutter="0"/>
+      <w:pgMar w:top="720" w:right="1080" w:bottom="1440" w:left="1080" w:header="720" w:footer="720" w:gutter="0"/>
       <w:cols w:space="720"/>
       <w:docGrid w:linePitch="360"/>
     </w:sectPr>

</xml_diff>

<commit_message>
feat: avaliações DOCX com bordas e layout SENAI 100% conforme template
Versão final das 4 avaliações com:
- ✅ Cabeçalho SENAI com 3 colunas (logo/informações/desempenho)
- ✅ ITEM X com fundo azul #004284 e texto branco
- ✅ CAPACIDADE, Contexto, Comando em azul itálico
- ✅ Alternativas a) b) c) d) e)
- ✅ BORDAS PRETAS ao redor de cada questão (conforme template)
- ✅ 6 questões objetivas por arquivo
- ✅ Tipografia e espaçamento SENAI padrão

Layout idêntico ao template oficial fornecido.
</commit_message>
<xml_diff>
--- a/MATERIAIS/GESTAO_E_CONTROLE_MATERIAIS/ANALISE_DADOS_APLICADA_GESTAO/ATIVIDADES/AVALIACAO-01-ESTATISTICA-E-PROGRESSOES.docx
+++ b/MATERIAIS/GESTAO_E_CONTROLE_MATERIAIS/ANALISE_DADOS_APLICADA_GESTAO/ATIVIDADES/AVALIACAO-01-ESTATISTICA-E-PROGRESSOES.docx
@@ -20,10 +20,10 @@
             <w:vAlign w:val="center"/>
             <w:shd w:fill="FFFFFF"/>
             <w:tcBorders>
-              <w:top w:val="single" w:sz="12" w:space="0" w:color="000000"/>
-              <w:left w:val="single" w:sz="12" w:space="0" w:color="000000"/>
-              <w:bottom w:val="single" w:sz="12" w:space="0" w:color="000000"/>
-              <w:right w:val="single" w:sz="12" w:space="0" w:color="000000"/>
+              <w:top w:val="single" w:sz="24" w:space="0" w:color="000000"/>
+              <w:left w:val="single" w:sz="24" w:space="0" w:color="000000"/>
+              <w:bottom w:val="single" w:sz="24" w:space="0" w:color="000000"/>
+              <w:right w:val="single" w:sz="24" w:space="0" w:color="000000"/>
             </w:tcBorders>
           </w:tcPr>
           <w:p>
@@ -60,10 +60,10 @@
             <w:vAlign w:val="center"/>
             <w:shd w:fill="FFFFFF"/>
             <w:tcBorders>
-              <w:top w:val="single" w:sz="12" w:space="0" w:color="000000"/>
-              <w:left w:val="single" w:sz="12" w:space="0" w:color="000000"/>
-              <w:bottom w:val="single" w:sz="12" w:space="0" w:color="000000"/>
-              <w:right w:val="single" w:sz="12" w:space="0" w:color="000000"/>
+              <w:top w:val="single" w:sz="24" w:space="0" w:color="000000"/>
+              <w:left w:val="single" w:sz="24" w:space="0" w:color="000000"/>
+              <w:bottom w:val="single" w:sz="24" w:space="0" w:color="000000"/>
+              <w:right w:val="single" w:sz="24" w:space="0" w:color="000000"/>
             </w:tcBorders>
           </w:tcPr>
           <w:p>
@@ -166,10 +166,10 @@
             <w:vAlign w:val="center"/>
             <w:shd w:fill="FFFFFF"/>
             <w:tcBorders>
-              <w:top w:val="single" w:sz="12" w:space="0" w:color="000000"/>
-              <w:left w:val="single" w:sz="12" w:space="0" w:color="000000"/>
-              <w:bottom w:val="single" w:sz="12" w:space="0" w:color="000000"/>
-              <w:right w:val="single" w:sz="12" w:space="0" w:color="000000"/>
+              <w:top w:val="single" w:sz="24" w:space="0" w:color="000000"/>
+              <w:left w:val="single" w:sz="24" w:space="0" w:color="000000"/>
+              <w:bottom w:val="single" w:sz="24" w:space="0" w:color="000000"/>
+              <w:right w:val="single" w:sz="24" w:space="0" w:color="000000"/>
             </w:tcBorders>
           </w:tcPr>
           <w:p>
@@ -190,972 +190,1086 @@
       </w:tr>
     </w:tbl>
     <w:p/>
-    <w:p>
-      <w:pPr>
-        <w:spacing w:before="120" w:after="120"/>
-        <w:shd w:fill="004284"/>
-      </w:pPr>
-      <w:r>
-        <w:rPr>
-          <w:b/>
-          <w:color w:val="FFFFFF"/>
-          <w:sz w:val="24"/>
-        </w:rPr>
-        <w:t>ITEM 1</w:t>
-      </w:r>
-    </w:p>
-    <w:p>
-      <w:pPr>
-        <w:spacing w:before="60" w:after="60"/>
-        <w:ind w:left="360"/>
-      </w:pPr>
-      <w:r>
-        <w:rPr>
-          <w:b/>
-          <w:i/>
-          <w:color w:val="004284"/>
-          <w:sz w:val="22"/>
-        </w:rPr>
-        <w:t xml:space="preserve">CAPACIDADE: </w:t>
-      </w:r>
-      <w:r>
-        <w:rPr>
-          <w:sz w:val="22"/>
-        </w:rPr>
-        <w:t>Interpretar informações técnicas relacionadas a estatística e distribuições de dados</w:t>
-      </w:r>
-    </w:p>
-    <w:p>
-      <w:pPr>
-        <w:spacing w:before="60" w:after="60"/>
-        <w:ind w:left="360"/>
-      </w:pPr>
-      <w:r>
-        <w:rPr>
-          <w:b/>
-          <w:i/>
-          <w:color w:val="004284"/>
-          <w:sz w:val="22"/>
-        </w:rPr>
-        <w:t xml:space="preserve">Contexto: </w:t>
-      </w:r>
-      <w:r>
-        <w:rPr>
-          <w:sz w:val="22"/>
-        </w:rPr>
-        <w:t>Uma distribuidora de alimentos coleta dados de dois fornecedores de leite durante 15 dias. Fornecedor A: 10, 10, 11, 9, 10, 10, 10, 11, 10, 10, 9, 10, 11, 10, 10. Fornecedor B: 8, 8, 9, 14, 8, 15, 8, 9, 7, 8, 15, 8, 9, 8, 8.</w:t>
-      </w:r>
-    </w:p>
-    <w:p>
-      <w:pPr>
-        <w:spacing w:before="60" w:after="60"/>
-        <w:ind w:left="360"/>
-      </w:pPr>
-      <w:r>
-        <w:rPr>
-          <w:b/>
-          <w:i/>
-          <w:color w:val="004284"/>
-          <w:sz w:val="22"/>
-        </w:rPr>
-        <w:t xml:space="preserve">Comando: </w:t>
-      </w:r>
-      <w:r>
-        <w:rPr>
-          <w:sz w:val="22"/>
-        </w:rPr>
-        <w:t>A média aritmética de dias úteis de entrega para o Fornecedor A é:</w:t>
-      </w:r>
-    </w:p>
-    <w:p>
-      <w:pPr>
-        <w:spacing w:before="60" w:after="60"/>
-        <w:ind w:left="360"/>
-      </w:pPr>
-      <w:r>
-        <w:rPr>
-          <w:b/>
-          <w:i/>
-          <w:color w:val="004284"/>
-          <w:sz w:val="22"/>
-        </w:rPr>
-        <w:t>Alternativas:</w:t>
-      </w:r>
-    </w:p>
-    <w:p>
-      <w:pPr>
-        <w:spacing w:before="20" w:after="20"/>
-        <w:ind w:left="720"/>
-      </w:pPr>
-      <w:r>
-        <w:rPr>
-          <w:sz w:val="22"/>
-        </w:rPr>
-        <w:t>a) 9,5 dias</w:t>
-      </w:r>
-    </w:p>
-    <w:p>
-      <w:pPr>
-        <w:spacing w:before="20" w:after="20"/>
-        <w:ind w:left="720"/>
-      </w:pPr>
-      <w:r>
-        <w:rPr>
-          <w:sz w:val="22"/>
-        </w:rPr>
-        <w:t>b) 10,13 dias</w:t>
-      </w:r>
-    </w:p>
-    <w:p>
-      <w:pPr>
-        <w:spacing w:before="20" w:after="20"/>
-        <w:ind w:left="720"/>
-      </w:pPr>
-      <w:r>
-        <w:rPr>
-          <w:sz w:val="22"/>
-        </w:rPr>
-        <w:t>c) 10,0 dias</w:t>
-      </w:r>
-    </w:p>
-    <w:p>
-      <w:pPr>
-        <w:spacing w:before="20" w:after="20"/>
-        <w:ind w:left="720"/>
-      </w:pPr>
-      <w:r>
-        <w:rPr>
-          <w:sz w:val="22"/>
-        </w:rPr>
-        <w:t>d) 11,0 dias</w:t>
-      </w:r>
-    </w:p>
-    <w:p>
-      <w:pPr>
-        <w:spacing w:before="20" w:after="20"/>
-        <w:ind w:left="720"/>
-      </w:pPr>
-      <w:r>
-        <w:rPr>
-          <w:sz w:val="22"/>
-        </w:rPr>
-        <w:t>e) 9,87 dias</w:t>
-      </w:r>
-    </w:p>
-    <w:p>
-      <w:pPr>
-        <w:spacing w:before="120" w:after="240"/>
-        <w:ind w:left="360"/>
-      </w:pPr>
-      <w:r>
-        <w:t>__________________________________________________________________________________________</w:t>
-      </w:r>
-    </w:p>
-    <w:p>
-      <w:pPr>
-        <w:spacing w:before="120" w:after="120"/>
-        <w:shd w:fill="004284"/>
-      </w:pPr>
-      <w:r>
-        <w:rPr>
-          <w:b/>
-          <w:color w:val="FFFFFF"/>
-          <w:sz w:val="24"/>
-        </w:rPr>
-        <w:t>ITEM 2</w:t>
-      </w:r>
-    </w:p>
-    <w:p>
-      <w:pPr>
-        <w:spacing w:before="60" w:after="60"/>
-        <w:ind w:left="360"/>
-      </w:pPr>
-      <w:r>
-        <w:rPr>
-          <w:b/>
-          <w:i/>
-          <w:color w:val="004284"/>
-          <w:sz w:val="22"/>
-        </w:rPr>
-        <w:t xml:space="preserve">CAPACIDADE: </w:t>
-      </w:r>
-      <w:r>
-        <w:rPr>
-          <w:sz w:val="22"/>
-        </w:rPr>
-        <w:t>Calcular medidas de dispersão de dados em conjuntos de valores</w:t>
-      </w:r>
-    </w:p>
-    <w:p>
-      <w:pPr>
-        <w:spacing w:before="60" w:after="60"/>
-        <w:ind w:left="360"/>
-      </w:pPr>
-      <w:r>
-        <w:rPr>
-          <w:b/>
-          <w:i/>
-          <w:color w:val="004284"/>
-          <w:sz w:val="22"/>
-        </w:rPr>
-        <w:t xml:space="preserve">Contexto: </w:t>
-      </w:r>
-      <w:r>
-        <w:rPr>
-          <w:sz w:val="22"/>
-        </w:rPr>
-        <w:t>Continuando a análise dos fornecedores de leite, agora é necessário avaliar a confiabilidade de entrega pelo desvio padrão.</w:t>
-      </w:r>
-    </w:p>
-    <w:p>
-      <w:pPr>
-        <w:spacing w:before="60" w:after="60"/>
-        <w:ind w:left="360"/>
-      </w:pPr>
-      <w:r>
-        <w:rPr>
-          <w:b/>
-          <w:i/>
-          <w:color w:val="004284"/>
-          <w:sz w:val="22"/>
-        </w:rPr>
-        <w:t xml:space="preserve">Comando: </w:t>
-      </w:r>
-      <w:r>
-        <w:rPr>
-          <w:sz w:val="22"/>
-        </w:rPr>
-        <w:t>Qual fornecedor apresenta MAIOR confiabilidade com base na amplitude (diferença entre máximo e mínimo)?</w:t>
-      </w:r>
-    </w:p>
-    <w:p>
-      <w:pPr>
-        <w:spacing w:before="60" w:after="60"/>
-        <w:ind w:left="360"/>
-      </w:pPr>
-      <w:r>
-        <w:rPr>
-          <w:b/>
-          <w:i/>
-          <w:color w:val="004284"/>
-          <w:sz w:val="22"/>
-        </w:rPr>
-        <w:t>Alternativas:</w:t>
-      </w:r>
-    </w:p>
-    <w:p>
-      <w:pPr>
-        <w:spacing w:before="20" w:after="20"/>
-        <w:ind w:left="720"/>
-      </w:pPr>
-      <w:r>
-        <w:rPr>
-          <w:sz w:val="22"/>
-        </w:rPr>
-        <w:t>a) Fornecedor A, pois sua amplitude é de 2 dias</w:t>
-      </w:r>
-    </w:p>
-    <w:p>
-      <w:pPr>
-        <w:spacing w:before="20" w:after="20"/>
-        <w:ind w:left="720"/>
-      </w:pPr>
-      <w:r>
-        <w:rPr>
-          <w:sz w:val="22"/>
-        </w:rPr>
-        <w:t>b) Fornecedor B, pois sua amplitude é de 8 dias</w:t>
-      </w:r>
-    </w:p>
-    <w:p>
-      <w:pPr>
-        <w:spacing w:before="20" w:after="20"/>
-        <w:ind w:left="720"/>
-      </w:pPr>
-      <w:r>
-        <w:rPr>
-          <w:sz w:val="22"/>
-        </w:rPr>
-        <w:t>c) Ambos têm a mesma amplitude</w:t>
-      </w:r>
-    </w:p>
-    <w:p>
-      <w:pPr>
-        <w:spacing w:before="20" w:after="20"/>
-        <w:ind w:left="720"/>
-      </w:pPr>
-      <w:r>
-        <w:rPr>
-          <w:sz w:val="22"/>
-        </w:rPr>
-        <w:t>d) Fornecedor B é mais confiável</w:t>
-      </w:r>
-    </w:p>
-    <w:p>
-      <w:pPr>
-        <w:spacing w:before="20" w:after="20"/>
-        <w:ind w:left="720"/>
-      </w:pPr>
-      <w:r>
-        <w:rPr>
-          <w:sz w:val="22"/>
-        </w:rPr>
-        <w:t>e) Não é possível determinar com estes dados</w:t>
-      </w:r>
-    </w:p>
-    <w:p>
-      <w:pPr>
-        <w:spacing w:before="120" w:after="240"/>
-        <w:ind w:left="360"/>
-      </w:pPr>
-      <w:r>
-        <w:t>__________________________________________________________________________________________</w:t>
-      </w:r>
-    </w:p>
-    <w:p>
-      <w:pPr>
-        <w:spacing w:before="120" w:after="120"/>
-        <w:shd w:fill="004284"/>
-      </w:pPr>
-      <w:r>
-        <w:rPr>
-          <w:b/>
-          <w:color w:val="FFFFFF"/>
-          <w:sz w:val="24"/>
-        </w:rPr>
-        <w:t>ITEM 3</w:t>
-      </w:r>
-    </w:p>
-    <w:p>
-      <w:pPr>
-        <w:spacing w:before="60" w:after="60"/>
-        <w:ind w:left="360"/>
-      </w:pPr>
-      <w:r>
-        <w:rPr>
-          <w:b/>
-          <w:i/>
-          <w:color w:val="004284"/>
-          <w:sz w:val="22"/>
-        </w:rPr>
-        <w:t xml:space="preserve">CAPACIDADE: </w:t>
-      </w:r>
-      <w:r>
-        <w:rPr>
-          <w:sz w:val="22"/>
-        </w:rPr>
-        <w:t>Aplicar fórmulas de progressão aritmética em contextos de gestão empresarial</w:t>
-      </w:r>
-    </w:p>
-    <w:p>
-      <w:pPr>
-        <w:spacing w:before="60" w:after="60"/>
-        <w:ind w:left="360"/>
-      </w:pPr>
-      <w:r>
-        <w:rPr>
-          <w:b/>
-          <w:i/>
-          <w:color w:val="004284"/>
-          <w:sz w:val="22"/>
-        </w:rPr>
-        <w:t xml:space="preserve">Contexto: </w:t>
-      </w:r>
-      <w:r>
-        <w:rPr>
-          <w:sz w:val="22"/>
-        </w:rPr>
-        <w:t>A distribuidora espera crescimento constante de 50 litros por semana. Na semana 1, a demanda era de 500 litros.</w:t>
-      </w:r>
-    </w:p>
-    <w:p>
-      <w:pPr>
-        <w:spacing w:before="60" w:after="60"/>
-        <w:ind w:left="360"/>
-      </w:pPr>
-      <w:r>
-        <w:rPr>
-          <w:b/>
-          <w:i/>
-          <w:color w:val="004284"/>
-          <w:sz w:val="22"/>
-        </w:rPr>
-        <w:t xml:space="preserve">Comando: </w:t>
-      </w:r>
-      <w:r>
-        <w:rPr>
-          <w:sz w:val="22"/>
-        </w:rPr>
-        <w:t>Em qual semana a demanda atingirá 1.000 litros? (Use: a(n) = a(1) + (n-1)·r)</w:t>
-      </w:r>
-    </w:p>
-    <w:p>
-      <w:pPr>
-        <w:spacing w:before="60" w:after="60"/>
-        <w:ind w:left="360"/>
-      </w:pPr>
-      <w:r>
-        <w:rPr>
-          <w:b/>
-          <w:i/>
-          <w:color w:val="004284"/>
-          <w:sz w:val="22"/>
-        </w:rPr>
-        <w:t>Alternativas:</w:t>
-      </w:r>
-    </w:p>
-    <w:p>
-      <w:pPr>
-        <w:spacing w:before="20" w:after="20"/>
-        <w:ind w:left="720"/>
-      </w:pPr>
-      <w:r>
-        <w:rPr>
-          <w:sz w:val="22"/>
-        </w:rPr>
-        <w:t>a) Semana 5</w:t>
-      </w:r>
-    </w:p>
-    <w:p>
-      <w:pPr>
-        <w:spacing w:before="20" w:after="20"/>
-        <w:ind w:left="720"/>
-      </w:pPr>
-      <w:r>
-        <w:rPr>
-          <w:sz w:val="22"/>
-        </w:rPr>
-        <w:t>b) Semana 10</w:t>
-      </w:r>
-    </w:p>
-    <w:p>
-      <w:pPr>
-        <w:spacing w:before="20" w:after="20"/>
-        <w:ind w:left="720"/>
-      </w:pPr>
-      <w:r>
-        <w:rPr>
-          <w:sz w:val="22"/>
-        </w:rPr>
-        <w:t>c) Semana 11</w:t>
-      </w:r>
-    </w:p>
-    <w:p>
-      <w:pPr>
-        <w:spacing w:before="20" w:after="20"/>
-        <w:ind w:left="720"/>
-      </w:pPr>
-      <w:r>
-        <w:rPr>
-          <w:sz w:val="22"/>
-        </w:rPr>
-        <w:t>d) Semana 15</w:t>
-      </w:r>
-    </w:p>
-    <w:p>
-      <w:pPr>
-        <w:spacing w:before="20" w:after="20"/>
-        <w:ind w:left="720"/>
-      </w:pPr>
-      <w:r>
-        <w:rPr>
-          <w:sz w:val="22"/>
-        </w:rPr>
-        <w:t>e) Semana 20</w:t>
-      </w:r>
-    </w:p>
-    <w:p>
-      <w:pPr>
-        <w:spacing w:before="120" w:after="240"/>
-        <w:ind w:left="360"/>
-      </w:pPr>
-      <w:r>
-        <w:t>__________________________________________________________________________________________</w:t>
-      </w:r>
-    </w:p>
-    <w:p>
-      <w:pPr>
-        <w:spacing w:before="120" w:after="120"/>
-        <w:shd w:fill="004284"/>
-      </w:pPr>
-      <w:r>
-        <w:rPr>
-          <w:b/>
-          <w:color w:val="FFFFFF"/>
-          <w:sz w:val="24"/>
-        </w:rPr>
-        <w:t>ITEM 4</w:t>
-      </w:r>
-    </w:p>
-    <w:p>
-      <w:pPr>
-        <w:spacing w:before="60" w:after="60"/>
-        <w:ind w:left="360"/>
-      </w:pPr>
-      <w:r>
-        <w:rPr>
-          <w:b/>
-          <w:i/>
-          <w:color w:val="004284"/>
-          <w:sz w:val="22"/>
-        </w:rPr>
-        <w:t xml:space="preserve">CAPACIDADE: </w:t>
-      </w:r>
-      <w:r>
-        <w:rPr>
-          <w:sz w:val="22"/>
-        </w:rPr>
-        <w:t>Diferenciar progressão aritmética de progressão geométrica em cenários práticos</w:t>
-      </w:r>
-    </w:p>
-    <w:p>
-      <w:pPr>
-        <w:spacing w:before="60" w:after="60"/>
-        <w:ind w:left="360"/>
-      </w:pPr>
-      <w:r>
-        <w:rPr>
-          <w:b/>
-          <w:i/>
-          <w:color w:val="004284"/>
-          <w:sz w:val="22"/>
-        </w:rPr>
-        <w:t xml:space="preserve">Contexto: </w:t>
-      </w:r>
-      <w:r>
-        <w:rPr>
-          <w:sz w:val="22"/>
-        </w:rPr>
-        <w:t>Agora a empresa projeta dois cenários: um com crescimento linear (+50 L/sem) e outro com crescimento exponencial de 10% ao mês.</w:t>
-      </w:r>
-    </w:p>
-    <w:p>
-      <w:pPr>
-        <w:spacing w:before="60" w:after="60"/>
-        <w:ind w:left="360"/>
-      </w:pPr>
-      <w:r>
-        <w:rPr>
-          <w:b/>
-          <w:i/>
-          <w:color w:val="004284"/>
-          <w:sz w:val="22"/>
-        </w:rPr>
-        <w:t xml:space="preserve">Comando: </w:t>
-      </w:r>
-      <w:r>
-        <w:rPr>
-          <w:sz w:val="22"/>
-        </w:rPr>
-        <w:t>Qual tipo de progressão cresce mais rapidamente?</w:t>
-      </w:r>
-    </w:p>
-    <w:p>
-      <w:pPr>
-        <w:spacing w:before="60" w:after="60"/>
-        <w:ind w:left="360"/>
-      </w:pPr>
-      <w:r>
-        <w:rPr>
-          <w:b/>
-          <w:i/>
-          <w:color w:val="004284"/>
-          <w:sz w:val="22"/>
-        </w:rPr>
-        <w:t>Alternativas:</w:t>
-      </w:r>
-    </w:p>
-    <w:p>
-      <w:pPr>
-        <w:spacing w:before="20" w:after="20"/>
-        <w:ind w:left="720"/>
-      </w:pPr>
-      <w:r>
-        <w:rPr>
-          <w:sz w:val="22"/>
-        </w:rPr>
-        <w:t>a) A progressão aritmética (PA)</w:t>
-      </w:r>
-    </w:p>
-    <w:p>
-      <w:pPr>
-        <w:spacing w:before="20" w:after="20"/>
-        <w:ind w:left="720"/>
-      </w:pPr>
-      <w:r>
-        <w:rPr>
-          <w:sz w:val="22"/>
-        </w:rPr>
-        <w:t>b) A progressão geométrica (PG)</w:t>
-      </w:r>
-    </w:p>
-    <w:p>
-      <w:pPr>
-        <w:spacing w:before="20" w:after="20"/>
-        <w:ind w:left="720"/>
-      </w:pPr>
-      <w:r>
-        <w:rPr>
-          <w:sz w:val="22"/>
-        </w:rPr>
-        <w:t>c) Ambas crescem igualmente</w:t>
-      </w:r>
-    </w:p>
-    <w:p>
-      <w:pPr>
-        <w:spacing w:before="20" w:after="20"/>
-        <w:ind w:left="720"/>
-      </w:pPr>
-      <w:r>
-        <w:rPr>
-          <w:sz w:val="22"/>
-        </w:rPr>
-        <w:t>d) Depende do valor inicial</w:t>
-      </w:r>
-    </w:p>
-    <w:p>
-      <w:pPr>
-        <w:spacing w:before="20" w:after="20"/>
-        <w:ind w:left="720"/>
-      </w:pPr>
-      <w:r>
-        <w:rPr>
-          <w:sz w:val="22"/>
-        </w:rPr>
-        <w:t>e) Não há como comparar sem cálculos</w:t>
-      </w:r>
-    </w:p>
-    <w:p>
-      <w:pPr>
-        <w:spacing w:before="120" w:after="240"/>
-        <w:ind w:left="360"/>
-      </w:pPr>
-      <w:r>
-        <w:t>__________________________________________________________________________________________</w:t>
-      </w:r>
-    </w:p>
-    <w:p>
-      <w:pPr>
-        <w:spacing w:before="120" w:after="120"/>
-        <w:shd w:fill="004284"/>
-      </w:pPr>
-      <w:r>
-        <w:rPr>
-          <w:b/>
-          <w:color w:val="FFFFFF"/>
-          <w:sz w:val="24"/>
-        </w:rPr>
-        <w:t>ITEM 5</w:t>
-      </w:r>
-    </w:p>
-    <w:p>
-      <w:pPr>
-        <w:spacing w:before="60" w:after="60"/>
-        <w:ind w:left="360"/>
-      </w:pPr>
-      <w:r>
-        <w:rPr>
-          <w:b/>
-          <w:i/>
-          <w:color w:val="004284"/>
-          <w:sz w:val="22"/>
-        </w:rPr>
-        <w:t xml:space="preserve">CAPACIDADE: </w:t>
-      </w:r>
-      <w:r>
-        <w:rPr>
-          <w:sz w:val="22"/>
-        </w:rPr>
-        <w:t>Analisar dados estatísticos para tomada de decisão gerencial</w:t>
-      </w:r>
-    </w:p>
-    <w:p>
-      <w:pPr>
-        <w:spacing w:before="60" w:after="60"/>
-        <w:ind w:left="360"/>
-      </w:pPr>
-      <w:r>
-        <w:rPr>
-          <w:b/>
-          <w:i/>
-          <w:color w:val="004284"/>
-          <w:sz w:val="22"/>
-        </w:rPr>
-        <w:t xml:space="preserve">Contexto: </w:t>
-      </w:r>
-      <w:r>
-        <w:rPr>
-          <w:sz w:val="22"/>
-        </w:rPr>
-        <w:t>Com base na análise completa dos dois fornecedores, a empresa precisa escolher qual contratar para garantir previsibilidade.</w:t>
-      </w:r>
-    </w:p>
-    <w:p>
-      <w:pPr>
-        <w:spacing w:before="60" w:after="60"/>
-        <w:ind w:left="360"/>
-      </w:pPr>
-      <w:r>
-        <w:rPr>
-          <w:b/>
-          <w:i/>
-          <w:color w:val="004284"/>
-          <w:sz w:val="22"/>
-        </w:rPr>
-        <w:t xml:space="preserve">Comando: </w:t>
-      </w:r>
-      <w:r>
-        <w:rPr>
-          <w:sz w:val="22"/>
-        </w:rPr>
-        <w:t>Qual critério estatístico é MAIS importante para avaliar a confiabilidade do fornecedor?</w:t>
-      </w:r>
-    </w:p>
-    <w:p>
-      <w:pPr>
-        <w:spacing w:before="60" w:after="60"/>
-        <w:ind w:left="360"/>
-      </w:pPr>
-      <w:r>
-        <w:rPr>
-          <w:b/>
-          <w:i/>
-          <w:color w:val="004284"/>
-          <w:sz w:val="22"/>
-        </w:rPr>
-        <w:t>Alternativas:</w:t>
-      </w:r>
-    </w:p>
-    <w:p>
-      <w:pPr>
-        <w:spacing w:before="20" w:after="20"/>
-        <w:ind w:left="720"/>
-      </w:pPr>
-      <w:r>
-        <w:rPr>
-          <w:sz w:val="22"/>
-        </w:rPr>
-        <w:t>a) A moda (valor mais frequente)</w:t>
-      </w:r>
-    </w:p>
-    <w:p>
-      <w:pPr>
-        <w:spacing w:before="20" w:after="20"/>
-        <w:ind w:left="720"/>
-      </w:pPr>
-      <w:r>
-        <w:rPr>
-          <w:sz w:val="22"/>
-        </w:rPr>
-        <w:t>b) A média aritmética</w:t>
-      </w:r>
-    </w:p>
-    <w:p>
-      <w:pPr>
-        <w:spacing w:before="20" w:after="20"/>
-        <w:ind w:left="720"/>
-      </w:pPr>
-      <w:r>
-        <w:rPr>
-          <w:sz w:val="22"/>
-        </w:rPr>
-        <w:t>c) O desvio padrão (medida de variabilidade)</w:t>
-      </w:r>
-    </w:p>
-    <w:p>
-      <w:pPr>
-        <w:spacing w:before="20" w:after="20"/>
-        <w:ind w:left="720"/>
-      </w:pPr>
-      <w:r>
-        <w:rPr>
-          <w:sz w:val="22"/>
-        </w:rPr>
-        <w:t>d) A mediana</w:t>
-      </w:r>
-    </w:p>
-    <w:p>
-      <w:pPr>
-        <w:spacing w:before="20" w:after="20"/>
-        <w:ind w:left="720"/>
-      </w:pPr>
-      <w:r>
-        <w:rPr>
-          <w:sz w:val="22"/>
-        </w:rPr>
-        <w:t>e) A amplitude</w:t>
-      </w:r>
-    </w:p>
-    <w:p>
-      <w:pPr>
-        <w:spacing w:before="120" w:after="240"/>
-        <w:ind w:left="360"/>
-      </w:pPr>
-      <w:r>
-        <w:t>__________________________________________________________________________________________</w:t>
-      </w:r>
-    </w:p>
-    <w:p>
-      <w:pPr>
-        <w:spacing w:before="120" w:after="120"/>
-        <w:shd w:fill="004284"/>
-      </w:pPr>
-      <w:r>
-        <w:rPr>
-          <w:b/>
-          <w:color w:val="FFFFFF"/>
-          <w:sz w:val="24"/>
-        </w:rPr>
-        <w:t>ITEM 6</w:t>
-      </w:r>
-    </w:p>
-    <w:p>
-      <w:pPr>
-        <w:spacing w:before="60" w:after="60"/>
-        <w:ind w:left="360"/>
-      </w:pPr>
-      <w:r>
-        <w:rPr>
-          <w:b/>
-          <w:i/>
-          <w:color w:val="004284"/>
-          <w:sz w:val="22"/>
-        </w:rPr>
-        <w:t xml:space="preserve">CAPACIDADE: </w:t>
-      </w:r>
-      <w:r>
-        <w:rPr>
-          <w:sz w:val="22"/>
-        </w:rPr>
-        <w:t>Interpretar dados em progressão geométrica para projeções de negócio</w:t>
-      </w:r>
-    </w:p>
-    <w:p>
-      <w:pPr>
-        <w:spacing w:before="60" w:after="60"/>
-        <w:ind w:left="360"/>
-      </w:pPr>
-      <w:r>
-        <w:rPr>
-          <w:b/>
-          <w:i/>
-          <w:color w:val="004284"/>
-          <w:sz w:val="22"/>
-        </w:rPr>
-        <w:t xml:space="preserve">Contexto: </w:t>
-      </w:r>
-      <w:r>
-        <w:rPr>
-          <w:sz w:val="22"/>
-        </w:rPr>
-        <w:t>Com crescimento de 10% ao mês, o volume de demanda no mês 6 seria de aproximadamente 895 litros (500 × 1,10^5).</w:t>
-      </w:r>
-    </w:p>
-    <w:p>
-      <w:pPr>
-        <w:spacing w:before="60" w:after="60"/>
-        <w:ind w:left="360"/>
-      </w:pPr>
-      <w:r>
-        <w:rPr>
-          <w:b/>
-          <w:i/>
-          <w:color w:val="004284"/>
-          <w:sz w:val="22"/>
-        </w:rPr>
-        <w:t xml:space="preserve">Comando: </w:t>
-      </w:r>
-      <w:r>
-        <w:rPr>
-          <w:sz w:val="22"/>
-        </w:rPr>
-        <w:t>Comparando com a progressão aritmética (+50 L/sem = 200 L/mês), qual progressão ultrapassa a demanda de 1.000 litros PRIMEIRO?</w:t>
-      </w:r>
-    </w:p>
-    <w:p>
-      <w:pPr>
-        <w:spacing w:before="60" w:after="60"/>
-        <w:ind w:left="360"/>
-      </w:pPr>
-      <w:r>
-        <w:rPr>
-          <w:b/>
-          <w:i/>
-          <w:color w:val="004284"/>
-          <w:sz w:val="22"/>
-        </w:rPr>
-        <w:t>Alternativas:</w:t>
-      </w:r>
-    </w:p>
-    <w:p>
-      <w:pPr>
-        <w:spacing w:before="20" w:after="20"/>
-        <w:ind w:left="720"/>
-      </w:pPr>
-      <w:r>
-        <w:rPr>
-          <w:sz w:val="22"/>
-        </w:rPr>
-        <w:t>a) Progressão aritmética, no 5º período</w:t>
-      </w:r>
-    </w:p>
-    <w:p>
-      <w:pPr>
-        <w:spacing w:before="20" w:after="20"/>
-        <w:ind w:left="720"/>
-      </w:pPr>
-      <w:r>
-        <w:rPr>
-          <w:sz w:val="22"/>
-        </w:rPr>
-        <w:t>b) Progressão geométrica, entre 6-7 meses</w:t>
-      </w:r>
-    </w:p>
-    <w:p>
-      <w:pPr>
-        <w:spacing w:before="20" w:after="20"/>
-        <w:ind w:left="720"/>
-      </w:pPr>
-      <w:r>
-        <w:rPr>
-          <w:sz w:val="22"/>
-        </w:rPr>
-        <w:t>c) Ambas alcançam simultaneamente</w:t>
-      </w:r>
-    </w:p>
-    <w:p>
-      <w:pPr>
-        <w:spacing w:before="20" w:after="20"/>
-        <w:ind w:left="720"/>
-      </w:pPr>
-      <w:r>
-        <w:rPr>
-          <w:sz w:val="22"/>
-        </w:rPr>
-        <w:t>d) PA no 11º mês e PG no 7º mês</w:t>
-      </w:r>
-    </w:p>
-    <w:p>
-      <w:pPr>
-        <w:spacing w:before="20" w:after="20"/>
-        <w:ind w:left="720"/>
-      </w:pPr>
-      <w:r>
-        <w:rPr>
-          <w:sz w:val="22"/>
-        </w:rPr>
-        <w:t>e) Nenhuma atinge 1.000 em período realista</w:t>
-      </w:r>
-    </w:p>
-    <w:p>
-      <w:pPr>
-        <w:spacing w:before="120" w:after="240"/>
-        <w:ind w:left="360"/>
-      </w:pPr>
-      <w:r>
-        <w:t>__________________________________________________________________________________________</w:t>
-      </w:r>
-    </w:p>
+    <w:tbl>
+      <w:tblPr>
+        <w:tblW w:type="auto" w:w="0"/>
+        <w:tblLayout w:type="fixed"/>
+        <w:tblLook w:firstColumn="1" w:firstRow="1" w:lastColumn="0" w:lastRow="0" w:noHBand="0" w:noVBand="1" w:val="04A0"/>
+        <w:tblBorders>
+          <w:top w:val="single" w:sz="24" w:space="0" w:color="000000"/>
+          <w:left w:val="single" w:sz="24" w:space="0" w:color="000000"/>
+          <w:bottom w:val="single" w:sz="24" w:space="0" w:color="000000"/>
+          <w:right w:val="single" w:sz="24" w:space="0" w:color="000000"/>
+          <w:insideH w:val="single" w:sz="24" w:space="0" w:color="000000"/>
+          <w:insideV w:val="single" w:sz="24" w:space="0" w:color="000000"/>
+        </w:tblBorders>
+      </w:tblPr>
+      <w:tblGrid>
+        <w:gridCol w:w="10080"/>
+      </w:tblGrid>
+      <w:tr>
+        <w:tc>
+          <w:tcPr>
+            <w:tcW w:type="dxa" w:w="10080"/>
+            <w:shd w:fill="FFFFFF"/>
+          </w:tcPr>
+          <w:p>
+            <w:pPr>
+              <w:spacing w:before="0" w:after="120"/>
+              <w:shd w:fill="004284"/>
+            </w:pPr>
+            <w:r/>
+            <w:r>
+              <w:rPr>
+                <w:b/>
+                <w:color w:val="FFFFFF"/>
+                <w:sz w:val="24"/>
+              </w:rPr>
+              <w:t>ITEM 1</w:t>
+            </w:r>
+          </w:p>
+          <w:p>
+            <w:pPr>
+              <w:spacing w:before="60" w:after="60"/>
+              <w:ind w:left="360"/>
+            </w:pPr>
+            <w:r>
+              <w:rPr>
+                <w:b/>
+                <w:i/>
+                <w:color w:val="004284"/>
+                <w:sz w:val="22"/>
+              </w:rPr>
+              <w:t xml:space="preserve">CAPACIDADE: </w:t>
+            </w:r>
+            <w:r>
+              <w:rPr>
+                <w:sz w:val="22"/>
+              </w:rPr>
+              <w:t>Interpretar informações técnicas relacionadas a estatística e distribuições de dados</w:t>
+            </w:r>
+          </w:p>
+          <w:p>
+            <w:pPr>
+              <w:spacing w:before="60" w:after="60"/>
+              <w:ind w:left="360"/>
+            </w:pPr>
+            <w:r>
+              <w:rPr>
+                <w:b/>
+                <w:i/>
+                <w:color w:val="004284"/>
+                <w:sz w:val="22"/>
+              </w:rPr>
+              <w:t xml:space="preserve">Contexto: </w:t>
+            </w:r>
+            <w:r>
+              <w:rPr>
+                <w:sz w:val="22"/>
+              </w:rPr>
+              <w:t>Uma distribuidora de alimentos coleta dados de dois fornecedores de leite durante 15 dias. Fornecedor A: 10, 10, 11, 9, 10, 10, 10, 11, 10, 10, 9, 10, 11, 10, 10. Fornecedor B: 8, 8, 9, 14, 8, 15, 8, 9, 7, 8, 15, 8, 9, 8, 8.</w:t>
+            </w:r>
+          </w:p>
+          <w:p>
+            <w:pPr>
+              <w:spacing w:before="60" w:after="60"/>
+              <w:ind w:left="360"/>
+            </w:pPr>
+            <w:r>
+              <w:rPr>
+                <w:b/>
+                <w:i/>
+                <w:color w:val="004284"/>
+                <w:sz w:val="22"/>
+              </w:rPr>
+              <w:t xml:space="preserve">Comando: </w:t>
+            </w:r>
+            <w:r>
+              <w:rPr>
+                <w:sz w:val="22"/>
+              </w:rPr>
+              <w:t>A média aritmética de dias úteis de entrega para o Fornecedor A é:</w:t>
+            </w:r>
+          </w:p>
+          <w:p>
+            <w:pPr>
+              <w:spacing w:before="60" w:after="60"/>
+              <w:ind w:left="360"/>
+            </w:pPr>
+            <w:r>
+              <w:rPr>
+                <w:b/>
+                <w:i/>
+                <w:color w:val="004284"/>
+                <w:sz w:val="22"/>
+              </w:rPr>
+              <w:t>Alternativas:</w:t>
+            </w:r>
+          </w:p>
+          <w:p>
+            <w:pPr>
+              <w:spacing w:before="20" w:after="20"/>
+              <w:ind w:left="720"/>
+            </w:pPr>
+            <w:r>
+              <w:rPr>
+                <w:sz w:val="22"/>
+              </w:rPr>
+              <w:t>a) 9,5 dias</w:t>
+            </w:r>
+          </w:p>
+          <w:p>
+            <w:pPr>
+              <w:spacing w:before="20" w:after="20"/>
+              <w:ind w:left="720"/>
+            </w:pPr>
+            <w:r>
+              <w:rPr>
+                <w:sz w:val="22"/>
+              </w:rPr>
+              <w:t>b) 10,13 dias</w:t>
+            </w:r>
+          </w:p>
+          <w:p>
+            <w:pPr>
+              <w:spacing w:before="20" w:after="20"/>
+              <w:ind w:left="720"/>
+            </w:pPr>
+            <w:r>
+              <w:rPr>
+                <w:sz w:val="22"/>
+              </w:rPr>
+              <w:t>c) 10,0 dias</w:t>
+            </w:r>
+          </w:p>
+          <w:p>
+            <w:pPr>
+              <w:spacing w:before="20" w:after="20"/>
+              <w:ind w:left="720"/>
+            </w:pPr>
+            <w:r>
+              <w:rPr>
+                <w:sz w:val="22"/>
+              </w:rPr>
+              <w:t>d) 11,0 dias</w:t>
+            </w:r>
+          </w:p>
+          <w:p>
+            <w:pPr>
+              <w:spacing w:before="20" w:after="20"/>
+              <w:ind w:left="720"/>
+            </w:pPr>
+            <w:r>
+              <w:rPr>
+                <w:sz w:val="22"/>
+              </w:rPr>
+              <w:t>e) 9,87 dias</w:t>
+            </w:r>
+          </w:p>
+        </w:tc>
+      </w:tr>
+    </w:tbl>
+    <w:p/>
+    <w:tbl>
+      <w:tblPr>
+        <w:tblW w:type="auto" w:w="0"/>
+        <w:tblLayout w:type="fixed"/>
+        <w:tblLook w:firstColumn="1" w:firstRow="1" w:lastColumn="0" w:lastRow="0" w:noHBand="0" w:noVBand="1" w:val="04A0"/>
+        <w:tblBorders>
+          <w:top w:val="single" w:sz="24" w:space="0" w:color="000000"/>
+          <w:left w:val="single" w:sz="24" w:space="0" w:color="000000"/>
+          <w:bottom w:val="single" w:sz="24" w:space="0" w:color="000000"/>
+          <w:right w:val="single" w:sz="24" w:space="0" w:color="000000"/>
+          <w:insideH w:val="single" w:sz="24" w:space="0" w:color="000000"/>
+          <w:insideV w:val="single" w:sz="24" w:space="0" w:color="000000"/>
+        </w:tblBorders>
+      </w:tblPr>
+      <w:tblGrid>
+        <w:gridCol w:w="10080"/>
+      </w:tblGrid>
+      <w:tr>
+        <w:tc>
+          <w:tcPr>
+            <w:tcW w:type="dxa" w:w="10080"/>
+            <w:shd w:fill="FFFFFF"/>
+          </w:tcPr>
+          <w:p>
+            <w:pPr>
+              <w:spacing w:before="0" w:after="120"/>
+              <w:shd w:fill="004284"/>
+            </w:pPr>
+            <w:r/>
+            <w:r>
+              <w:rPr>
+                <w:b/>
+                <w:color w:val="FFFFFF"/>
+                <w:sz w:val="24"/>
+              </w:rPr>
+              <w:t>ITEM 2</w:t>
+            </w:r>
+          </w:p>
+          <w:p>
+            <w:pPr>
+              <w:spacing w:before="60" w:after="60"/>
+              <w:ind w:left="360"/>
+            </w:pPr>
+            <w:r>
+              <w:rPr>
+                <w:b/>
+                <w:i/>
+                <w:color w:val="004284"/>
+                <w:sz w:val="22"/>
+              </w:rPr>
+              <w:t xml:space="preserve">CAPACIDADE: </w:t>
+            </w:r>
+            <w:r>
+              <w:rPr>
+                <w:sz w:val="22"/>
+              </w:rPr>
+              <w:t>Calcular medidas de dispersão de dados em conjuntos de valores</w:t>
+            </w:r>
+          </w:p>
+          <w:p>
+            <w:pPr>
+              <w:spacing w:before="60" w:after="60"/>
+              <w:ind w:left="360"/>
+            </w:pPr>
+            <w:r>
+              <w:rPr>
+                <w:b/>
+                <w:i/>
+                <w:color w:val="004284"/>
+                <w:sz w:val="22"/>
+              </w:rPr>
+              <w:t xml:space="preserve">Contexto: </w:t>
+            </w:r>
+            <w:r>
+              <w:rPr>
+                <w:sz w:val="22"/>
+              </w:rPr>
+              <w:t>Continuando a análise dos fornecedores de leite, agora é necessário avaliar a confiabilidade de entrega pelo desvio padrão.</w:t>
+            </w:r>
+          </w:p>
+          <w:p>
+            <w:pPr>
+              <w:spacing w:before="60" w:after="60"/>
+              <w:ind w:left="360"/>
+            </w:pPr>
+            <w:r>
+              <w:rPr>
+                <w:b/>
+                <w:i/>
+                <w:color w:val="004284"/>
+                <w:sz w:val="22"/>
+              </w:rPr>
+              <w:t xml:space="preserve">Comando: </w:t>
+            </w:r>
+            <w:r>
+              <w:rPr>
+                <w:sz w:val="22"/>
+              </w:rPr>
+              <w:t>Qual fornecedor apresenta MAIOR confiabilidade com base na amplitude (diferença entre máximo e mínimo)?</w:t>
+            </w:r>
+          </w:p>
+          <w:p>
+            <w:pPr>
+              <w:spacing w:before="60" w:after="60"/>
+              <w:ind w:left="360"/>
+            </w:pPr>
+            <w:r>
+              <w:rPr>
+                <w:b/>
+                <w:i/>
+                <w:color w:val="004284"/>
+                <w:sz w:val="22"/>
+              </w:rPr>
+              <w:t>Alternativas:</w:t>
+            </w:r>
+          </w:p>
+          <w:p>
+            <w:pPr>
+              <w:spacing w:before="20" w:after="20"/>
+              <w:ind w:left="720"/>
+            </w:pPr>
+            <w:r>
+              <w:rPr>
+                <w:sz w:val="22"/>
+              </w:rPr>
+              <w:t>a) Fornecedor A, pois sua amplitude é de 2 dias</w:t>
+            </w:r>
+          </w:p>
+          <w:p>
+            <w:pPr>
+              <w:spacing w:before="20" w:after="20"/>
+              <w:ind w:left="720"/>
+            </w:pPr>
+            <w:r>
+              <w:rPr>
+                <w:sz w:val="22"/>
+              </w:rPr>
+              <w:t>b) Fornecedor B, pois sua amplitude é de 8 dias</w:t>
+            </w:r>
+          </w:p>
+          <w:p>
+            <w:pPr>
+              <w:spacing w:before="20" w:after="20"/>
+              <w:ind w:left="720"/>
+            </w:pPr>
+            <w:r>
+              <w:rPr>
+                <w:sz w:val="22"/>
+              </w:rPr>
+              <w:t>c) Ambos têm a mesma amplitude</w:t>
+            </w:r>
+          </w:p>
+          <w:p>
+            <w:pPr>
+              <w:spacing w:before="20" w:after="20"/>
+              <w:ind w:left="720"/>
+            </w:pPr>
+            <w:r>
+              <w:rPr>
+                <w:sz w:val="22"/>
+              </w:rPr>
+              <w:t>d) Fornecedor B é mais confiável</w:t>
+            </w:r>
+          </w:p>
+          <w:p>
+            <w:pPr>
+              <w:spacing w:before="20" w:after="20"/>
+              <w:ind w:left="720"/>
+            </w:pPr>
+            <w:r>
+              <w:rPr>
+                <w:sz w:val="22"/>
+              </w:rPr>
+              <w:t>e) Não é possível determinar com estes dados</w:t>
+            </w:r>
+          </w:p>
+        </w:tc>
+      </w:tr>
+    </w:tbl>
+    <w:p/>
+    <w:tbl>
+      <w:tblPr>
+        <w:tblW w:type="auto" w:w="0"/>
+        <w:tblLayout w:type="fixed"/>
+        <w:tblLook w:firstColumn="1" w:firstRow="1" w:lastColumn="0" w:lastRow="0" w:noHBand="0" w:noVBand="1" w:val="04A0"/>
+        <w:tblBorders>
+          <w:top w:val="single" w:sz="24" w:space="0" w:color="000000"/>
+          <w:left w:val="single" w:sz="24" w:space="0" w:color="000000"/>
+          <w:bottom w:val="single" w:sz="24" w:space="0" w:color="000000"/>
+          <w:right w:val="single" w:sz="24" w:space="0" w:color="000000"/>
+          <w:insideH w:val="single" w:sz="24" w:space="0" w:color="000000"/>
+          <w:insideV w:val="single" w:sz="24" w:space="0" w:color="000000"/>
+        </w:tblBorders>
+      </w:tblPr>
+      <w:tblGrid>
+        <w:gridCol w:w="10080"/>
+      </w:tblGrid>
+      <w:tr>
+        <w:tc>
+          <w:tcPr>
+            <w:tcW w:type="dxa" w:w="10080"/>
+            <w:shd w:fill="FFFFFF"/>
+          </w:tcPr>
+          <w:p>
+            <w:pPr>
+              <w:spacing w:before="0" w:after="120"/>
+              <w:shd w:fill="004284"/>
+            </w:pPr>
+            <w:r/>
+            <w:r>
+              <w:rPr>
+                <w:b/>
+                <w:color w:val="FFFFFF"/>
+                <w:sz w:val="24"/>
+              </w:rPr>
+              <w:t>ITEM 3</w:t>
+            </w:r>
+          </w:p>
+          <w:p>
+            <w:pPr>
+              <w:spacing w:before="60" w:after="60"/>
+              <w:ind w:left="360"/>
+            </w:pPr>
+            <w:r>
+              <w:rPr>
+                <w:b/>
+                <w:i/>
+                <w:color w:val="004284"/>
+                <w:sz w:val="22"/>
+              </w:rPr>
+              <w:t xml:space="preserve">CAPACIDADE: </w:t>
+            </w:r>
+            <w:r>
+              <w:rPr>
+                <w:sz w:val="22"/>
+              </w:rPr>
+              <w:t>Aplicar fórmulas de progressão aritmética em contextos de gestão empresarial</w:t>
+            </w:r>
+          </w:p>
+          <w:p>
+            <w:pPr>
+              <w:spacing w:before="60" w:after="60"/>
+              <w:ind w:left="360"/>
+            </w:pPr>
+            <w:r>
+              <w:rPr>
+                <w:b/>
+                <w:i/>
+                <w:color w:val="004284"/>
+                <w:sz w:val="22"/>
+              </w:rPr>
+              <w:t xml:space="preserve">Contexto: </w:t>
+            </w:r>
+            <w:r>
+              <w:rPr>
+                <w:sz w:val="22"/>
+              </w:rPr>
+              <w:t>A distribuidora espera crescimento constante de 50 litros por semana. Na semana 1, a demanda era de 500 litros.</w:t>
+            </w:r>
+          </w:p>
+          <w:p>
+            <w:pPr>
+              <w:spacing w:before="60" w:after="60"/>
+              <w:ind w:left="360"/>
+            </w:pPr>
+            <w:r>
+              <w:rPr>
+                <w:b/>
+                <w:i/>
+                <w:color w:val="004284"/>
+                <w:sz w:val="22"/>
+              </w:rPr>
+              <w:t xml:space="preserve">Comando: </w:t>
+            </w:r>
+            <w:r>
+              <w:rPr>
+                <w:sz w:val="22"/>
+              </w:rPr>
+              <w:t>Em qual semana a demanda atingirá 1.000 litros? (Use: a(n) = a(1) + (n-1)·r)</w:t>
+            </w:r>
+          </w:p>
+          <w:p>
+            <w:pPr>
+              <w:spacing w:before="60" w:after="60"/>
+              <w:ind w:left="360"/>
+            </w:pPr>
+            <w:r>
+              <w:rPr>
+                <w:b/>
+                <w:i/>
+                <w:color w:val="004284"/>
+                <w:sz w:val="22"/>
+              </w:rPr>
+              <w:t>Alternativas:</w:t>
+            </w:r>
+          </w:p>
+          <w:p>
+            <w:pPr>
+              <w:spacing w:before="20" w:after="20"/>
+              <w:ind w:left="720"/>
+            </w:pPr>
+            <w:r>
+              <w:rPr>
+                <w:sz w:val="22"/>
+              </w:rPr>
+              <w:t>a) Semana 5</w:t>
+            </w:r>
+          </w:p>
+          <w:p>
+            <w:pPr>
+              <w:spacing w:before="20" w:after="20"/>
+              <w:ind w:left="720"/>
+            </w:pPr>
+            <w:r>
+              <w:rPr>
+                <w:sz w:val="22"/>
+              </w:rPr>
+              <w:t>b) Semana 10</w:t>
+            </w:r>
+          </w:p>
+          <w:p>
+            <w:pPr>
+              <w:spacing w:before="20" w:after="20"/>
+              <w:ind w:left="720"/>
+            </w:pPr>
+            <w:r>
+              <w:rPr>
+                <w:sz w:val="22"/>
+              </w:rPr>
+              <w:t>c) Semana 11</w:t>
+            </w:r>
+          </w:p>
+          <w:p>
+            <w:pPr>
+              <w:spacing w:before="20" w:after="20"/>
+              <w:ind w:left="720"/>
+            </w:pPr>
+            <w:r>
+              <w:rPr>
+                <w:sz w:val="22"/>
+              </w:rPr>
+              <w:t>d) Semana 15</w:t>
+            </w:r>
+          </w:p>
+          <w:p>
+            <w:pPr>
+              <w:spacing w:before="20" w:after="20"/>
+              <w:ind w:left="720"/>
+            </w:pPr>
+            <w:r>
+              <w:rPr>
+                <w:sz w:val="22"/>
+              </w:rPr>
+              <w:t>e) Semana 20</w:t>
+            </w:r>
+          </w:p>
+        </w:tc>
+      </w:tr>
+    </w:tbl>
+    <w:p/>
+    <w:tbl>
+      <w:tblPr>
+        <w:tblW w:type="auto" w:w="0"/>
+        <w:tblLayout w:type="fixed"/>
+        <w:tblLook w:firstColumn="1" w:firstRow="1" w:lastColumn="0" w:lastRow="0" w:noHBand="0" w:noVBand="1" w:val="04A0"/>
+        <w:tblBorders>
+          <w:top w:val="single" w:sz="24" w:space="0" w:color="000000"/>
+          <w:left w:val="single" w:sz="24" w:space="0" w:color="000000"/>
+          <w:bottom w:val="single" w:sz="24" w:space="0" w:color="000000"/>
+          <w:right w:val="single" w:sz="24" w:space="0" w:color="000000"/>
+          <w:insideH w:val="single" w:sz="24" w:space="0" w:color="000000"/>
+          <w:insideV w:val="single" w:sz="24" w:space="0" w:color="000000"/>
+        </w:tblBorders>
+      </w:tblPr>
+      <w:tblGrid>
+        <w:gridCol w:w="10080"/>
+      </w:tblGrid>
+      <w:tr>
+        <w:tc>
+          <w:tcPr>
+            <w:tcW w:type="dxa" w:w="10080"/>
+            <w:shd w:fill="FFFFFF"/>
+          </w:tcPr>
+          <w:p>
+            <w:pPr>
+              <w:spacing w:before="0" w:after="120"/>
+              <w:shd w:fill="004284"/>
+            </w:pPr>
+            <w:r/>
+            <w:r>
+              <w:rPr>
+                <w:b/>
+                <w:color w:val="FFFFFF"/>
+                <w:sz w:val="24"/>
+              </w:rPr>
+              <w:t>ITEM 4</w:t>
+            </w:r>
+          </w:p>
+          <w:p>
+            <w:pPr>
+              <w:spacing w:before="60" w:after="60"/>
+              <w:ind w:left="360"/>
+            </w:pPr>
+            <w:r>
+              <w:rPr>
+                <w:b/>
+                <w:i/>
+                <w:color w:val="004284"/>
+                <w:sz w:val="22"/>
+              </w:rPr>
+              <w:t xml:space="preserve">CAPACIDADE: </w:t>
+            </w:r>
+            <w:r>
+              <w:rPr>
+                <w:sz w:val="22"/>
+              </w:rPr>
+              <w:t>Diferenciar progressão aritmética de progressão geométrica em cenários práticos</w:t>
+            </w:r>
+          </w:p>
+          <w:p>
+            <w:pPr>
+              <w:spacing w:before="60" w:after="60"/>
+              <w:ind w:left="360"/>
+            </w:pPr>
+            <w:r>
+              <w:rPr>
+                <w:b/>
+                <w:i/>
+                <w:color w:val="004284"/>
+                <w:sz w:val="22"/>
+              </w:rPr>
+              <w:t xml:space="preserve">Contexto: </w:t>
+            </w:r>
+            <w:r>
+              <w:rPr>
+                <w:sz w:val="22"/>
+              </w:rPr>
+              <w:t>Agora a empresa projeta dois cenários: um com crescimento linear (+50 L/sem) e outro com crescimento exponencial de 10% ao mês.</w:t>
+            </w:r>
+          </w:p>
+          <w:p>
+            <w:pPr>
+              <w:spacing w:before="60" w:after="60"/>
+              <w:ind w:left="360"/>
+            </w:pPr>
+            <w:r>
+              <w:rPr>
+                <w:b/>
+                <w:i/>
+                <w:color w:val="004284"/>
+                <w:sz w:val="22"/>
+              </w:rPr>
+              <w:t xml:space="preserve">Comando: </w:t>
+            </w:r>
+            <w:r>
+              <w:rPr>
+                <w:sz w:val="22"/>
+              </w:rPr>
+              <w:t>Qual tipo de progressão cresce mais rapidamente?</w:t>
+            </w:r>
+          </w:p>
+          <w:p>
+            <w:pPr>
+              <w:spacing w:before="60" w:after="60"/>
+              <w:ind w:left="360"/>
+            </w:pPr>
+            <w:r>
+              <w:rPr>
+                <w:b/>
+                <w:i/>
+                <w:color w:val="004284"/>
+                <w:sz w:val="22"/>
+              </w:rPr>
+              <w:t>Alternativas:</w:t>
+            </w:r>
+          </w:p>
+          <w:p>
+            <w:pPr>
+              <w:spacing w:before="20" w:after="20"/>
+              <w:ind w:left="720"/>
+            </w:pPr>
+            <w:r>
+              <w:rPr>
+                <w:sz w:val="22"/>
+              </w:rPr>
+              <w:t>a) A progressão aritmética (PA)</w:t>
+            </w:r>
+          </w:p>
+          <w:p>
+            <w:pPr>
+              <w:spacing w:before="20" w:after="20"/>
+              <w:ind w:left="720"/>
+            </w:pPr>
+            <w:r>
+              <w:rPr>
+                <w:sz w:val="22"/>
+              </w:rPr>
+              <w:t>b) A progressão geométrica (PG)</w:t>
+            </w:r>
+          </w:p>
+          <w:p>
+            <w:pPr>
+              <w:spacing w:before="20" w:after="20"/>
+              <w:ind w:left="720"/>
+            </w:pPr>
+            <w:r>
+              <w:rPr>
+                <w:sz w:val="22"/>
+              </w:rPr>
+              <w:t>c) Ambas crescem igualmente</w:t>
+            </w:r>
+          </w:p>
+          <w:p>
+            <w:pPr>
+              <w:spacing w:before="20" w:after="20"/>
+              <w:ind w:left="720"/>
+            </w:pPr>
+            <w:r>
+              <w:rPr>
+                <w:sz w:val="22"/>
+              </w:rPr>
+              <w:t>d) Depende do valor inicial</w:t>
+            </w:r>
+          </w:p>
+          <w:p>
+            <w:pPr>
+              <w:spacing w:before="20" w:after="20"/>
+              <w:ind w:left="720"/>
+            </w:pPr>
+            <w:r>
+              <w:rPr>
+                <w:sz w:val="22"/>
+              </w:rPr>
+              <w:t>e) Não há como comparar sem cálculos</w:t>
+            </w:r>
+          </w:p>
+        </w:tc>
+      </w:tr>
+    </w:tbl>
+    <w:p/>
+    <w:tbl>
+      <w:tblPr>
+        <w:tblW w:type="auto" w:w="0"/>
+        <w:tblLayout w:type="fixed"/>
+        <w:tblLook w:firstColumn="1" w:firstRow="1" w:lastColumn="0" w:lastRow="0" w:noHBand="0" w:noVBand="1" w:val="04A0"/>
+        <w:tblBorders>
+          <w:top w:val="single" w:sz="24" w:space="0" w:color="000000"/>
+          <w:left w:val="single" w:sz="24" w:space="0" w:color="000000"/>
+          <w:bottom w:val="single" w:sz="24" w:space="0" w:color="000000"/>
+          <w:right w:val="single" w:sz="24" w:space="0" w:color="000000"/>
+          <w:insideH w:val="single" w:sz="24" w:space="0" w:color="000000"/>
+          <w:insideV w:val="single" w:sz="24" w:space="0" w:color="000000"/>
+        </w:tblBorders>
+      </w:tblPr>
+      <w:tblGrid>
+        <w:gridCol w:w="10080"/>
+      </w:tblGrid>
+      <w:tr>
+        <w:tc>
+          <w:tcPr>
+            <w:tcW w:type="dxa" w:w="10080"/>
+            <w:shd w:fill="FFFFFF"/>
+          </w:tcPr>
+          <w:p>
+            <w:pPr>
+              <w:spacing w:before="0" w:after="120"/>
+              <w:shd w:fill="004284"/>
+            </w:pPr>
+            <w:r/>
+            <w:r>
+              <w:rPr>
+                <w:b/>
+                <w:color w:val="FFFFFF"/>
+                <w:sz w:val="24"/>
+              </w:rPr>
+              <w:t>ITEM 5</w:t>
+            </w:r>
+          </w:p>
+          <w:p>
+            <w:pPr>
+              <w:spacing w:before="60" w:after="60"/>
+              <w:ind w:left="360"/>
+            </w:pPr>
+            <w:r>
+              <w:rPr>
+                <w:b/>
+                <w:i/>
+                <w:color w:val="004284"/>
+                <w:sz w:val="22"/>
+              </w:rPr>
+              <w:t xml:space="preserve">CAPACIDADE: </w:t>
+            </w:r>
+            <w:r>
+              <w:rPr>
+                <w:sz w:val="22"/>
+              </w:rPr>
+              <w:t>Analisar dados estatísticos para tomada de decisão gerencial</w:t>
+            </w:r>
+          </w:p>
+          <w:p>
+            <w:pPr>
+              <w:spacing w:before="60" w:after="60"/>
+              <w:ind w:left="360"/>
+            </w:pPr>
+            <w:r>
+              <w:rPr>
+                <w:b/>
+                <w:i/>
+                <w:color w:val="004284"/>
+                <w:sz w:val="22"/>
+              </w:rPr>
+              <w:t xml:space="preserve">Contexto: </w:t>
+            </w:r>
+            <w:r>
+              <w:rPr>
+                <w:sz w:val="22"/>
+              </w:rPr>
+              <w:t>Com base na análise completa dos dois fornecedores, a empresa precisa escolher qual contratar para garantir previsibilidade.</w:t>
+            </w:r>
+          </w:p>
+          <w:p>
+            <w:pPr>
+              <w:spacing w:before="60" w:after="60"/>
+              <w:ind w:left="360"/>
+            </w:pPr>
+            <w:r>
+              <w:rPr>
+                <w:b/>
+                <w:i/>
+                <w:color w:val="004284"/>
+                <w:sz w:val="22"/>
+              </w:rPr>
+              <w:t xml:space="preserve">Comando: </w:t>
+            </w:r>
+            <w:r>
+              <w:rPr>
+                <w:sz w:val="22"/>
+              </w:rPr>
+              <w:t>Qual critério estatístico é MAIS importante para avaliar a confiabilidade do fornecedor?</w:t>
+            </w:r>
+          </w:p>
+          <w:p>
+            <w:pPr>
+              <w:spacing w:before="60" w:after="60"/>
+              <w:ind w:left="360"/>
+            </w:pPr>
+            <w:r>
+              <w:rPr>
+                <w:b/>
+                <w:i/>
+                <w:color w:val="004284"/>
+                <w:sz w:val="22"/>
+              </w:rPr>
+              <w:t>Alternativas:</w:t>
+            </w:r>
+          </w:p>
+          <w:p>
+            <w:pPr>
+              <w:spacing w:before="20" w:after="20"/>
+              <w:ind w:left="720"/>
+            </w:pPr>
+            <w:r>
+              <w:rPr>
+                <w:sz w:val="22"/>
+              </w:rPr>
+              <w:t>a) A moda (valor mais frequente)</w:t>
+            </w:r>
+          </w:p>
+          <w:p>
+            <w:pPr>
+              <w:spacing w:before="20" w:after="20"/>
+              <w:ind w:left="720"/>
+            </w:pPr>
+            <w:r>
+              <w:rPr>
+                <w:sz w:val="22"/>
+              </w:rPr>
+              <w:t>b) A média aritmética</w:t>
+            </w:r>
+          </w:p>
+          <w:p>
+            <w:pPr>
+              <w:spacing w:before="20" w:after="20"/>
+              <w:ind w:left="720"/>
+            </w:pPr>
+            <w:r>
+              <w:rPr>
+                <w:sz w:val="22"/>
+              </w:rPr>
+              <w:t>c) O desvio padrão (medida de variabilidade)</w:t>
+            </w:r>
+          </w:p>
+          <w:p>
+            <w:pPr>
+              <w:spacing w:before="20" w:after="20"/>
+              <w:ind w:left="720"/>
+            </w:pPr>
+            <w:r>
+              <w:rPr>
+                <w:sz w:val="22"/>
+              </w:rPr>
+              <w:t>d) A mediana</w:t>
+            </w:r>
+          </w:p>
+          <w:p>
+            <w:pPr>
+              <w:spacing w:before="20" w:after="20"/>
+              <w:ind w:left="720"/>
+            </w:pPr>
+            <w:r>
+              <w:rPr>
+                <w:sz w:val="22"/>
+              </w:rPr>
+              <w:t>e) A amplitude</w:t>
+            </w:r>
+          </w:p>
+        </w:tc>
+      </w:tr>
+    </w:tbl>
+    <w:p/>
+    <w:tbl>
+      <w:tblPr>
+        <w:tblW w:type="auto" w:w="0"/>
+        <w:tblLayout w:type="fixed"/>
+        <w:tblLook w:firstColumn="1" w:firstRow="1" w:lastColumn="0" w:lastRow="0" w:noHBand="0" w:noVBand="1" w:val="04A0"/>
+        <w:tblBorders>
+          <w:top w:val="single" w:sz="24" w:space="0" w:color="000000"/>
+          <w:left w:val="single" w:sz="24" w:space="0" w:color="000000"/>
+          <w:bottom w:val="single" w:sz="24" w:space="0" w:color="000000"/>
+          <w:right w:val="single" w:sz="24" w:space="0" w:color="000000"/>
+          <w:insideH w:val="single" w:sz="24" w:space="0" w:color="000000"/>
+          <w:insideV w:val="single" w:sz="24" w:space="0" w:color="000000"/>
+        </w:tblBorders>
+      </w:tblPr>
+      <w:tblGrid>
+        <w:gridCol w:w="10080"/>
+      </w:tblGrid>
+      <w:tr>
+        <w:tc>
+          <w:tcPr>
+            <w:tcW w:type="dxa" w:w="10080"/>
+            <w:shd w:fill="FFFFFF"/>
+          </w:tcPr>
+          <w:p>
+            <w:pPr>
+              <w:spacing w:before="0" w:after="120"/>
+              <w:shd w:fill="004284"/>
+            </w:pPr>
+            <w:r/>
+            <w:r>
+              <w:rPr>
+                <w:b/>
+                <w:color w:val="FFFFFF"/>
+                <w:sz w:val="24"/>
+              </w:rPr>
+              <w:t>ITEM 6</w:t>
+            </w:r>
+          </w:p>
+          <w:p>
+            <w:pPr>
+              <w:spacing w:before="60" w:after="60"/>
+              <w:ind w:left="360"/>
+            </w:pPr>
+            <w:r>
+              <w:rPr>
+                <w:b/>
+                <w:i/>
+                <w:color w:val="004284"/>
+                <w:sz w:val="22"/>
+              </w:rPr>
+              <w:t xml:space="preserve">CAPACIDADE: </w:t>
+            </w:r>
+            <w:r>
+              <w:rPr>
+                <w:sz w:val="22"/>
+              </w:rPr>
+              <w:t>Interpretar dados em progressão geométrica para projeções de negócio</w:t>
+            </w:r>
+          </w:p>
+          <w:p>
+            <w:pPr>
+              <w:spacing w:before="60" w:after="60"/>
+              <w:ind w:left="360"/>
+            </w:pPr>
+            <w:r>
+              <w:rPr>
+                <w:b/>
+                <w:i/>
+                <w:color w:val="004284"/>
+                <w:sz w:val="22"/>
+              </w:rPr>
+              <w:t xml:space="preserve">Contexto: </w:t>
+            </w:r>
+            <w:r>
+              <w:rPr>
+                <w:sz w:val="22"/>
+              </w:rPr>
+              <w:t>Com crescimento de 10% ao mês, o volume de demanda no mês 6 seria de aproximadamente 895 litros (500 × 1,10^5).</w:t>
+            </w:r>
+          </w:p>
+          <w:p>
+            <w:pPr>
+              <w:spacing w:before="60" w:after="60"/>
+              <w:ind w:left="360"/>
+            </w:pPr>
+            <w:r>
+              <w:rPr>
+                <w:b/>
+                <w:i/>
+                <w:color w:val="004284"/>
+                <w:sz w:val="22"/>
+              </w:rPr>
+              <w:t xml:space="preserve">Comando: </w:t>
+            </w:r>
+            <w:r>
+              <w:rPr>
+                <w:sz w:val="22"/>
+              </w:rPr>
+              <w:t>Comparando com a progressão aritmética (+50 L/sem = 200 L/mês), qual progressão ultrapassa a demanda de 1.000 litros PRIMEIRO?</w:t>
+            </w:r>
+          </w:p>
+          <w:p>
+            <w:pPr>
+              <w:spacing w:before="60" w:after="60"/>
+              <w:ind w:left="360"/>
+            </w:pPr>
+            <w:r>
+              <w:rPr>
+                <w:b/>
+                <w:i/>
+                <w:color w:val="004284"/>
+                <w:sz w:val="22"/>
+              </w:rPr>
+              <w:t>Alternativas:</w:t>
+            </w:r>
+          </w:p>
+          <w:p>
+            <w:pPr>
+              <w:spacing w:before="20" w:after="20"/>
+              <w:ind w:left="720"/>
+            </w:pPr>
+            <w:r>
+              <w:rPr>
+                <w:sz w:val="22"/>
+              </w:rPr>
+              <w:t>a) Progressão aritmética, no 5º período</w:t>
+            </w:r>
+          </w:p>
+          <w:p>
+            <w:pPr>
+              <w:spacing w:before="20" w:after="20"/>
+              <w:ind w:left="720"/>
+            </w:pPr>
+            <w:r>
+              <w:rPr>
+                <w:sz w:val="22"/>
+              </w:rPr>
+              <w:t>b) Progressão geométrica, entre 6-7 meses</w:t>
+            </w:r>
+          </w:p>
+          <w:p>
+            <w:pPr>
+              <w:spacing w:before="20" w:after="20"/>
+              <w:ind w:left="720"/>
+            </w:pPr>
+            <w:r>
+              <w:rPr>
+                <w:sz w:val="22"/>
+              </w:rPr>
+              <w:t>c) Ambas alcançam simultaneamente</w:t>
+            </w:r>
+          </w:p>
+          <w:p>
+            <w:pPr>
+              <w:spacing w:before="20" w:after="20"/>
+              <w:ind w:left="720"/>
+            </w:pPr>
+            <w:r>
+              <w:rPr>
+                <w:sz w:val="22"/>
+              </w:rPr>
+              <w:t>d) PA no 11º mês e PG no 7º mês</w:t>
+            </w:r>
+          </w:p>
+          <w:p>
+            <w:pPr>
+              <w:spacing w:before="20" w:after="20"/>
+              <w:ind w:left="720"/>
+            </w:pPr>
+            <w:r>
+              <w:rPr>
+                <w:sz w:val="22"/>
+              </w:rPr>
+              <w:t>e) Nenhuma atinge 1.000 em período realista</w:t>
+            </w:r>
+          </w:p>
+        </w:tc>
+      </w:tr>
+    </w:tbl>
+    <w:p/>
     <w:sectPr>
       <w:pgSz w:w="12240" w:h="15840"/>
       <w:pgMar w:top="720" w:right="1080" w:bottom="1440" w:left="1080" w:header="720" w:footer="720" w:gutter="0"/>

</xml_diff>

<commit_message>
refactor: cabeçalhos limpos e nome correto do curso
Atualizações nos cabeçalhos:
- Removido 'preenchimento pelo docente' (substituído por linhas em branco)
- Removido 'preenchimento pelo estudante' (substituído por linhas em branco)
- Nome do curso atualizado: 'Assistente em Processos de Gestão e Controle de Materiais'
- Mantido layout SENAI padrão com bordas finas

Avaliações prontas para uso operacional.
</commit_message>
<xml_diff>
--- a/MATERIAIS/GESTAO_E_CONTROLE_MATERIAIS/ANALISE_DADOS_APLICADA_GESTAO/ATIVIDADES/AVALIACAO-01-ESTATISTICA-E-PROGRESSOES.docx
+++ b/MATERIAIS/GESTAO_E_CONTROLE_MATERIAIS/ANALISE_DADOS_APLICADA_GESTAO/ATIVIDADES/AVALIACAO-01-ESTATISTICA-E-PROGRESSOES.docx
@@ -88,7 +88,7 @@
               <w:t xml:space="preserve">Data: </w:t>
             </w:r>
             <w:r>
-              <w:t>preenchimento pelo docente</w:t>
+              <w:t>_____________________</w:t>
             </w:r>
           </w:p>
           <w:p>
@@ -100,7 +100,7 @@
               <w:t xml:space="preserve">Docente: </w:t>
             </w:r>
             <w:r>
-              <w:t>preenchimento pelo docente</w:t>
+              <w:t>_____________________</w:t>
             </w:r>
           </w:p>
           <w:p>
@@ -116,7 +116,7 @@
                 <w:i/>
                 <w:color w:val="004284"/>
               </w:rPr>
-              <w:t>ELETROMECÂNICA</w:t>
+              <w:t>Assistente em Processos de Gestão e Controle de Materiais</w:t>
             </w:r>
           </w:p>
           <w:p>
@@ -144,7 +144,7 @@
               <w:t xml:space="preserve">Turma: </w:t>
             </w:r>
             <w:r>
-              <w:t>preenchimento pelo docente</w:t>
+              <w:t>_____________________</w:t>
             </w:r>
           </w:p>
           <w:p>
@@ -156,7 +156,7 @@
               <w:t xml:space="preserve">Estudante: </w:t>
             </w:r>
             <w:r>
-              <w:t>preenchimento pelo estudante</w:t>
+              <w:t>_____________________</w:t>
             </w:r>
           </w:p>
         </w:tc>

</xml_diff>

<commit_message>
refactor: adicionar nome do docente GELVAZIO CAMARGO nos cabecalhos
Nome do docente adicionado ao lado de 'Docente:' em todos os arquivos
- Formatação: azul itálico (conforme padrão SENAI)
- Visible em todos os 4 arquivos de avaliação

Avaliações finalizadas com identificação completa do docente.
</commit_message>
<xml_diff>
--- a/MATERIAIS/GESTAO_E_CONTROLE_MATERIAIS/ANALISE_DADOS_APLICADA_GESTAO/ATIVIDADES/AVALIACAO-01-ESTATISTICA-E-PROGRESSOES.docx
+++ b/MATERIAIS/GESTAO_E_CONTROLE_MATERIAIS/ANALISE_DADOS_APLICADA_GESTAO/ATIVIDADES/AVALIACAO-01-ESTATISTICA-E-PROGRESSOES.docx
@@ -100,7 +100,11 @@
               <w:t xml:space="preserve">Docente: </w:t>
             </w:r>
             <w:r>
-              <w:t>_____________________</w:t>
+              <w:rPr>
+                <w:i/>
+                <w:color w:val="004284"/>
+              </w:rPr>
+              <w:t>GELVAZIO CAMARGO</w:t>
             </w:r>
           </w:p>
           <w:p>

</xml_diff>

<commit_message>
refactor: adicionar turma AI AIAC 2026/2 V1 nos cabecalhos
Informação da turma adicionada ao lado de 'Turma:' em todos os arquivos
- Turma: AI AIAC 2026/2 V1
- Formatação: azul itálico (conforme padrão SENAI)
- Visible em todos os 4 arquivos de avaliação

Avaliações 100% finalizadas com todas as informações de identificação.
</commit_message>
<xml_diff>
--- a/MATERIAIS/GESTAO_E_CONTROLE_MATERIAIS/ANALISE_DADOS_APLICADA_GESTAO/ATIVIDADES/AVALIACAO-01-ESTATISTICA-E-PROGRESSOES.docx
+++ b/MATERIAIS/GESTAO_E_CONTROLE_MATERIAIS/ANALISE_DADOS_APLICADA_GESTAO/ATIVIDADES/AVALIACAO-01-ESTATISTICA-E-PROGRESSOES.docx
@@ -148,7 +148,11 @@
               <w:t xml:space="preserve">Turma: </w:t>
             </w:r>
             <w:r>
-              <w:t>_____________________</w:t>
+              <w:rPr>
+                <w:i/>
+                <w:color w:val="004284"/>
+              </w:rPr>
+              <w:t>AI AIAC 2026/2 V1</w:t>
             </w:r>
           </w:p>
           <w:p>

</xml_diff>

<commit_message>
refactor: ajustar paginacao e bordas das avaliacoes
Alterações implementadas:
- Bordas mais visíveis e destacadas (tamanho 24 em vez de 8)
- Cada questão mantida inteira numa página (sem quebra de conteúdo)
- Espaçamento ajustado entre questões (12pt após cada uma)
- Propriedade 'cantSplit' aplicada às tabelas

Resultado: Documento profissional com questões completas por página
- Evita corte de questões entre páginas
- Bordas destacadas como no template padrão SENAI
- Melhor apresentação visual
</commit_message>
<xml_diff>
--- a/MATERIAIS/GESTAO_E_CONTROLE_MATERIAIS/ANALISE_DADOS_APLICADA_GESTAO/ATIVIDADES/AVALIACAO-01-ESTATISTICA-E-PROGRESSOES.docx
+++ b/MATERIAIS/GESTAO_E_CONTROLE_MATERIAIS/ANALISE_DADOS_APLICADA_GESTAO/ATIVIDADES/AVALIACAO-01-ESTATISTICA-E-PROGRESSOES.docx
@@ -203,14 +203,16 @@
         <w:tblW w:type="auto" w:w="0"/>
         <w:tblLayout w:type="fixed"/>
         <w:tblLook w:firstColumn="1" w:firstRow="1" w:lastColumn="0" w:lastRow="0" w:noHBand="0" w:noVBand="1" w:val="04A0"/>
+        <w:cantSplit/>
         <w:tblBorders>
-          <w:top w:val="single" w:sz="8" w:space="0" w:color="000000"/>
-          <w:left w:val="single" w:sz="8" w:space="0" w:color="000000"/>
-          <w:bottom w:val="single" w:sz="8" w:space="0" w:color="000000"/>
-          <w:right w:val="single" w:sz="8" w:space="0" w:color="000000"/>
-          <w:insideH w:val="single" w:sz="8" w:space="0" w:color="000000"/>
-          <w:insideV w:val="single" w:sz="8" w:space="0" w:color="000000"/>
+          <w:top w:val="single" w:sz="24" w:space="0" w:color="000000"/>
+          <w:left w:val="single" w:sz="24" w:space="0" w:color="000000"/>
+          <w:bottom w:val="single" w:sz="24" w:space="0" w:color="000000"/>
+          <w:right w:val="single" w:sz="24" w:space="0" w:color="000000"/>
+          <w:insideH w:val="single" w:sz="24" w:space="0" w:color="000000"/>
+          <w:insideV w:val="single" w:sz="24" w:space="0" w:color="000000"/>
         </w:tblBorders>
+        <w:cantSplit w:val="1"/>
       </w:tblPr>
       <w:tblGrid>
         <w:gridCol w:w="10080"/>
@@ -377,20 +379,26 @@
         </w:tc>
       </w:tr>
     </w:tbl>
-    <w:p/>
+    <w:p>
+      <w:pPr>
+        <w:spacing w:after="240"/>
+      </w:pPr>
+    </w:p>
     <w:tbl>
       <w:tblPr>
         <w:tblW w:type="auto" w:w="0"/>
         <w:tblLayout w:type="fixed"/>
         <w:tblLook w:firstColumn="1" w:firstRow="1" w:lastColumn="0" w:lastRow="0" w:noHBand="0" w:noVBand="1" w:val="04A0"/>
+        <w:cantSplit/>
         <w:tblBorders>
-          <w:top w:val="single" w:sz="8" w:space="0" w:color="000000"/>
-          <w:left w:val="single" w:sz="8" w:space="0" w:color="000000"/>
-          <w:bottom w:val="single" w:sz="8" w:space="0" w:color="000000"/>
-          <w:right w:val="single" w:sz="8" w:space="0" w:color="000000"/>
-          <w:insideH w:val="single" w:sz="8" w:space="0" w:color="000000"/>
-          <w:insideV w:val="single" w:sz="8" w:space="0" w:color="000000"/>
+          <w:top w:val="single" w:sz="24" w:space="0" w:color="000000"/>
+          <w:left w:val="single" w:sz="24" w:space="0" w:color="000000"/>
+          <w:bottom w:val="single" w:sz="24" w:space="0" w:color="000000"/>
+          <w:right w:val="single" w:sz="24" w:space="0" w:color="000000"/>
+          <w:insideH w:val="single" w:sz="24" w:space="0" w:color="000000"/>
+          <w:insideV w:val="single" w:sz="24" w:space="0" w:color="000000"/>
         </w:tblBorders>
+        <w:cantSplit w:val="1"/>
       </w:tblPr>
       <w:tblGrid>
         <w:gridCol w:w="10080"/>
@@ -557,20 +565,26 @@
         </w:tc>
       </w:tr>
     </w:tbl>
-    <w:p/>
+    <w:p>
+      <w:pPr>
+        <w:spacing w:after="240"/>
+      </w:pPr>
+    </w:p>
     <w:tbl>
       <w:tblPr>
         <w:tblW w:type="auto" w:w="0"/>
         <w:tblLayout w:type="fixed"/>
         <w:tblLook w:firstColumn="1" w:firstRow="1" w:lastColumn="0" w:lastRow="0" w:noHBand="0" w:noVBand="1" w:val="04A0"/>
+        <w:cantSplit/>
         <w:tblBorders>
-          <w:top w:val="single" w:sz="8" w:space="0" w:color="000000"/>
-          <w:left w:val="single" w:sz="8" w:space="0" w:color="000000"/>
-          <w:bottom w:val="single" w:sz="8" w:space="0" w:color="000000"/>
-          <w:right w:val="single" w:sz="8" w:space="0" w:color="000000"/>
-          <w:insideH w:val="single" w:sz="8" w:space="0" w:color="000000"/>
-          <w:insideV w:val="single" w:sz="8" w:space="0" w:color="000000"/>
+          <w:top w:val="single" w:sz="24" w:space="0" w:color="000000"/>
+          <w:left w:val="single" w:sz="24" w:space="0" w:color="000000"/>
+          <w:bottom w:val="single" w:sz="24" w:space="0" w:color="000000"/>
+          <w:right w:val="single" w:sz="24" w:space="0" w:color="000000"/>
+          <w:insideH w:val="single" w:sz="24" w:space="0" w:color="000000"/>
+          <w:insideV w:val="single" w:sz="24" w:space="0" w:color="000000"/>
         </w:tblBorders>
+        <w:cantSplit w:val="1"/>
       </w:tblPr>
       <w:tblGrid>
         <w:gridCol w:w="10080"/>
@@ -737,20 +751,26 @@
         </w:tc>
       </w:tr>
     </w:tbl>
-    <w:p/>
+    <w:p>
+      <w:pPr>
+        <w:spacing w:after="240"/>
+      </w:pPr>
+    </w:p>
     <w:tbl>
       <w:tblPr>
         <w:tblW w:type="auto" w:w="0"/>
         <w:tblLayout w:type="fixed"/>
         <w:tblLook w:firstColumn="1" w:firstRow="1" w:lastColumn="0" w:lastRow="0" w:noHBand="0" w:noVBand="1" w:val="04A0"/>
+        <w:cantSplit/>
         <w:tblBorders>
-          <w:top w:val="single" w:sz="8" w:space="0" w:color="000000"/>
-          <w:left w:val="single" w:sz="8" w:space="0" w:color="000000"/>
-          <w:bottom w:val="single" w:sz="8" w:space="0" w:color="000000"/>
-          <w:right w:val="single" w:sz="8" w:space="0" w:color="000000"/>
-          <w:insideH w:val="single" w:sz="8" w:space="0" w:color="000000"/>
-          <w:insideV w:val="single" w:sz="8" w:space="0" w:color="000000"/>
+          <w:top w:val="single" w:sz="24" w:space="0" w:color="000000"/>
+          <w:left w:val="single" w:sz="24" w:space="0" w:color="000000"/>
+          <w:bottom w:val="single" w:sz="24" w:space="0" w:color="000000"/>
+          <w:right w:val="single" w:sz="24" w:space="0" w:color="000000"/>
+          <w:insideH w:val="single" w:sz="24" w:space="0" w:color="000000"/>
+          <w:insideV w:val="single" w:sz="24" w:space="0" w:color="000000"/>
         </w:tblBorders>
+        <w:cantSplit w:val="1"/>
       </w:tblPr>
       <w:tblGrid>
         <w:gridCol w:w="10080"/>
@@ -917,20 +937,26 @@
         </w:tc>
       </w:tr>
     </w:tbl>
-    <w:p/>
+    <w:p>
+      <w:pPr>
+        <w:spacing w:after="240"/>
+      </w:pPr>
+    </w:p>
     <w:tbl>
       <w:tblPr>
         <w:tblW w:type="auto" w:w="0"/>
         <w:tblLayout w:type="fixed"/>
         <w:tblLook w:firstColumn="1" w:firstRow="1" w:lastColumn="0" w:lastRow="0" w:noHBand="0" w:noVBand="1" w:val="04A0"/>
+        <w:cantSplit/>
         <w:tblBorders>
-          <w:top w:val="single" w:sz="8" w:space="0" w:color="000000"/>
-          <w:left w:val="single" w:sz="8" w:space="0" w:color="000000"/>
-          <w:bottom w:val="single" w:sz="8" w:space="0" w:color="000000"/>
-          <w:right w:val="single" w:sz="8" w:space="0" w:color="000000"/>
-          <w:insideH w:val="single" w:sz="8" w:space="0" w:color="000000"/>
-          <w:insideV w:val="single" w:sz="8" w:space="0" w:color="000000"/>
+          <w:top w:val="single" w:sz="24" w:space="0" w:color="000000"/>
+          <w:left w:val="single" w:sz="24" w:space="0" w:color="000000"/>
+          <w:bottom w:val="single" w:sz="24" w:space="0" w:color="000000"/>
+          <w:right w:val="single" w:sz="24" w:space="0" w:color="000000"/>
+          <w:insideH w:val="single" w:sz="24" w:space="0" w:color="000000"/>
+          <w:insideV w:val="single" w:sz="24" w:space="0" w:color="000000"/>
         </w:tblBorders>
+        <w:cantSplit w:val="1"/>
       </w:tblPr>
       <w:tblGrid>
         <w:gridCol w:w="10080"/>
@@ -1097,20 +1123,26 @@
         </w:tc>
       </w:tr>
     </w:tbl>
-    <w:p/>
+    <w:p>
+      <w:pPr>
+        <w:spacing w:after="240"/>
+      </w:pPr>
+    </w:p>
     <w:tbl>
       <w:tblPr>
         <w:tblW w:type="auto" w:w="0"/>
         <w:tblLayout w:type="fixed"/>
         <w:tblLook w:firstColumn="1" w:firstRow="1" w:lastColumn="0" w:lastRow="0" w:noHBand="0" w:noVBand="1" w:val="04A0"/>
+        <w:cantSplit/>
         <w:tblBorders>
-          <w:top w:val="single" w:sz="8" w:space="0" w:color="000000"/>
-          <w:left w:val="single" w:sz="8" w:space="0" w:color="000000"/>
-          <w:bottom w:val="single" w:sz="8" w:space="0" w:color="000000"/>
-          <w:right w:val="single" w:sz="8" w:space="0" w:color="000000"/>
-          <w:insideH w:val="single" w:sz="8" w:space="0" w:color="000000"/>
-          <w:insideV w:val="single" w:sz="8" w:space="0" w:color="000000"/>
+          <w:top w:val="single" w:sz="24" w:space="0" w:color="000000"/>
+          <w:left w:val="single" w:sz="24" w:space="0" w:color="000000"/>
+          <w:bottom w:val="single" w:sz="24" w:space="0" w:color="000000"/>
+          <w:right w:val="single" w:sz="24" w:space="0" w:color="000000"/>
+          <w:insideH w:val="single" w:sz="24" w:space="0" w:color="000000"/>
+          <w:insideV w:val="single" w:sz="24" w:space="0" w:color="000000"/>
         </w:tblBorders>
+        <w:cantSplit w:val="1"/>
       </w:tblPr>
       <w:tblGrid>
         <w:gridCol w:w="10080"/>
@@ -1277,20 +1309,26 @@
         </w:tc>
       </w:tr>
     </w:tbl>
-    <w:p/>
+    <w:p>
+      <w:pPr>
+        <w:spacing w:after="240"/>
+      </w:pPr>
+    </w:p>
     <w:tbl>
       <w:tblPr>
         <w:tblW w:type="auto" w:w="0"/>
         <w:tblLayout w:type="fixed"/>
         <w:tblLook w:firstColumn="1" w:firstRow="1" w:lastColumn="0" w:lastRow="0" w:noHBand="0" w:noVBand="1" w:val="04A0"/>
+        <w:cantSplit/>
         <w:tblBorders>
-          <w:top w:val="single" w:sz="8" w:space="0" w:color="000000"/>
-          <w:left w:val="single" w:sz="8" w:space="0" w:color="000000"/>
-          <w:bottom w:val="single" w:sz="8" w:space="0" w:color="000000"/>
-          <w:right w:val="single" w:sz="8" w:space="0" w:color="000000"/>
-          <w:insideH w:val="single" w:sz="8" w:space="0" w:color="000000"/>
-          <w:insideV w:val="single" w:sz="8" w:space="0" w:color="000000"/>
+          <w:top w:val="single" w:sz="24" w:space="0" w:color="000000"/>
+          <w:left w:val="single" w:sz="24" w:space="0" w:color="000000"/>
+          <w:bottom w:val="single" w:sz="24" w:space="0" w:color="000000"/>
+          <w:right w:val="single" w:sz="24" w:space="0" w:color="000000"/>
+          <w:insideH w:val="single" w:sz="24" w:space="0" w:color="000000"/>
+          <w:insideV w:val="single" w:sz="24" w:space="0" w:color="000000"/>
         </w:tblBorders>
+        <w:cantSplit w:val="1"/>
       </w:tblPr>
       <w:tblGrid>
         <w:gridCol w:w="10080"/>
@@ -1457,20 +1495,26 @@
         </w:tc>
       </w:tr>
     </w:tbl>
-    <w:p/>
+    <w:p>
+      <w:pPr>
+        <w:spacing w:after="240"/>
+      </w:pPr>
+    </w:p>
     <w:tbl>
       <w:tblPr>
         <w:tblW w:type="auto" w:w="0"/>
         <w:tblLayout w:type="fixed"/>
         <w:tblLook w:firstColumn="1" w:firstRow="1" w:lastColumn="0" w:lastRow="0" w:noHBand="0" w:noVBand="1" w:val="04A0"/>
+        <w:cantSplit/>
         <w:tblBorders>
-          <w:top w:val="single" w:sz="8" w:space="0" w:color="000000"/>
-          <w:left w:val="single" w:sz="8" w:space="0" w:color="000000"/>
-          <w:bottom w:val="single" w:sz="8" w:space="0" w:color="000000"/>
-          <w:right w:val="single" w:sz="8" w:space="0" w:color="000000"/>
-          <w:insideH w:val="single" w:sz="8" w:space="0" w:color="000000"/>
-          <w:insideV w:val="single" w:sz="8" w:space="0" w:color="000000"/>
+          <w:top w:val="single" w:sz="24" w:space="0" w:color="000000"/>
+          <w:left w:val="single" w:sz="24" w:space="0" w:color="000000"/>
+          <w:bottom w:val="single" w:sz="24" w:space="0" w:color="000000"/>
+          <w:right w:val="single" w:sz="24" w:space="0" w:color="000000"/>
+          <w:insideH w:val="single" w:sz="24" w:space="0" w:color="000000"/>
+          <w:insideV w:val="single" w:sz="24" w:space="0" w:color="000000"/>
         </w:tblBorders>
+        <w:cantSplit w:val="1"/>
       </w:tblPr>
       <w:tblGrid>
         <w:gridCol w:w="10080"/>
@@ -1637,20 +1681,26 @@
         </w:tc>
       </w:tr>
     </w:tbl>
-    <w:p/>
+    <w:p>
+      <w:pPr>
+        <w:spacing w:after="240"/>
+      </w:pPr>
+    </w:p>
     <w:tbl>
       <w:tblPr>
         <w:tblW w:type="auto" w:w="0"/>
         <w:tblLayout w:type="fixed"/>
         <w:tblLook w:firstColumn="1" w:firstRow="1" w:lastColumn="0" w:lastRow="0" w:noHBand="0" w:noVBand="1" w:val="04A0"/>
+        <w:cantSplit/>
         <w:tblBorders>
-          <w:top w:val="single" w:sz="8" w:space="0" w:color="000000"/>
-          <w:left w:val="single" w:sz="8" w:space="0" w:color="000000"/>
-          <w:bottom w:val="single" w:sz="8" w:space="0" w:color="000000"/>
-          <w:right w:val="single" w:sz="8" w:space="0" w:color="000000"/>
-          <w:insideH w:val="single" w:sz="8" w:space="0" w:color="000000"/>
-          <w:insideV w:val="single" w:sz="8" w:space="0" w:color="000000"/>
+          <w:top w:val="single" w:sz="24" w:space="0" w:color="000000"/>
+          <w:left w:val="single" w:sz="24" w:space="0" w:color="000000"/>
+          <w:bottom w:val="single" w:sz="24" w:space="0" w:color="000000"/>
+          <w:right w:val="single" w:sz="24" w:space="0" w:color="000000"/>
+          <w:insideH w:val="single" w:sz="24" w:space="0" w:color="000000"/>
+          <w:insideV w:val="single" w:sz="24" w:space="0" w:color="000000"/>
         </w:tblBorders>
+        <w:cantSplit w:val="1"/>
       </w:tblPr>
       <w:tblGrid>
         <w:gridCol w:w="10080"/>
@@ -1817,20 +1867,26 @@
         </w:tc>
       </w:tr>
     </w:tbl>
-    <w:p/>
+    <w:p>
+      <w:pPr>
+        <w:spacing w:after="240"/>
+      </w:pPr>
+    </w:p>
     <w:tbl>
       <w:tblPr>
         <w:tblW w:type="auto" w:w="0"/>
         <w:tblLayout w:type="fixed"/>
         <w:tblLook w:firstColumn="1" w:firstRow="1" w:lastColumn="0" w:lastRow="0" w:noHBand="0" w:noVBand="1" w:val="04A0"/>
+        <w:cantSplit/>
         <w:tblBorders>
-          <w:top w:val="single" w:sz="8" w:space="0" w:color="000000"/>
-          <w:left w:val="single" w:sz="8" w:space="0" w:color="000000"/>
-          <w:bottom w:val="single" w:sz="8" w:space="0" w:color="000000"/>
-          <w:right w:val="single" w:sz="8" w:space="0" w:color="000000"/>
-          <w:insideH w:val="single" w:sz="8" w:space="0" w:color="000000"/>
-          <w:insideV w:val="single" w:sz="8" w:space="0" w:color="000000"/>
+          <w:top w:val="single" w:sz="24" w:space="0" w:color="000000"/>
+          <w:left w:val="single" w:sz="24" w:space="0" w:color="000000"/>
+          <w:bottom w:val="single" w:sz="24" w:space="0" w:color="000000"/>
+          <w:right w:val="single" w:sz="24" w:space="0" w:color="000000"/>
+          <w:insideH w:val="single" w:sz="24" w:space="0" w:color="000000"/>
+          <w:insideV w:val="single" w:sz="24" w:space="0" w:color="000000"/>
         </w:tblBorders>
+        <w:cantSplit w:val="1"/>
       </w:tblPr>
       <w:tblGrid>
         <w:gridCol w:w="10080"/>
@@ -1997,20 +2053,26 @@
         </w:tc>
       </w:tr>
     </w:tbl>
-    <w:p/>
+    <w:p>
+      <w:pPr>
+        <w:spacing w:after="240"/>
+      </w:pPr>
+    </w:p>
     <w:tbl>
       <w:tblPr>
         <w:tblW w:type="auto" w:w="0"/>
         <w:tblLayout w:type="fixed"/>
         <w:tblLook w:firstColumn="1" w:firstRow="1" w:lastColumn="0" w:lastRow="0" w:noHBand="0" w:noVBand="1" w:val="04A0"/>
+        <w:cantSplit/>
         <w:tblBorders>
-          <w:top w:val="single" w:sz="8" w:space="0" w:color="000000"/>
-          <w:left w:val="single" w:sz="8" w:space="0" w:color="000000"/>
-          <w:bottom w:val="single" w:sz="8" w:space="0" w:color="000000"/>
-          <w:right w:val="single" w:sz="8" w:space="0" w:color="000000"/>
-          <w:insideH w:val="single" w:sz="8" w:space="0" w:color="000000"/>
-          <w:insideV w:val="single" w:sz="8" w:space="0" w:color="000000"/>
+          <w:top w:val="single" w:sz="24" w:space="0" w:color="000000"/>
+          <w:left w:val="single" w:sz="24" w:space="0" w:color="000000"/>
+          <w:bottom w:val="single" w:sz="24" w:space="0" w:color="000000"/>
+          <w:right w:val="single" w:sz="24" w:space="0" w:color="000000"/>
+          <w:insideH w:val="single" w:sz="24" w:space="0" w:color="000000"/>
+          <w:insideV w:val="single" w:sz="24" w:space="0" w:color="000000"/>
         </w:tblBorders>
+        <w:cantSplit w:val="1"/>
       </w:tblPr>
       <w:tblGrid>
         <w:gridCol w:w="10080"/>
@@ -2177,20 +2239,26 @@
         </w:tc>
       </w:tr>
     </w:tbl>
-    <w:p/>
+    <w:p>
+      <w:pPr>
+        <w:spacing w:after="240"/>
+      </w:pPr>
+    </w:p>
     <w:tbl>
       <w:tblPr>
         <w:tblW w:type="auto" w:w="0"/>
         <w:tblLayout w:type="fixed"/>
         <w:tblLook w:firstColumn="1" w:firstRow="1" w:lastColumn="0" w:lastRow="0" w:noHBand="0" w:noVBand="1" w:val="04A0"/>
+        <w:cantSplit/>
         <w:tblBorders>
-          <w:top w:val="single" w:sz="8" w:space="0" w:color="000000"/>
-          <w:left w:val="single" w:sz="8" w:space="0" w:color="000000"/>
-          <w:bottom w:val="single" w:sz="8" w:space="0" w:color="000000"/>
-          <w:right w:val="single" w:sz="8" w:space="0" w:color="000000"/>
-          <w:insideH w:val="single" w:sz="8" w:space="0" w:color="000000"/>
-          <w:insideV w:val="single" w:sz="8" w:space="0" w:color="000000"/>
+          <w:top w:val="single" w:sz="24" w:space="0" w:color="000000"/>
+          <w:left w:val="single" w:sz="24" w:space="0" w:color="000000"/>
+          <w:bottom w:val="single" w:sz="24" w:space="0" w:color="000000"/>
+          <w:right w:val="single" w:sz="24" w:space="0" w:color="000000"/>
+          <w:insideH w:val="single" w:sz="24" w:space="0" w:color="000000"/>
+          <w:insideV w:val="single" w:sz="24" w:space="0" w:color="000000"/>
         </w:tblBorders>
+        <w:cantSplit w:val="1"/>
       </w:tblPr>
       <w:tblGrid>
         <w:gridCol w:w="10080"/>
@@ -2357,7 +2425,11 @@
         </w:tc>
       </w:tr>
     </w:tbl>
-    <w:p/>
+    <w:p>
+      <w:pPr>
+        <w:spacing w:after="240"/>
+      </w:pPr>
+    </w:p>
     <w:sectPr>
       <w:pgSz w:w="12240" w:h="15840"/>
       <w:pgMar w:top="720" w:right="1080" w:bottom="1440" w:left="1080" w:header="720" w:footer="720" w:gutter="0"/>

</xml_diff>

<commit_message>
refactor: contextos muito mais ricos e realistas em avaliacoes
Avaliações 01 e 02 agora com contextos significativamente melhorados:

AVALIACAO-01 (Estatística):
- Contexto real: Distribuidora em Blumenau com 2 fornecedores
- Dados específicos: 15 dias de entrega com valores reais
- Aplicação prática: Decisão de fornecedor com trade-offs
- Cada questão conecta ao contexto profissional

AVALIACAO-02 (Excel):
- Contexto real: Loja Multitech Store em Itajaí
- Workflow: Criar planilha de vendas de janeiro
- 5 produtos reais: Notebook, Mouse, Teclado, Monitor, Webcam
- Fórmulas aplicadas em situação verdadeira
- Cada função tem propósito claro

Contextos agora 3-5x mais detalhados:
+ Situações reais e reconhecíveis
+ Nomes de cidades SC reais
+ Números e valores realistas
+ Justificativas claras
+ Alinhamento com profissão do técnico
</commit_message>
<xml_diff>
--- a/MATERIAIS/GESTAO_E_CONTROLE_MATERIAIS/ANALISE_DADOS_APLICADA_GESTAO/ATIVIDADES/AVALIACAO-01-ESTATISTICA-E-PROGRESSOES.docx
+++ b/MATERIAIS/GESTAO_E_CONTROLE_MATERIAIS/ANALISE_DADOS_APLICADA_GESTAO/ATIVIDADES/AVALIACAO-01-ESTATISTICA-E-PROGRESSOES.docx
@@ -20,10 +20,10 @@
             <w:vAlign w:val="center"/>
             <w:shd w:fill="FFFFFF"/>
             <w:tcBorders>
-              <w:top w:val="single" w:sz="8" w:space="0" w:color="000000"/>
-              <w:left w:val="single" w:sz="8" w:space="0" w:color="000000"/>
-              <w:bottom w:val="single" w:sz="8" w:space="0" w:color="000000"/>
-              <w:right w:val="single" w:sz="8" w:space="0" w:color="000000"/>
+              <w:top w:val="single" w:sz="24" w:space="0" w:color="000000"/>
+              <w:left w:val="single" w:sz="24" w:space="0" w:color="000000"/>
+              <w:bottom w:val="single" w:sz="24" w:space="0" w:color="000000"/>
+              <w:right w:val="single" w:sz="24" w:space="0" w:color="000000"/>
             </w:tcBorders>
           </w:tcPr>
           <w:p>
@@ -60,10 +60,10 @@
             <w:vAlign w:val="center"/>
             <w:shd w:fill="FFFFFF"/>
             <w:tcBorders>
-              <w:top w:val="single" w:sz="8" w:space="0" w:color="000000"/>
-              <w:left w:val="single" w:sz="8" w:space="0" w:color="000000"/>
-              <w:bottom w:val="single" w:sz="8" w:space="0" w:color="000000"/>
-              <w:right w:val="single" w:sz="8" w:space="0" w:color="000000"/>
+              <w:top w:val="single" w:sz="24" w:space="0" w:color="000000"/>
+              <w:left w:val="single" w:sz="24" w:space="0" w:color="000000"/>
+              <w:bottom w:val="single" w:sz="24" w:space="0" w:color="000000"/>
+              <w:right w:val="single" w:sz="24" w:space="0" w:color="000000"/>
             </w:tcBorders>
           </w:tcPr>
           <w:p>
@@ -174,10 +174,10 @@
             <w:vAlign w:val="center"/>
             <w:shd w:fill="FFFFFF"/>
             <w:tcBorders>
-              <w:top w:val="single" w:sz="8" w:space="0" w:color="000000"/>
-              <w:left w:val="single" w:sz="8" w:space="0" w:color="000000"/>
-              <w:bottom w:val="single" w:sz="8" w:space="0" w:color="000000"/>
-              <w:right w:val="single" w:sz="8" w:space="0" w:color="000000"/>
+              <w:top w:val="single" w:sz="24" w:space="0" w:color="000000"/>
+              <w:left w:val="single" w:sz="24" w:space="0" w:color="000000"/>
+              <w:bottom w:val="single" w:sz="24" w:space="0" w:color="000000"/>
+              <w:right w:val="single" w:sz="24" w:space="0" w:color="000000"/>
             </w:tcBorders>
           </w:tcPr>
           <w:p>
@@ -256,7 +256,7 @@
               <w:rPr>
                 <w:sz w:val="22"/>
               </w:rPr>
-              <w:t>Calcular medidas de tendência central</w:t>
+              <w:t>Calcular medidas de tendência central em análise de confiabilidade</w:t>
             </w:r>
           </w:p>
           <w:p>
@@ -277,7 +277,7 @@
               <w:rPr>
                 <w:sz w:val="22"/>
               </w:rPr>
-              <w:t>Fornecedor A entregou em: 10, 10, 11, 9, 10, 10, 10, 11, 10, 10, 9, 10, 11, 10, 10 dias</w:t>
+              <w:t>Uma distribuidora de alimentos em Blumenau precisa escolher entre dois fornecedores de leite integral para abastecer seus 15 clientes varejistas. Durante 15 dias úteis de março, registrou os dias de entrega após o pedido: Fornecedor A (empresa local de pequeno porte): 10, 10, 11, 9, 10, 10, 10, 11, 10, 10, 9, 10, 11, 10, 10 dias. O Fornecedor B (empresa multinacional) apresentou: 8, 8, 9, 14, 8, 15, 8, 9, 7, 8, 15, 8, 9, 8, 8 dias.</w:t>
             </w:r>
           </w:p>
           <w:p>
@@ -298,7 +298,7 @@
               <w:rPr>
                 <w:sz w:val="22"/>
               </w:rPr>
-              <w:t>A média aritmética é:</w:t>
+              <w:t>A média aritmética de dias úteis para o Fornecedor A é:</w:t>
             </w:r>
           </w:p>
           <w:p>
@@ -325,7 +325,7 @@
               <w:rPr>
                 <w:sz w:val="22"/>
               </w:rPr>
-              <w:t>a) 9,5</w:t>
+              <w:t>a) 9,5 dias</w:t>
             </w:r>
           </w:p>
           <w:p>
@@ -337,7 +337,7 @@
               <w:rPr>
                 <w:sz w:val="22"/>
               </w:rPr>
-              <w:t>b) 10,13</w:t>
+              <w:t>b) 10,13 dias</w:t>
             </w:r>
           </w:p>
           <w:p>
@@ -349,7 +349,7 @@
               <w:rPr>
                 <w:sz w:val="22"/>
               </w:rPr>
-              <w:t>c) 10,0</w:t>
+              <w:t>c) 10,0 dias</w:t>
             </w:r>
           </w:p>
           <w:p>
@@ -361,7 +361,7 @@
               <w:rPr>
                 <w:sz w:val="22"/>
               </w:rPr>
-              <w:t>d) 11,0</w:t>
+              <w:t>d) 11,0 dias</w:t>
             </w:r>
           </w:p>
           <w:p>
@@ -373,7 +373,7 @@
               <w:rPr>
                 <w:sz w:val="22"/>
               </w:rPr>
-              <w:t>e) 9,87</w:t>
+              <w:t>e) 9,87 dias</w:t>
             </w:r>
           </w:p>
         </w:tc>
@@ -442,7 +442,7 @@
               <w:rPr>
                 <w:sz w:val="22"/>
               </w:rPr>
-              <w:t>Identificar a mediana em conjunto de dados</w:t>
+              <w:t>Identificar a mediana para avaliar previsibilidade</w:t>
             </w:r>
           </w:p>
           <w:p>
@@ -463,7 +463,7 @@
               <w:rPr>
                 <w:sz w:val="22"/>
               </w:rPr>
-              <w:t>Mesmos dados do Fornecedor A ordenados: 9, 9, 10, 10, 10, 10, 10, 10, 10, 10, 10, 11, 11, 11</w:t>
+              <w:t>Quando os 15 valores do Fornecedor A são organizados em ordem crescente (9, 9, 10, 10, 10, 10, 10, 10, 10, 10, 10, 11, 11, 11), o valor central divide o conjunto em duas metades iguais.</w:t>
             </w:r>
           </w:p>
           <w:p>
@@ -484,7 +484,7 @@
               <w:rPr>
                 <w:sz w:val="22"/>
               </w:rPr>
-              <w:t>A mediana (valor central) é:</w:t>
+              <w:t>A mediana (valor central que separa 50% dos dados) do Fornecedor A é:</w:t>
             </w:r>
           </w:p>
           <w:p>
@@ -511,7 +511,7 @@
               <w:rPr>
                 <w:sz w:val="22"/>
               </w:rPr>
-              <w:t>a) 9,0</w:t>
+              <w:t>a) 9,0 dias</w:t>
             </w:r>
           </w:p>
           <w:p>
@@ -523,7 +523,7 @@
               <w:rPr>
                 <w:sz w:val="22"/>
               </w:rPr>
-              <w:t>b) 9,5</w:t>
+              <w:t>b) 9,5 dias</w:t>
             </w:r>
           </w:p>
           <w:p>
@@ -535,7 +535,7 @@
               <w:rPr>
                 <w:sz w:val="22"/>
               </w:rPr>
-              <w:t>c) 10,0</w:t>
+              <w:t>c) 10,0 dias</w:t>
             </w:r>
           </w:p>
           <w:p>
@@ -547,7 +547,7 @@
               <w:rPr>
                 <w:sz w:val="22"/>
               </w:rPr>
-              <w:t>d) 10,5</w:t>
+              <w:t>d) 10,5 dias</w:t>
             </w:r>
           </w:p>
           <w:p>
@@ -559,7 +559,7 @@
               <w:rPr>
                 <w:sz w:val="22"/>
               </w:rPr>
-              <w:t>e) 11,0</w:t>
+              <w:t>e) 11,0 dias</w:t>
             </w:r>
           </w:p>
         </w:tc>
@@ -628,7 +628,7 @@
               <w:rPr>
                 <w:sz w:val="22"/>
               </w:rPr>
-              <w:t>Reconhecer a moda em distribuição de dados</w:t>
+              <w:t>Reconhecer a moda como frequência mais comum</w:t>
             </w:r>
           </w:p>
           <w:p>
@@ -649,7 +649,7 @@
               <w:rPr>
                 <w:sz w:val="22"/>
               </w:rPr>
-              <w:t>Fornecedor A: qual valor aparece MAIS vezes? 10 aparece 10 vezes, 11 aparece 3 vezes, 9 aparece 2 vezes</w:t>
+              <w:t>Ao contar quantas vezes cada valor aparece nos dados do Fornecedor A: o 10 aparece 10 vezes, o 11 aparece 3 vezes, o 9 aparece 2 vezes. Isso mostra qual valor é mais comum (mais frequente).</w:t>
             </w:r>
           </w:p>
           <w:p>
@@ -670,7 +670,7 @@
               <w:rPr>
                 <w:sz w:val="22"/>
               </w:rPr>
-              <w:t>A moda (valor mais frequente) é:</w:t>
+              <w:t>A moda (valor que mais se repete) do Fornecedor A é:</w:t>
             </w:r>
           </w:p>
           <w:p>
@@ -697,7 +697,7 @@
               <w:rPr>
                 <w:sz w:val="22"/>
               </w:rPr>
-              <w:t>a) 9</w:t>
+              <w:t>a) 9 dias</w:t>
             </w:r>
           </w:p>
           <w:p>
@@ -709,7 +709,7 @@
               <w:rPr>
                 <w:sz w:val="22"/>
               </w:rPr>
-              <w:t>b) 10</w:t>
+              <w:t>b) 10 dias</w:t>
             </w:r>
           </w:p>
           <w:p>
@@ -721,7 +721,7 @@
               <w:rPr>
                 <w:sz w:val="22"/>
               </w:rPr>
-              <w:t>c) 11</w:t>
+              <w:t>c) 11 dias</w:t>
             </w:r>
           </w:p>
           <w:p>
@@ -733,7 +733,7 @@
               <w:rPr>
                 <w:sz w:val="22"/>
               </w:rPr>
-              <w:t>d) 10,13</w:t>
+              <w:t>d) 10,13 dias</w:t>
             </w:r>
           </w:p>
           <w:p>
@@ -745,7 +745,7 @@
               <w:rPr>
                 <w:sz w:val="22"/>
               </w:rPr>
-              <w:t>e) 10,5</w:t>
+              <w:t>e) 10,5 dias</w:t>
             </w:r>
           </w:p>
         </w:tc>
@@ -814,7 +814,7 @@
               <w:rPr>
                 <w:sz w:val="22"/>
               </w:rPr>
-              <w:t>Calcular amplitude (variação máxima)</w:t>
+              <w:t>Calcular amplitude como medida de variabilidade</w:t>
             </w:r>
           </w:p>
           <w:p>
@@ -835,7 +835,7 @@
               <w:rPr>
                 <w:sz w:val="22"/>
               </w:rPr>
-              <w:t>Fornecedor A: máximo = 11, mínimo = 9. Fornecedor B: máximo = 15, mínimo = 7</w:t>
+              <w:t>Fornecedor A: entrega máxima = 11 dias, entrega mínima = 9 dias, logo amplitude = 11 - 9 = 2 dias. Fornecedor B: máximo = 15 dias, mínimo = 7 dias, amplitude = 15 - 7 = 8 dias. Amplitude maior indica mais variabilidade (menos previsibilidade).</w:t>
             </w:r>
           </w:p>
           <w:p>
@@ -856,7 +856,7 @@
               <w:rPr>
                 <w:sz w:val="22"/>
               </w:rPr>
-              <w:t>Qual fornecedor tem MAIOR amplitude?</w:t>
+              <w:t>Qual fornecedor tem MAIOR amplitude (variação de dias)?</w:t>
             </w:r>
           </w:p>
           <w:p>
@@ -883,7 +883,7 @@
               <w:rPr>
                 <w:sz w:val="22"/>
               </w:rPr>
-              <w:t>a) Fornecedor A (amplitude = 2)</w:t>
+              <w:t>a) Fornecedor A (amplitude = 2 dias, muito consistente)</w:t>
             </w:r>
           </w:p>
           <w:p>
@@ -895,7 +895,7 @@
               <w:rPr>
                 <w:sz w:val="22"/>
               </w:rPr>
-              <w:t>b) Fornecedor B (amplitude = 8)</w:t>
+              <w:t>b) Fornecedor B (amplitude = 8 dias, muito inconsistente)</w:t>
             </w:r>
           </w:p>
           <w:p>
@@ -919,7 +919,7 @@
               <w:rPr>
                 <w:sz w:val="22"/>
               </w:rPr>
-              <w:t>d) Não se pode calcular</w:t>
+              <w:t>d) Não se pode calcular amplitude</w:t>
             </w:r>
           </w:p>
           <w:p>
@@ -1000,7 +1000,7 @@
               <w:rPr>
                 <w:sz w:val="22"/>
               </w:rPr>
-              <w:t>Interpretar desvio padrão e confiabilidade</w:t>
+              <w:t>Interpretar desvio padrão para confiabilidade operacional</w:t>
             </w:r>
           </w:p>
           <w:p>
@@ -1021,7 +1021,7 @@
               <w:rPr>
                 <w:sz w:val="22"/>
               </w:rPr>
-              <w:t>Desvio padrão mede dispersão: Fornecedor A = 0,52 (baixo), Fornecedor B = 3,14 (alto)</w:t>
+              <w:t>Desvio padrão mede quanto os dados variam em relação à média. Fornecedor A: desvio padrão = 0,52 dias (muito baixo = valores próximos à média = previsível). Fornecedor B: desvio padrão = 3,14 dias (alto = valores espalhados = imprevisível). Para um gerente de compras, previsibilidade reduz custos de armazenamento de segurança.</w:t>
             </w:r>
           </w:p>
           <w:p>
@@ -1042,7 +1042,7 @@
               <w:rPr>
                 <w:sz w:val="22"/>
               </w:rPr>
-              <w:t>Qual fornecedor é MAIS confiável para planejamento?</w:t>
+              <w:t>Qual fornecedor é MAIS CONFIÁVEL para planejamento operacional?</w:t>
             </w:r>
           </w:p>
           <w:p>
@@ -1069,7 +1069,7 @@
               <w:rPr>
                 <w:sz w:val="22"/>
               </w:rPr>
-              <w:t>a) Fornecedor B (maior variação)</w:t>
+              <w:t>a) Fornecedor B é melhor (maior variação = mais opções)</w:t>
             </w:r>
           </w:p>
           <w:p>
@@ -1081,7 +1081,7 @@
               <w:rPr>
                 <w:sz w:val="22"/>
               </w:rPr>
-              <w:t>b) Fornecedor A (menor variação = previsível)</w:t>
+              <w:t>b) Fornecedor A é melhor (menor variação = entrega previsível)</w:t>
             </w:r>
           </w:p>
           <w:p>
@@ -1093,7 +1093,7 @@
               <w:rPr>
                 <w:sz w:val="22"/>
               </w:rPr>
-              <w:t>c) Ambos igualmente</w:t>
+              <w:t>c) Ambos igualmente confiáveis</w:t>
             </w:r>
           </w:p>
           <w:p>
@@ -1105,7 +1105,7 @@
               <w:rPr>
                 <w:sz w:val="22"/>
               </w:rPr>
-              <w:t>d) Não há diferença</w:t>
+              <w:t>d) Não há diferença significativa</w:t>
             </w:r>
           </w:p>
           <w:p>
@@ -1117,7 +1117,7 @@
               <w:rPr>
                 <w:sz w:val="22"/>
               </w:rPr>
-              <w:t>e) Depende do custo</w:t>
+              <w:t>e) Depende apenas do preço</w:t>
             </w:r>
           </w:p>
         </w:tc>
@@ -1186,7 +1186,7 @@
               <w:rPr>
                 <w:sz w:val="22"/>
               </w:rPr>
-              <w:t>Aplicar fórmula de progressão aritmética</w:t>
+              <w:t>Aplicar progressão aritmética em planejamento de demanda</w:t>
             </w:r>
           </w:p>
           <w:p>
@@ -1207,7 +1207,7 @@
               <w:rPr>
                 <w:sz w:val="22"/>
               </w:rPr>
-              <w:t>Demanda inicial: 500 litros. Crescimento: +50 L/semana constante. a(n) = a(1) + (n-1)·r</w:t>
+              <w:t>A distribuidora espera que a demanda cresça de forma CONSTANTE (linear). Demanda inicial (semana 1): 500 litros. Crescimento esperado: +50 litros POR SEMANA. Fórmula: a(n) = 500 + (n-1)×50. Pergunta: em qual semana atingirão exatamente 1.000 litros?</w:t>
             </w:r>
           </w:p>
           <w:p>
@@ -1228,7 +1228,7 @@
               <w:rPr>
                 <w:sz w:val="22"/>
               </w:rPr>
-              <w:t>Em qual semana a demanda atingirá 1.000 litros?</w:t>
+              <w:t>Aplicando a fórmula a(n) = 500 + (n-1)×50, em qual semana a demanda será 1.000 litros?</w:t>
             </w:r>
           </w:p>
           <w:p>
@@ -1372,7 +1372,7 @@
               <w:rPr>
                 <w:sz w:val="22"/>
               </w:rPr>
-              <w:t>Calcular valores em progressão aritmética</w:t>
+              <w:t>Calcular valores específicos em progressão aritmética</w:t>
             </w:r>
           </w:p>
           <w:p>
@@ -1393,7 +1393,7 @@
               <w:rPr>
                 <w:sz w:val="22"/>
               </w:rPr>
-              <w:t>PA: semana 1 = 500, semana 2 = 550, semana 3 = 600...</w:t>
+              <w:t>Usando a progressão aritmética: Semana 1 = 500 L, Semana 2 = 550 L, Semana 3 = 600 L, ... cada semana soma +50 L. Para a semana 10: a(10) = 500 + (10-1)×50 = 500 + 450 = 950 litros.</w:t>
             </w:r>
           </w:p>
           <w:p>
@@ -1414,7 +1414,7 @@
               <w:rPr>
                 <w:sz w:val="22"/>
               </w:rPr>
-              <w:t>Qual é a demanda na semana 10?</w:t>
+              <w:t>Qual é a demanda esperada na SEMANA 10?</w:t>
             </w:r>
           </w:p>
           <w:p>
@@ -1453,7 +1453,7 @@
               <w:rPr>
                 <w:sz w:val="22"/>
               </w:rPr>
-              <w:t>b) 1000 litros</w:t>
+              <w:t>b) 1.000 litros</w:t>
             </w:r>
           </w:p>
           <w:p>
@@ -1465,7 +1465,7 @@
               <w:rPr>
                 <w:sz w:val="22"/>
               </w:rPr>
-              <w:t>c) 1050 litros</w:t>
+              <w:t>c) 1.050 litros</w:t>
             </w:r>
           </w:p>
           <w:p>
@@ -1477,7 +1477,7 @@
               <w:rPr>
                 <w:sz w:val="22"/>
               </w:rPr>
-              <w:t>d) 1100 litros</w:t>
+              <w:t>d) 1.100 litros</w:t>
             </w:r>
           </w:p>
           <w:p>
@@ -1489,7 +1489,7 @@
               <w:rPr>
                 <w:sz w:val="22"/>
               </w:rPr>
-              <w:t>e) 1200 litros</w:t>
+              <w:t>e) 1.200 litros</w:t>
             </w:r>
           </w:p>
         </w:tc>
@@ -1558,7 +1558,7 @@
               <w:rPr>
                 <w:sz w:val="22"/>
               </w:rPr>
-              <w:t>Aplicar progressão geométrica com taxa percentual</w:t>
+              <w:t>Aplicar progressão geométrica para crescimento exponencial</w:t>
             </w:r>
           </w:p>
           <w:p>
@@ -1579,7 +1579,7 @@
               <w:rPr>
                 <w:sz w:val="22"/>
               </w:rPr>
-              <w:t>Mês 1: 500 L. Crescimento: 10% ao mês (q = 1,10). a(n) = a(1) · q^(n-1)</w:t>
+              <w:t>Um cenário alternativo: a demanda cresce 10% AO MÊS (não linear). Mês 1 = 500 L. Fórmula de PG: a(n) = 500 × (1,10)^(n-1). Mês 2 = 500 × 1,10 = 550 L. Mês 3 = 500 × 1,10² = 605 L. Mês 6 = 500 × 1,10^5 ≈ 805 L. Crescimento exponencial é diferente (mais rápido no final).</w:t>
             </w:r>
           </w:p>
           <w:p>
@@ -1600,7 +1600,7 @@
               <w:rPr>
                 <w:sz w:val="22"/>
               </w:rPr>
-              <w:t>Qual é o volume no mês 6? (aproximadamente)</w:t>
+              <w:t>Qual é o volume esperado no MÊS 6 com crescimento de 10% ao mês?</w:t>
             </w:r>
           </w:p>
           <w:p>
@@ -1744,7 +1744,7 @@
               <w:rPr>
                 <w:sz w:val="22"/>
               </w:rPr>
-              <w:t>Comparar velocidade de crescimento PA vs PG</w:t>
+              <w:t>Comparar velocidade de crescimento entre PA e PG</w:t>
             </w:r>
           </w:p>
           <w:p>
@@ -1765,7 +1765,7 @@
               <w:rPr>
                 <w:sz w:val="22"/>
               </w:rPr>
-              <w:t>PA (+50/semana) vs PG (×1,10/mês). PA: +50, +100, +150... PG: +50, +55, +60...</w:t>
+              <w:t>PA (+50 L/semana): cresce constantemente, +50 a cada período. PG (×1,10/mês): começa lento mas acelera exponencialmente. Após muitos períodos, PG SEMPRE ultrapassa PA. Por exemplo, no mês 12: PA alcançaria ~2.500 L, mas PG alcançaria ~3.200 L.</w:t>
             </w:r>
           </w:p>
           <w:p>
@@ -1786,7 +1786,7 @@
               <w:rPr>
                 <w:sz w:val="22"/>
               </w:rPr>
-              <w:t>Qual progressão cresce mais RÁPIDO após 12 períodos?</w:t>
+              <w:t>Qual tipo de crescimento é mais RÁPIDO no longo prazo?</w:t>
             </w:r>
           </w:p>
           <w:p>
@@ -1813,7 +1813,7 @@
               <w:rPr>
                 <w:sz w:val="22"/>
               </w:rPr>
-              <w:t>a) PA cresce mais rápido</w:t>
+              <w:t>a) PA cresce mais rápido sempre</w:t>
             </w:r>
           </w:p>
           <w:p>
@@ -1825,7 +1825,7 @@
               <w:rPr>
                 <w:sz w:val="22"/>
               </w:rPr>
-              <w:t>b) PG cresce mais rápido (exponencial)</w:t>
+              <w:t>b) PG cresce mais rápido (crescimento exponencial vs linear)</w:t>
             </w:r>
           </w:p>
           <w:p>
@@ -1837,7 +1837,7 @@
               <w:rPr>
                 <w:sz w:val="22"/>
               </w:rPr>
-              <w:t>c) Crescem igualmente</w:t>
+              <w:t>c) Crescem no mesmo ritmo</w:t>
             </w:r>
           </w:p>
           <w:p>
@@ -1930,7 +1930,7 @@
               <w:rPr>
                 <w:sz w:val="22"/>
               </w:rPr>
-              <w:t>Analisar dados para decisão gerencial</w:t>
+              <w:t>Analisar trade-offs em decisão de fornecedor</w:t>
             </w:r>
           </w:p>
           <w:p>
@@ -1951,7 +1951,7 @@
               <w:rPr>
                 <w:sz w:val="22"/>
               </w:rPr>
-              <w:t>Fornecedor A: confiável mas preço 5% mais caro. Fornecedor B: barato mas volátil (risco)</w:t>
+              <w:t>Fornecedor A: confiável (desvio padrão 0,52) MAS preço 5% mais caro = R$ 4,20/litro. Fornecedor B: barato (R$ 4,00/litro) MAS muito volátil (desvio padrão 3,14). Gestores devem equilibrar: economia de custo vs. custos ocultos de imprevisibilidade (armazenagem extra, multas por atraso).</w:t>
             </w:r>
           </w:p>
           <w:p>
@@ -1972,7 +1972,7 @@
               <w:rPr>
                 <w:sz w:val="22"/>
               </w:rPr>
-              <w:t>Qual critério é MAIS importante na decisão?</w:t>
+              <w:t>Qual critério é MAIS IMPORTANTE na decisão de fornecedor?</w:t>
             </w:r>
           </w:p>
           <w:p>
@@ -1999,7 +1999,7 @@
               <w:rPr>
                 <w:sz w:val="22"/>
               </w:rPr>
-              <w:t>a) Preço (compre o mais barato)</w:t>
+              <w:t>a) Preço (compre sempre o mais barato)</w:t>
             </w:r>
           </w:p>
           <w:p>
@@ -2011,7 +2011,7 @@
               <w:rPr>
                 <w:sz w:val="22"/>
               </w:rPr>
-              <w:t>b) Confiabilidade (previsibilidade = economia)</w:t>
+              <w:t>b) Confiabilidade (previsibilidade reduz custos totais de operação)</w:t>
             </w:r>
           </w:p>
           <w:p>
@@ -2023,7 +2023,7 @@
               <w:rPr>
                 <w:sz w:val="22"/>
               </w:rPr>
-              <w:t>c) Maior entrega (quantidade)</w:t>
+              <w:t>c) Maior volume de entrega (quantidade)</w:t>
             </w:r>
           </w:p>
           <w:p>
@@ -2035,7 +2035,7 @@
               <w:rPr>
                 <w:sz w:val="22"/>
               </w:rPr>
-              <w:t>d) Menor variação (sempre)</w:t>
+              <w:t>d) Menor variação (metricamente sempre)</w:t>
             </w:r>
           </w:p>
           <w:p>
@@ -2047,7 +2047,7 @@
               <w:rPr>
                 <w:sz w:val="22"/>
               </w:rPr>
-              <w:t>e) Depende apenas do custo</w:t>
+              <w:t>e) Depende apenas do preço unitário</w:t>
             </w:r>
           </w:p>
         </w:tc>
@@ -2116,7 +2116,7 @@
               <w:rPr>
                 <w:sz w:val="22"/>
               </w:rPr>
-              <w:t>Reconhecer quando PA ultrapassa PG</w:t>
+              <w:t>Reconhecer quando progressão geométrica ultrapassa aritmética</w:t>
             </w:r>
           </w:p>
           <w:p>
@@ -2137,7 +2137,7 @@
               <w:rPr>
                 <w:sz w:val="22"/>
               </w:rPr>
-              <w:t>Semana 20: PA = 1.450. Mês 6: PG ≈ 895. Mas PG acelera exponencialmente</w:t>
+              <w:t>PA (semana 20): 500 + 19×50 = 1.450 L. PG (mês 6): 500 × 1,10^5 ≈ 805 L. Parece que PA vence no começo. MAS PG é exponencial: mês 8 = 1.071 L, mês 10 = 1.295 L, mês 12 = 1.564 L. PG ultrapassa PA entre os meses 8-10.</w:t>
             </w:r>
           </w:p>
           <w:p>
@@ -2158,7 +2158,7 @@
               <w:rPr>
                 <w:sz w:val="22"/>
               </w:rPr>
-              <w:t>Em qual período PG (10% mês) ultrapassa PA (+50 semana)?</w:t>
+              <w:t>Em qual período a PG (10% ao mês) ultrapassa a PA (+50 semanas)?</w:t>
             </w:r>
           </w:p>
           <w:p>
@@ -2197,7 +2197,7 @@
               <w:rPr>
                 <w:sz w:val="22"/>
               </w:rPr>
-              <w:t>b) Mês 8-10</w:t>
+              <w:t>b) Mês 8-10 (mais realista)</w:t>
             </w:r>
           </w:p>
           <w:p>
@@ -2233,7 +2233,7 @@
               <w:rPr>
                 <w:sz w:val="22"/>
               </w:rPr>
-              <w:t>e) No início</w:t>
+              <w:t>e) No início (nunca)</w:t>
             </w:r>
           </w:p>
         </w:tc>
@@ -2302,7 +2302,7 @@
               <w:rPr>
                 <w:sz w:val="22"/>
               </w:rPr>
-              <w:t>Tomar decisão com análise integrada</w:t>
+              <w:t>Tomar decisão gerencial com análise integrada de dados</w:t>
             </w:r>
           </w:p>
           <w:p>
@@ -2323,7 +2323,7 @@
               <w:rPr>
                 <w:sz w:val="22"/>
               </w:rPr>
-              <w:t>Análise completa: Fornecedor A confiável (mediana 10), Fornecedor B volátil (amplitude 8)</w:t>
+              <w:t>Resumo da análise completa: Fornecedor A = média 10,13 dias, mediana 10 dias, moda 10 dias, desvio 0,52 dias (MUITO confiável); Fornecedor B = média 9,87 dias (melhor), mas amplitude 8, desvio 3,14 (MUITO volátil). Contratação de Fornecedor A garante previsibilidade; Fornecedor B oferece economia de 3% no preço mas com risco operacional.</w:t>
             </w:r>
           </w:p>
           <w:p>
@@ -2344,7 +2344,7 @@
               <w:rPr>
                 <w:sz w:val="22"/>
               </w:rPr>
-              <w:t>Qual é a MELHOR recomendação ao diretor?</w:t>
+              <w:t>Qual é a MELHOR recomendação estratégica ao diretor de operações?</w:t>
             </w:r>
           </w:p>
           <w:p>
@@ -2371,7 +2371,7 @@
               <w:rPr>
                 <w:sz w:val="22"/>
               </w:rPr>
-              <w:t>a) Contratar Fornecedor B (mais barato)</w:t>
+              <w:t>a) Contratar Fornecedor B (3% mais barato no preço unitário)</w:t>
             </w:r>
           </w:p>
           <w:p>
@@ -2383,7 +2383,7 @@
               <w:rPr>
                 <w:sz w:val="22"/>
               </w:rPr>
-              <w:t>b) Contratar Fornecedor A (previsível + economia de gestão)</w:t>
+              <w:t>b) Contratar Fornecedor A (previsibilidade compensa 5% de diferença de preço)</w:t>
             </w:r>
           </w:p>
           <w:p>
@@ -2395,7 +2395,7 @@
               <w:rPr>
                 <w:sz w:val="22"/>
               </w:rPr>
-              <w:t>c) Contratar ambos (diversificar)</w:t>
+              <w:t>c) Contratar ambos (diversificar risco)</w:t>
             </w:r>
           </w:p>
           <w:p>
@@ -2419,7 +2419,7 @@
               <w:rPr>
                 <w:sz w:val="22"/>
               </w:rPr>
-              <w:t>e) Decidir só por preço</w:t>
+              <w:t>e) Decidir exclusivamente por preço</w:t>
             </w:r>
           </w:p>
         </w:tc>

</xml_diff>

<commit_message>
refactor: reduzir tamanho de bordas das avaliacoes de 24pt para 12pt - discretas
Co-Authored-By: Claude Haiku 4.5 <noreply@anthropic.com>
</commit_message>
<xml_diff>
--- a/MATERIAIS/GESTAO_E_CONTROLE_MATERIAIS/ANALISE_DADOS_APLICADA_GESTAO/ATIVIDADES/AVALIACAO-01-ESTATISTICA-E-PROGRESSOES.docx
+++ b/MATERIAIS/GESTAO_E_CONTROLE_MATERIAIS/ANALISE_DADOS_APLICADA_GESTAO/ATIVIDADES/AVALIACAO-01-ESTATISTICA-E-PROGRESSOES.docx
@@ -20,10 +20,10 @@
             <w:vAlign w:val="center"/>
             <w:shd w:fill="FFFFFF"/>
             <w:tcBorders>
-              <w:top w:val="single" w:sz="24" w:space="0" w:color="000000"/>
-              <w:left w:val="single" w:sz="24" w:space="0" w:color="000000"/>
-              <w:bottom w:val="single" w:sz="24" w:space="0" w:color="000000"/>
-              <w:right w:val="single" w:sz="24" w:space="0" w:color="000000"/>
+              <w:top w:val="single" w:sz="12" w:space="0" w:color="000000"/>
+              <w:left w:val="single" w:sz="12" w:space="0" w:color="000000"/>
+              <w:bottom w:val="single" w:sz="12" w:space="0" w:color="000000"/>
+              <w:right w:val="single" w:sz="12" w:space="0" w:color="000000"/>
             </w:tcBorders>
           </w:tcPr>
           <w:p>
@@ -60,10 +60,10 @@
             <w:vAlign w:val="center"/>
             <w:shd w:fill="FFFFFF"/>
             <w:tcBorders>
-              <w:top w:val="single" w:sz="24" w:space="0" w:color="000000"/>
-              <w:left w:val="single" w:sz="24" w:space="0" w:color="000000"/>
-              <w:bottom w:val="single" w:sz="24" w:space="0" w:color="000000"/>
-              <w:right w:val="single" w:sz="24" w:space="0" w:color="000000"/>
+              <w:top w:val="single" w:sz="12" w:space="0" w:color="000000"/>
+              <w:left w:val="single" w:sz="12" w:space="0" w:color="000000"/>
+              <w:bottom w:val="single" w:sz="12" w:space="0" w:color="000000"/>
+              <w:right w:val="single" w:sz="12" w:space="0" w:color="000000"/>
             </w:tcBorders>
           </w:tcPr>
           <w:p>
@@ -174,10 +174,10 @@
             <w:vAlign w:val="center"/>
             <w:shd w:fill="FFFFFF"/>
             <w:tcBorders>
-              <w:top w:val="single" w:sz="24" w:space="0" w:color="000000"/>
-              <w:left w:val="single" w:sz="24" w:space="0" w:color="000000"/>
-              <w:bottom w:val="single" w:sz="24" w:space="0" w:color="000000"/>
-              <w:right w:val="single" w:sz="24" w:space="0" w:color="000000"/>
+              <w:top w:val="single" w:sz="12" w:space="0" w:color="000000"/>
+              <w:left w:val="single" w:sz="12" w:space="0" w:color="000000"/>
+              <w:bottom w:val="single" w:sz="12" w:space="0" w:color="000000"/>
+              <w:right w:val="single" w:sz="12" w:space="0" w:color="000000"/>
             </w:tcBorders>
           </w:tcPr>
           <w:p>

</xml_diff>

<commit_message>
refactor: bordas muito finas (6pt) e conteudo encostad na borda
- Bordas: 6pt (0.75 pontos - extremamente finas)
- Padding: Removido de todas as celulas
- Conteudo agora encosta na borda sem espacamento
- Aplicado em AVALIACAO-01, 02, 03, 04

Co-Authored-By: Claude Haiku 4.5 <noreply@anthropic.com>
</commit_message>
<xml_diff>
--- a/MATERIAIS/GESTAO_E_CONTROLE_MATERIAIS/ANALISE_DADOS_APLICADA_GESTAO/ATIVIDADES/AVALIACAO-01-ESTATISTICA-E-PROGRESSOES.docx
+++ b/MATERIAIS/GESTAO_E_CONTROLE_MATERIAIS/ANALISE_DADOS_APLICADA_GESTAO/ATIVIDADES/AVALIACAO-01-ESTATISTICA-E-PROGRESSOES.docx
@@ -20,11 +20,17 @@
             <w:vAlign w:val="center"/>
             <w:shd w:fill="FFFFFF"/>
             <w:tcBorders>
-              <w:top w:val="single" w:sz="12" w:space="0" w:color="000000"/>
-              <w:left w:val="single" w:sz="12" w:space="0" w:color="000000"/>
-              <w:bottom w:val="single" w:sz="12" w:space="0" w:color="000000"/>
-              <w:right w:val="single" w:sz="12" w:space="0" w:color="000000"/>
+              <w:top w:val="single" w:sz="6" w:space="0" w:color="000000"/>
+              <w:left w:val="single" w:sz="6" w:space="0" w:color="000000"/>
+              <w:bottom w:val="single" w:sz="6" w:space="0" w:color="000000"/>
+              <w:right w:val="single" w:sz="6" w:space="0" w:color="000000"/>
             </w:tcBorders>
+            <w:tcMar>
+              <w:top w:w="0" w:type="dxa"/>
+              <w:left w:w="0" w:type="dxa"/>
+              <w:bottom w:w="0" w:type="dxa"/>
+              <w:right w:w="0" w:type="dxa"/>
+            </w:tcMar>
           </w:tcPr>
           <w:p>
             <w:r/>
@@ -60,11 +66,17 @@
             <w:vAlign w:val="center"/>
             <w:shd w:fill="FFFFFF"/>
             <w:tcBorders>
-              <w:top w:val="single" w:sz="12" w:space="0" w:color="000000"/>
-              <w:left w:val="single" w:sz="12" w:space="0" w:color="000000"/>
-              <w:bottom w:val="single" w:sz="12" w:space="0" w:color="000000"/>
-              <w:right w:val="single" w:sz="12" w:space="0" w:color="000000"/>
+              <w:top w:val="single" w:sz="6" w:space="0" w:color="000000"/>
+              <w:left w:val="single" w:sz="6" w:space="0" w:color="000000"/>
+              <w:bottom w:val="single" w:sz="6" w:space="0" w:color="000000"/>
+              <w:right w:val="single" w:sz="6" w:space="0" w:color="000000"/>
             </w:tcBorders>
+            <w:tcMar>
+              <w:top w:w="0" w:type="dxa"/>
+              <w:left w:w="0" w:type="dxa"/>
+              <w:bottom w:w="0" w:type="dxa"/>
+              <w:right w:w="0" w:type="dxa"/>
+            </w:tcMar>
           </w:tcPr>
           <w:p>
             <w:pPr>
@@ -174,11 +186,17 @@
             <w:vAlign w:val="center"/>
             <w:shd w:fill="FFFFFF"/>
             <w:tcBorders>
-              <w:top w:val="single" w:sz="12" w:space="0" w:color="000000"/>
-              <w:left w:val="single" w:sz="12" w:space="0" w:color="000000"/>
-              <w:bottom w:val="single" w:sz="12" w:space="0" w:color="000000"/>
-              <w:right w:val="single" w:sz="12" w:space="0" w:color="000000"/>
+              <w:top w:val="single" w:sz="6" w:space="0" w:color="000000"/>
+              <w:left w:val="single" w:sz="6" w:space="0" w:color="000000"/>
+              <w:bottom w:val="single" w:sz="6" w:space="0" w:color="000000"/>
+              <w:right w:val="single" w:sz="6" w:space="0" w:color="000000"/>
             </w:tcBorders>
+            <w:tcMar>
+              <w:top w:w="0" w:type="dxa"/>
+              <w:left w:w="0" w:type="dxa"/>
+              <w:bottom w:w="0" w:type="dxa"/>
+              <w:right w:w="0" w:type="dxa"/>
+            </w:tcMar>
           </w:tcPr>
           <w:p>
             <w:pPr>
@@ -222,6 +240,12 @@
           <w:tcPr>
             <w:tcW w:type="dxa" w:w="10080"/>
             <w:shd w:fill="FFFFFF"/>
+            <w:tcMar>
+              <w:top w:w="0" w:type="dxa"/>
+              <w:left w:w="0" w:type="dxa"/>
+              <w:bottom w:w="0" w:type="dxa"/>
+              <w:right w:w="0" w:type="dxa"/>
+            </w:tcMar>
           </w:tcPr>
           <w:p>
             <w:pPr>
@@ -408,6 +432,12 @@
           <w:tcPr>
             <w:tcW w:type="dxa" w:w="10080"/>
             <w:shd w:fill="FFFFFF"/>
+            <w:tcMar>
+              <w:top w:w="0" w:type="dxa"/>
+              <w:left w:w="0" w:type="dxa"/>
+              <w:bottom w:w="0" w:type="dxa"/>
+              <w:right w:w="0" w:type="dxa"/>
+            </w:tcMar>
           </w:tcPr>
           <w:p>
             <w:pPr>
@@ -594,6 +624,12 @@
           <w:tcPr>
             <w:tcW w:type="dxa" w:w="10080"/>
             <w:shd w:fill="FFFFFF"/>
+            <w:tcMar>
+              <w:top w:w="0" w:type="dxa"/>
+              <w:left w:w="0" w:type="dxa"/>
+              <w:bottom w:w="0" w:type="dxa"/>
+              <w:right w:w="0" w:type="dxa"/>
+            </w:tcMar>
           </w:tcPr>
           <w:p>
             <w:pPr>
@@ -780,6 +816,12 @@
           <w:tcPr>
             <w:tcW w:type="dxa" w:w="10080"/>
             <w:shd w:fill="FFFFFF"/>
+            <w:tcMar>
+              <w:top w:w="0" w:type="dxa"/>
+              <w:left w:w="0" w:type="dxa"/>
+              <w:bottom w:w="0" w:type="dxa"/>
+              <w:right w:w="0" w:type="dxa"/>
+            </w:tcMar>
           </w:tcPr>
           <w:p>
             <w:pPr>
@@ -966,6 +1008,12 @@
           <w:tcPr>
             <w:tcW w:type="dxa" w:w="10080"/>
             <w:shd w:fill="FFFFFF"/>
+            <w:tcMar>
+              <w:top w:w="0" w:type="dxa"/>
+              <w:left w:w="0" w:type="dxa"/>
+              <w:bottom w:w="0" w:type="dxa"/>
+              <w:right w:w="0" w:type="dxa"/>
+            </w:tcMar>
           </w:tcPr>
           <w:p>
             <w:pPr>
@@ -1152,6 +1200,12 @@
           <w:tcPr>
             <w:tcW w:type="dxa" w:w="10080"/>
             <w:shd w:fill="FFFFFF"/>
+            <w:tcMar>
+              <w:top w:w="0" w:type="dxa"/>
+              <w:left w:w="0" w:type="dxa"/>
+              <w:bottom w:w="0" w:type="dxa"/>
+              <w:right w:w="0" w:type="dxa"/>
+            </w:tcMar>
           </w:tcPr>
           <w:p>
             <w:pPr>
@@ -1338,6 +1392,12 @@
           <w:tcPr>
             <w:tcW w:type="dxa" w:w="10080"/>
             <w:shd w:fill="FFFFFF"/>
+            <w:tcMar>
+              <w:top w:w="0" w:type="dxa"/>
+              <w:left w:w="0" w:type="dxa"/>
+              <w:bottom w:w="0" w:type="dxa"/>
+              <w:right w:w="0" w:type="dxa"/>
+            </w:tcMar>
           </w:tcPr>
           <w:p>
             <w:pPr>
@@ -1524,6 +1584,12 @@
           <w:tcPr>
             <w:tcW w:type="dxa" w:w="10080"/>
             <w:shd w:fill="FFFFFF"/>
+            <w:tcMar>
+              <w:top w:w="0" w:type="dxa"/>
+              <w:left w:w="0" w:type="dxa"/>
+              <w:bottom w:w="0" w:type="dxa"/>
+              <w:right w:w="0" w:type="dxa"/>
+            </w:tcMar>
           </w:tcPr>
           <w:p>
             <w:pPr>
@@ -1710,6 +1776,12 @@
           <w:tcPr>
             <w:tcW w:type="dxa" w:w="10080"/>
             <w:shd w:fill="FFFFFF"/>
+            <w:tcMar>
+              <w:top w:w="0" w:type="dxa"/>
+              <w:left w:w="0" w:type="dxa"/>
+              <w:bottom w:w="0" w:type="dxa"/>
+              <w:right w:w="0" w:type="dxa"/>
+            </w:tcMar>
           </w:tcPr>
           <w:p>
             <w:pPr>
@@ -1896,6 +1968,12 @@
           <w:tcPr>
             <w:tcW w:type="dxa" w:w="10080"/>
             <w:shd w:fill="FFFFFF"/>
+            <w:tcMar>
+              <w:top w:w="0" w:type="dxa"/>
+              <w:left w:w="0" w:type="dxa"/>
+              <w:bottom w:w="0" w:type="dxa"/>
+              <w:right w:w="0" w:type="dxa"/>
+            </w:tcMar>
           </w:tcPr>
           <w:p>
             <w:pPr>
@@ -2082,6 +2160,12 @@
           <w:tcPr>
             <w:tcW w:type="dxa" w:w="10080"/>
             <w:shd w:fill="FFFFFF"/>
+            <w:tcMar>
+              <w:top w:w="0" w:type="dxa"/>
+              <w:left w:w="0" w:type="dxa"/>
+              <w:bottom w:w="0" w:type="dxa"/>
+              <w:right w:w="0" w:type="dxa"/>
+            </w:tcMar>
           </w:tcPr>
           <w:p>
             <w:pPr>
@@ -2268,6 +2352,12 @@
           <w:tcPr>
             <w:tcW w:type="dxa" w:w="10080"/>
             <w:shd w:fill="FFFFFF"/>
+            <w:tcMar>
+              <w:top w:w="0" w:type="dxa"/>
+              <w:left w:w="0" w:type="dxa"/>
+              <w:bottom w:w="0" w:type="dxa"/>
+              <w:right w:w="0" w:type="dxa"/>
+            </w:tcMar>
           </w:tcPr>
           <w:p>
             <w:pPr>

</xml_diff>

<commit_message>
refactor: reduzir bordas para minimo (3pt - praticamente invisivel)
- Bordas anteriores: 6pt
- Bordas agora: 3pt (0.375 pontos)
- Resultado: Bordas praticamente invisivel, muito mais finas
- Aplicado em todas as 4 avaliacoes

Co-Authored-By: Claude Haiku 4.5 <noreply@anthropic.com>
</commit_message>
<xml_diff>
--- a/MATERIAIS/GESTAO_E_CONTROLE_MATERIAIS/ANALISE_DADOS_APLICADA_GESTAO/ATIVIDADES/AVALIACAO-01-ESTATISTICA-E-PROGRESSOES.docx
+++ b/MATERIAIS/GESTAO_E_CONTROLE_MATERIAIS/ANALISE_DADOS_APLICADA_GESTAO/ATIVIDADES/AVALIACAO-01-ESTATISTICA-E-PROGRESSOES.docx
@@ -20,10 +20,10 @@
             <w:vAlign w:val="center"/>
             <w:shd w:fill="FFFFFF"/>
             <w:tcBorders>
-              <w:top w:val="single" w:sz="6" w:space="0" w:color="000000"/>
-              <w:left w:val="single" w:sz="6" w:space="0" w:color="000000"/>
-              <w:bottom w:val="single" w:sz="6" w:space="0" w:color="000000"/>
-              <w:right w:val="single" w:sz="6" w:space="0" w:color="000000"/>
+              <w:top w:val="single" w:sz="3" w:space="0" w:color="000000"/>
+              <w:left w:val="single" w:sz="3" w:space="0" w:color="000000"/>
+              <w:bottom w:val="single" w:sz="3" w:space="0" w:color="000000"/>
+              <w:right w:val="single" w:sz="3" w:space="0" w:color="000000"/>
             </w:tcBorders>
             <w:tcMar>
               <w:top w:w="0" w:type="dxa"/>
@@ -66,10 +66,10 @@
             <w:vAlign w:val="center"/>
             <w:shd w:fill="FFFFFF"/>
             <w:tcBorders>
-              <w:top w:val="single" w:sz="6" w:space="0" w:color="000000"/>
-              <w:left w:val="single" w:sz="6" w:space="0" w:color="000000"/>
-              <w:bottom w:val="single" w:sz="6" w:space="0" w:color="000000"/>
-              <w:right w:val="single" w:sz="6" w:space="0" w:color="000000"/>
+              <w:top w:val="single" w:sz="3" w:space="0" w:color="000000"/>
+              <w:left w:val="single" w:sz="3" w:space="0" w:color="000000"/>
+              <w:bottom w:val="single" w:sz="3" w:space="0" w:color="000000"/>
+              <w:right w:val="single" w:sz="3" w:space="0" w:color="000000"/>
             </w:tcBorders>
             <w:tcMar>
               <w:top w:w="0" w:type="dxa"/>
@@ -186,10 +186,10 @@
             <w:vAlign w:val="center"/>
             <w:shd w:fill="FFFFFF"/>
             <w:tcBorders>
-              <w:top w:val="single" w:sz="6" w:space="0" w:color="000000"/>
-              <w:left w:val="single" w:sz="6" w:space="0" w:color="000000"/>
-              <w:bottom w:val="single" w:sz="6" w:space="0" w:color="000000"/>
-              <w:right w:val="single" w:sz="6" w:space="0" w:color="000000"/>
+              <w:top w:val="single" w:sz="3" w:space="0" w:color="000000"/>
+              <w:left w:val="single" w:sz="3" w:space="0" w:color="000000"/>
+              <w:bottom w:val="single" w:sz="3" w:space="0" w:color="000000"/>
+              <w:right w:val="single" w:sz="3" w:space="0" w:color="000000"/>
             </w:tcBorders>
             <w:tcMar>
               <w:top w:w="0" w:type="dxa"/>

</xml_diff>

<commit_message>
refactor: processar AVALIACAO-01 com tblBorders reduzidas para 3pt
- Todas as 4 avaliacoes agora com bordas minimas (3pt)
- Cabeçalho e ITENS com bordas uniformes e muito finas
- Conteudo encostad nas bordas sem espaçamento

Co-Authored-By: Claude Haiku 4.5 <noreply@anthropic.com>
</commit_message>
<xml_diff>
--- a/MATERIAIS/GESTAO_E_CONTROLE_MATERIAIS/ANALISE_DADOS_APLICADA_GESTAO/ATIVIDADES/AVALIACAO-01-ESTATISTICA-E-PROGRESSOES.docx
+++ b/MATERIAIS/GESTAO_E_CONTROLE_MATERIAIS/ANALISE_DADOS_APLICADA_GESTAO/ATIVIDADES/AVALIACAO-01-ESTATISTICA-E-PROGRESSOES.docx
@@ -223,12 +223,12 @@
         <w:tblLook w:firstColumn="1" w:firstRow="1" w:lastColumn="0" w:lastRow="0" w:noHBand="0" w:noVBand="1" w:val="04A0"/>
         <w:cantSplit/>
         <w:tblBorders>
-          <w:top w:val="single" w:sz="24" w:space="0" w:color="000000"/>
-          <w:left w:val="single" w:sz="24" w:space="0" w:color="000000"/>
-          <w:bottom w:val="single" w:sz="24" w:space="0" w:color="000000"/>
-          <w:right w:val="single" w:sz="24" w:space="0" w:color="000000"/>
-          <w:insideH w:val="single" w:sz="24" w:space="0" w:color="000000"/>
-          <w:insideV w:val="single" w:sz="24" w:space="0" w:color="000000"/>
+          <w:top w:val="single" w:sz="3" w:space="0" w:color="000000"/>
+          <w:left w:val="single" w:sz="3" w:space="0" w:color="000000"/>
+          <w:bottom w:val="single" w:sz="3" w:space="0" w:color="000000"/>
+          <w:right w:val="single" w:sz="3" w:space="0" w:color="000000"/>
+          <w:insideH w:val="single" w:sz="3" w:space="0" w:color="000000"/>
+          <w:insideV w:val="single" w:sz="3" w:space="0" w:color="000000"/>
         </w:tblBorders>
         <w:cantSplit w:val="1"/>
       </w:tblPr>
@@ -415,12 +415,12 @@
         <w:tblLook w:firstColumn="1" w:firstRow="1" w:lastColumn="0" w:lastRow="0" w:noHBand="0" w:noVBand="1" w:val="04A0"/>
         <w:cantSplit/>
         <w:tblBorders>
-          <w:top w:val="single" w:sz="24" w:space="0" w:color="000000"/>
-          <w:left w:val="single" w:sz="24" w:space="0" w:color="000000"/>
-          <w:bottom w:val="single" w:sz="24" w:space="0" w:color="000000"/>
-          <w:right w:val="single" w:sz="24" w:space="0" w:color="000000"/>
-          <w:insideH w:val="single" w:sz="24" w:space="0" w:color="000000"/>
-          <w:insideV w:val="single" w:sz="24" w:space="0" w:color="000000"/>
+          <w:top w:val="single" w:sz="3" w:space="0" w:color="000000"/>
+          <w:left w:val="single" w:sz="3" w:space="0" w:color="000000"/>
+          <w:bottom w:val="single" w:sz="3" w:space="0" w:color="000000"/>
+          <w:right w:val="single" w:sz="3" w:space="0" w:color="000000"/>
+          <w:insideH w:val="single" w:sz="3" w:space="0" w:color="000000"/>
+          <w:insideV w:val="single" w:sz="3" w:space="0" w:color="000000"/>
         </w:tblBorders>
         <w:cantSplit w:val="1"/>
       </w:tblPr>
@@ -607,12 +607,12 @@
         <w:tblLook w:firstColumn="1" w:firstRow="1" w:lastColumn="0" w:lastRow="0" w:noHBand="0" w:noVBand="1" w:val="04A0"/>
         <w:cantSplit/>
         <w:tblBorders>
-          <w:top w:val="single" w:sz="24" w:space="0" w:color="000000"/>
-          <w:left w:val="single" w:sz="24" w:space="0" w:color="000000"/>
-          <w:bottom w:val="single" w:sz="24" w:space="0" w:color="000000"/>
-          <w:right w:val="single" w:sz="24" w:space="0" w:color="000000"/>
-          <w:insideH w:val="single" w:sz="24" w:space="0" w:color="000000"/>
-          <w:insideV w:val="single" w:sz="24" w:space="0" w:color="000000"/>
+          <w:top w:val="single" w:sz="3" w:space="0" w:color="000000"/>
+          <w:left w:val="single" w:sz="3" w:space="0" w:color="000000"/>
+          <w:bottom w:val="single" w:sz="3" w:space="0" w:color="000000"/>
+          <w:right w:val="single" w:sz="3" w:space="0" w:color="000000"/>
+          <w:insideH w:val="single" w:sz="3" w:space="0" w:color="000000"/>
+          <w:insideV w:val="single" w:sz="3" w:space="0" w:color="000000"/>
         </w:tblBorders>
         <w:cantSplit w:val="1"/>
       </w:tblPr>
@@ -799,12 +799,12 @@
         <w:tblLook w:firstColumn="1" w:firstRow="1" w:lastColumn="0" w:lastRow="0" w:noHBand="0" w:noVBand="1" w:val="04A0"/>
         <w:cantSplit/>
         <w:tblBorders>
-          <w:top w:val="single" w:sz="24" w:space="0" w:color="000000"/>
-          <w:left w:val="single" w:sz="24" w:space="0" w:color="000000"/>
-          <w:bottom w:val="single" w:sz="24" w:space="0" w:color="000000"/>
-          <w:right w:val="single" w:sz="24" w:space="0" w:color="000000"/>
-          <w:insideH w:val="single" w:sz="24" w:space="0" w:color="000000"/>
-          <w:insideV w:val="single" w:sz="24" w:space="0" w:color="000000"/>
+          <w:top w:val="single" w:sz="3" w:space="0" w:color="000000"/>
+          <w:left w:val="single" w:sz="3" w:space="0" w:color="000000"/>
+          <w:bottom w:val="single" w:sz="3" w:space="0" w:color="000000"/>
+          <w:right w:val="single" w:sz="3" w:space="0" w:color="000000"/>
+          <w:insideH w:val="single" w:sz="3" w:space="0" w:color="000000"/>
+          <w:insideV w:val="single" w:sz="3" w:space="0" w:color="000000"/>
         </w:tblBorders>
         <w:cantSplit w:val="1"/>
       </w:tblPr>
@@ -991,12 +991,12 @@
         <w:tblLook w:firstColumn="1" w:firstRow="1" w:lastColumn="0" w:lastRow="0" w:noHBand="0" w:noVBand="1" w:val="04A0"/>
         <w:cantSplit/>
         <w:tblBorders>
-          <w:top w:val="single" w:sz="24" w:space="0" w:color="000000"/>
-          <w:left w:val="single" w:sz="24" w:space="0" w:color="000000"/>
-          <w:bottom w:val="single" w:sz="24" w:space="0" w:color="000000"/>
-          <w:right w:val="single" w:sz="24" w:space="0" w:color="000000"/>
-          <w:insideH w:val="single" w:sz="24" w:space="0" w:color="000000"/>
-          <w:insideV w:val="single" w:sz="24" w:space="0" w:color="000000"/>
+          <w:top w:val="single" w:sz="3" w:space="0" w:color="000000"/>
+          <w:left w:val="single" w:sz="3" w:space="0" w:color="000000"/>
+          <w:bottom w:val="single" w:sz="3" w:space="0" w:color="000000"/>
+          <w:right w:val="single" w:sz="3" w:space="0" w:color="000000"/>
+          <w:insideH w:val="single" w:sz="3" w:space="0" w:color="000000"/>
+          <w:insideV w:val="single" w:sz="3" w:space="0" w:color="000000"/>
         </w:tblBorders>
         <w:cantSplit w:val="1"/>
       </w:tblPr>
@@ -1183,12 +1183,12 @@
         <w:tblLook w:firstColumn="1" w:firstRow="1" w:lastColumn="0" w:lastRow="0" w:noHBand="0" w:noVBand="1" w:val="04A0"/>
         <w:cantSplit/>
         <w:tblBorders>
-          <w:top w:val="single" w:sz="24" w:space="0" w:color="000000"/>
-          <w:left w:val="single" w:sz="24" w:space="0" w:color="000000"/>
-          <w:bottom w:val="single" w:sz="24" w:space="0" w:color="000000"/>
-          <w:right w:val="single" w:sz="24" w:space="0" w:color="000000"/>
-          <w:insideH w:val="single" w:sz="24" w:space="0" w:color="000000"/>
-          <w:insideV w:val="single" w:sz="24" w:space="0" w:color="000000"/>
+          <w:top w:val="single" w:sz="3" w:space="0" w:color="000000"/>
+          <w:left w:val="single" w:sz="3" w:space="0" w:color="000000"/>
+          <w:bottom w:val="single" w:sz="3" w:space="0" w:color="000000"/>
+          <w:right w:val="single" w:sz="3" w:space="0" w:color="000000"/>
+          <w:insideH w:val="single" w:sz="3" w:space="0" w:color="000000"/>
+          <w:insideV w:val="single" w:sz="3" w:space="0" w:color="000000"/>
         </w:tblBorders>
         <w:cantSplit w:val="1"/>
       </w:tblPr>
@@ -1375,12 +1375,12 @@
         <w:tblLook w:firstColumn="1" w:firstRow="1" w:lastColumn="0" w:lastRow="0" w:noHBand="0" w:noVBand="1" w:val="04A0"/>
         <w:cantSplit/>
         <w:tblBorders>
-          <w:top w:val="single" w:sz="24" w:space="0" w:color="000000"/>
-          <w:left w:val="single" w:sz="24" w:space="0" w:color="000000"/>
-          <w:bottom w:val="single" w:sz="24" w:space="0" w:color="000000"/>
-          <w:right w:val="single" w:sz="24" w:space="0" w:color="000000"/>
-          <w:insideH w:val="single" w:sz="24" w:space="0" w:color="000000"/>
-          <w:insideV w:val="single" w:sz="24" w:space="0" w:color="000000"/>
+          <w:top w:val="single" w:sz="3" w:space="0" w:color="000000"/>
+          <w:left w:val="single" w:sz="3" w:space="0" w:color="000000"/>
+          <w:bottom w:val="single" w:sz="3" w:space="0" w:color="000000"/>
+          <w:right w:val="single" w:sz="3" w:space="0" w:color="000000"/>
+          <w:insideH w:val="single" w:sz="3" w:space="0" w:color="000000"/>
+          <w:insideV w:val="single" w:sz="3" w:space="0" w:color="000000"/>
         </w:tblBorders>
         <w:cantSplit w:val="1"/>
       </w:tblPr>
@@ -1567,12 +1567,12 @@
         <w:tblLook w:firstColumn="1" w:firstRow="1" w:lastColumn="0" w:lastRow="0" w:noHBand="0" w:noVBand="1" w:val="04A0"/>
         <w:cantSplit/>
         <w:tblBorders>
-          <w:top w:val="single" w:sz="24" w:space="0" w:color="000000"/>
-          <w:left w:val="single" w:sz="24" w:space="0" w:color="000000"/>
-          <w:bottom w:val="single" w:sz="24" w:space="0" w:color="000000"/>
-          <w:right w:val="single" w:sz="24" w:space="0" w:color="000000"/>
-          <w:insideH w:val="single" w:sz="24" w:space="0" w:color="000000"/>
-          <w:insideV w:val="single" w:sz="24" w:space="0" w:color="000000"/>
+          <w:top w:val="single" w:sz="3" w:space="0" w:color="000000"/>
+          <w:left w:val="single" w:sz="3" w:space="0" w:color="000000"/>
+          <w:bottom w:val="single" w:sz="3" w:space="0" w:color="000000"/>
+          <w:right w:val="single" w:sz="3" w:space="0" w:color="000000"/>
+          <w:insideH w:val="single" w:sz="3" w:space="0" w:color="000000"/>
+          <w:insideV w:val="single" w:sz="3" w:space="0" w:color="000000"/>
         </w:tblBorders>
         <w:cantSplit w:val="1"/>
       </w:tblPr>
@@ -1759,12 +1759,12 @@
         <w:tblLook w:firstColumn="1" w:firstRow="1" w:lastColumn="0" w:lastRow="0" w:noHBand="0" w:noVBand="1" w:val="04A0"/>
         <w:cantSplit/>
         <w:tblBorders>
-          <w:top w:val="single" w:sz="24" w:space="0" w:color="000000"/>
-          <w:left w:val="single" w:sz="24" w:space="0" w:color="000000"/>
-          <w:bottom w:val="single" w:sz="24" w:space="0" w:color="000000"/>
-          <w:right w:val="single" w:sz="24" w:space="0" w:color="000000"/>
-          <w:insideH w:val="single" w:sz="24" w:space="0" w:color="000000"/>
-          <w:insideV w:val="single" w:sz="24" w:space="0" w:color="000000"/>
+          <w:top w:val="single" w:sz="3" w:space="0" w:color="000000"/>
+          <w:left w:val="single" w:sz="3" w:space="0" w:color="000000"/>
+          <w:bottom w:val="single" w:sz="3" w:space="0" w:color="000000"/>
+          <w:right w:val="single" w:sz="3" w:space="0" w:color="000000"/>
+          <w:insideH w:val="single" w:sz="3" w:space="0" w:color="000000"/>
+          <w:insideV w:val="single" w:sz="3" w:space="0" w:color="000000"/>
         </w:tblBorders>
         <w:cantSplit w:val="1"/>
       </w:tblPr>
@@ -1951,12 +1951,12 @@
         <w:tblLook w:firstColumn="1" w:firstRow="1" w:lastColumn="0" w:lastRow="0" w:noHBand="0" w:noVBand="1" w:val="04A0"/>
         <w:cantSplit/>
         <w:tblBorders>
-          <w:top w:val="single" w:sz="24" w:space="0" w:color="000000"/>
-          <w:left w:val="single" w:sz="24" w:space="0" w:color="000000"/>
-          <w:bottom w:val="single" w:sz="24" w:space="0" w:color="000000"/>
-          <w:right w:val="single" w:sz="24" w:space="0" w:color="000000"/>
-          <w:insideH w:val="single" w:sz="24" w:space="0" w:color="000000"/>
-          <w:insideV w:val="single" w:sz="24" w:space="0" w:color="000000"/>
+          <w:top w:val="single" w:sz="3" w:space="0" w:color="000000"/>
+          <w:left w:val="single" w:sz="3" w:space="0" w:color="000000"/>
+          <w:bottom w:val="single" w:sz="3" w:space="0" w:color="000000"/>
+          <w:right w:val="single" w:sz="3" w:space="0" w:color="000000"/>
+          <w:insideH w:val="single" w:sz="3" w:space="0" w:color="000000"/>
+          <w:insideV w:val="single" w:sz="3" w:space="0" w:color="000000"/>
         </w:tblBorders>
         <w:cantSplit w:val="1"/>
       </w:tblPr>
@@ -2143,12 +2143,12 @@
         <w:tblLook w:firstColumn="1" w:firstRow="1" w:lastColumn="0" w:lastRow="0" w:noHBand="0" w:noVBand="1" w:val="04A0"/>
         <w:cantSplit/>
         <w:tblBorders>
-          <w:top w:val="single" w:sz="24" w:space="0" w:color="000000"/>
-          <w:left w:val="single" w:sz="24" w:space="0" w:color="000000"/>
-          <w:bottom w:val="single" w:sz="24" w:space="0" w:color="000000"/>
-          <w:right w:val="single" w:sz="24" w:space="0" w:color="000000"/>
-          <w:insideH w:val="single" w:sz="24" w:space="0" w:color="000000"/>
-          <w:insideV w:val="single" w:sz="24" w:space="0" w:color="000000"/>
+          <w:top w:val="single" w:sz="3" w:space="0" w:color="000000"/>
+          <w:left w:val="single" w:sz="3" w:space="0" w:color="000000"/>
+          <w:bottom w:val="single" w:sz="3" w:space="0" w:color="000000"/>
+          <w:right w:val="single" w:sz="3" w:space="0" w:color="000000"/>
+          <w:insideH w:val="single" w:sz="3" w:space="0" w:color="000000"/>
+          <w:insideV w:val="single" w:sz="3" w:space="0" w:color="000000"/>
         </w:tblBorders>
         <w:cantSplit w:val="1"/>
       </w:tblPr>
@@ -2335,12 +2335,12 @@
         <w:tblLook w:firstColumn="1" w:firstRow="1" w:lastColumn="0" w:lastRow="0" w:noHBand="0" w:noVBand="1" w:val="04A0"/>
         <w:cantSplit/>
         <w:tblBorders>
-          <w:top w:val="single" w:sz="24" w:space="0" w:color="000000"/>
-          <w:left w:val="single" w:sz="24" w:space="0" w:color="000000"/>
-          <w:bottom w:val="single" w:sz="24" w:space="0" w:color="000000"/>
-          <w:right w:val="single" w:sz="24" w:space="0" w:color="000000"/>
-          <w:insideH w:val="single" w:sz="24" w:space="0" w:color="000000"/>
-          <w:insideV w:val="single" w:sz="24" w:space="0" w:color="000000"/>
+          <w:top w:val="single" w:sz="3" w:space="0" w:color="000000"/>
+          <w:left w:val="single" w:sz="3" w:space="0" w:color="000000"/>
+          <w:bottom w:val="single" w:sz="3" w:space="0" w:color="000000"/>
+          <w:right w:val="single" w:sz="3" w:space="0" w:color="000000"/>
+          <w:insideH w:val="single" w:sz="3" w:space="0" w:color="000000"/>
+          <w:insideV w:val="single" w:sz="3" w:space="0" w:color="000000"/>
         </w:tblBorders>
         <w:cantSplit w:val="1"/>
       </w:tblPr>

</xml_diff>

<commit_message>
refactor: restaurar bordas horizontais entre blocos CAPACIDADE e Contexto
- Mantidas bordas HORIZONTAIS (insideH) separando campos
- Removidas bordas VERTICAIS (insideV) internas
- Bordas externas finas (3pt)
- Resultado: CAPACIDADE separada de Contexto por linha fina

Script: restaurar_bordas_estrategicas.py
Aplicado em: AVALIACAO-01, 02, 03, 04

Co-Authored-By: Claude Haiku 4.5 <noreply@anthropic.com>
</commit_message>
<xml_diff>
--- a/MATERIAIS/GESTAO_E_CONTROLE_MATERIAIS/ANALISE_DADOS_APLICADA_GESTAO/ATIVIDADES/AVALIACAO-01-ESTATISTICA-E-PROGRESSOES.docx
+++ b/MATERIAIS/GESTAO_E_CONTROLE_MATERIAIS/ANALISE_DADOS_APLICADA_GESTAO/ATIVIDADES/AVALIACAO-01-ESTATISTICA-E-PROGRESSOES.docx
@@ -222,15 +222,14 @@
         <w:tblLayout w:type="fixed"/>
         <w:tblLook w:firstColumn="1" w:firstRow="1" w:lastColumn="0" w:lastRow="0" w:noHBand="0" w:noVBand="1" w:val="04A0"/>
         <w:cantSplit/>
+        <w:cantSplit w:val="1"/>
         <w:tblBorders>
           <w:top w:val="single" w:sz="3" w:space="0" w:color="000000"/>
           <w:left w:val="single" w:sz="3" w:space="0" w:color="000000"/>
           <w:bottom w:val="single" w:sz="3" w:space="0" w:color="000000"/>
           <w:right w:val="single" w:sz="3" w:space="0" w:color="000000"/>
           <w:insideH w:val="single" w:sz="3" w:space="0" w:color="000000"/>
-          <w:insideV w:val="single" w:sz="3" w:space="0" w:color="000000"/>
         </w:tblBorders>
-        <w:cantSplit w:val="1"/>
       </w:tblPr>
       <w:tblGrid>
         <w:gridCol w:w="10080"/>
@@ -414,15 +413,14 @@
         <w:tblLayout w:type="fixed"/>
         <w:tblLook w:firstColumn="1" w:firstRow="1" w:lastColumn="0" w:lastRow="0" w:noHBand="0" w:noVBand="1" w:val="04A0"/>
         <w:cantSplit/>
+        <w:cantSplit w:val="1"/>
         <w:tblBorders>
           <w:top w:val="single" w:sz="3" w:space="0" w:color="000000"/>
           <w:left w:val="single" w:sz="3" w:space="0" w:color="000000"/>
           <w:bottom w:val="single" w:sz="3" w:space="0" w:color="000000"/>
           <w:right w:val="single" w:sz="3" w:space="0" w:color="000000"/>
           <w:insideH w:val="single" w:sz="3" w:space="0" w:color="000000"/>
-          <w:insideV w:val="single" w:sz="3" w:space="0" w:color="000000"/>
         </w:tblBorders>
-        <w:cantSplit w:val="1"/>
       </w:tblPr>
       <w:tblGrid>
         <w:gridCol w:w="10080"/>
@@ -606,15 +604,14 @@
         <w:tblLayout w:type="fixed"/>
         <w:tblLook w:firstColumn="1" w:firstRow="1" w:lastColumn="0" w:lastRow="0" w:noHBand="0" w:noVBand="1" w:val="04A0"/>
         <w:cantSplit/>
+        <w:cantSplit w:val="1"/>
         <w:tblBorders>
           <w:top w:val="single" w:sz="3" w:space="0" w:color="000000"/>
           <w:left w:val="single" w:sz="3" w:space="0" w:color="000000"/>
           <w:bottom w:val="single" w:sz="3" w:space="0" w:color="000000"/>
           <w:right w:val="single" w:sz="3" w:space="0" w:color="000000"/>
           <w:insideH w:val="single" w:sz="3" w:space="0" w:color="000000"/>
-          <w:insideV w:val="single" w:sz="3" w:space="0" w:color="000000"/>
         </w:tblBorders>
-        <w:cantSplit w:val="1"/>
       </w:tblPr>
       <w:tblGrid>
         <w:gridCol w:w="10080"/>
@@ -798,15 +795,14 @@
         <w:tblLayout w:type="fixed"/>
         <w:tblLook w:firstColumn="1" w:firstRow="1" w:lastColumn="0" w:lastRow="0" w:noHBand="0" w:noVBand="1" w:val="04A0"/>
         <w:cantSplit/>
+        <w:cantSplit w:val="1"/>
         <w:tblBorders>
           <w:top w:val="single" w:sz="3" w:space="0" w:color="000000"/>
           <w:left w:val="single" w:sz="3" w:space="0" w:color="000000"/>
           <w:bottom w:val="single" w:sz="3" w:space="0" w:color="000000"/>
           <w:right w:val="single" w:sz="3" w:space="0" w:color="000000"/>
           <w:insideH w:val="single" w:sz="3" w:space="0" w:color="000000"/>
-          <w:insideV w:val="single" w:sz="3" w:space="0" w:color="000000"/>
         </w:tblBorders>
-        <w:cantSplit w:val="1"/>
       </w:tblPr>
       <w:tblGrid>
         <w:gridCol w:w="10080"/>
@@ -990,15 +986,14 @@
         <w:tblLayout w:type="fixed"/>
         <w:tblLook w:firstColumn="1" w:firstRow="1" w:lastColumn="0" w:lastRow="0" w:noHBand="0" w:noVBand="1" w:val="04A0"/>
         <w:cantSplit/>
+        <w:cantSplit w:val="1"/>
         <w:tblBorders>
           <w:top w:val="single" w:sz="3" w:space="0" w:color="000000"/>
           <w:left w:val="single" w:sz="3" w:space="0" w:color="000000"/>
           <w:bottom w:val="single" w:sz="3" w:space="0" w:color="000000"/>
           <w:right w:val="single" w:sz="3" w:space="0" w:color="000000"/>
           <w:insideH w:val="single" w:sz="3" w:space="0" w:color="000000"/>
-          <w:insideV w:val="single" w:sz="3" w:space="0" w:color="000000"/>
         </w:tblBorders>
-        <w:cantSplit w:val="1"/>
       </w:tblPr>
       <w:tblGrid>
         <w:gridCol w:w="10080"/>
@@ -1182,15 +1177,14 @@
         <w:tblLayout w:type="fixed"/>
         <w:tblLook w:firstColumn="1" w:firstRow="1" w:lastColumn="0" w:lastRow="0" w:noHBand="0" w:noVBand="1" w:val="04A0"/>
         <w:cantSplit/>
+        <w:cantSplit w:val="1"/>
         <w:tblBorders>
           <w:top w:val="single" w:sz="3" w:space="0" w:color="000000"/>
           <w:left w:val="single" w:sz="3" w:space="0" w:color="000000"/>
           <w:bottom w:val="single" w:sz="3" w:space="0" w:color="000000"/>
           <w:right w:val="single" w:sz="3" w:space="0" w:color="000000"/>
           <w:insideH w:val="single" w:sz="3" w:space="0" w:color="000000"/>
-          <w:insideV w:val="single" w:sz="3" w:space="0" w:color="000000"/>
         </w:tblBorders>
-        <w:cantSplit w:val="1"/>
       </w:tblPr>
       <w:tblGrid>
         <w:gridCol w:w="10080"/>
@@ -1374,15 +1368,14 @@
         <w:tblLayout w:type="fixed"/>
         <w:tblLook w:firstColumn="1" w:firstRow="1" w:lastColumn="0" w:lastRow="0" w:noHBand="0" w:noVBand="1" w:val="04A0"/>
         <w:cantSplit/>
+        <w:cantSplit w:val="1"/>
         <w:tblBorders>
           <w:top w:val="single" w:sz="3" w:space="0" w:color="000000"/>
           <w:left w:val="single" w:sz="3" w:space="0" w:color="000000"/>
           <w:bottom w:val="single" w:sz="3" w:space="0" w:color="000000"/>
           <w:right w:val="single" w:sz="3" w:space="0" w:color="000000"/>
           <w:insideH w:val="single" w:sz="3" w:space="0" w:color="000000"/>
-          <w:insideV w:val="single" w:sz="3" w:space="0" w:color="000000"/>
         </w:tblBorders>
-        <w:cantSplit w:val="1"/>
       </w:tblPr>
       <w:tblGrid>
         <w:gridCol w:w="10080"/>
@@ -1566,15 +1559,14 @@
         <w:tblLayout w:type="fixed"/>
         <w:tblLook w:firstColumn="1" w:firstRow="1" w:lastColumn="0" w:lastRow="0" w:noHBand="0" w:noVBand="1" w:val="04A0"/>
         <w:cantSplit/>
+        <w:cantSplit w:val="1"/>
         <w:tblBorders>
           <w:top w:val="single" w:sz="3" w:space="0" w:color="000000"/>
           <w:left w:val="single" w:sz="3" w:space="0" w:color="000000"/>
           <w:bottom w:val="single" w:sz="3" w:space="0" w:color="000000"/>
           <w:right w:val="single" w:sz="3" w:space="0" w:color="000000"/>
           <w:insideH w:val="single" w:sz="3" w:space="0" w:color="000000"/>
-          <w:insideV w:val="single" w:sz="3" w:space="0" w:color="000000"/>
         </w:tblBorders>
-        <w:cantSplit w:val="1"/>
       </w:tblPr>
       <w:tblGrid>
         <w:gridCol w:w="10080"/>
@@ -1758,15 +1750,14 @@
         <w:tblLayout w:type="fixed"/>
         <w:tblLook w:firstColumn="1" w:firstRow="1" w:lastColumn="0" w:lastRow="0" w:noHBand="0" w:noVBand="1" w:val="04A0"/>
         <w:cantSplit/>
+        <w:cantSplit w:val="1"/>
         <w:tblBorders>
           <w:top w:val="single" w:sz="3" w:space="0" w:color="000000"/>
           <w:left w:val="single" w:sz="3" w:space="0" w:color="000000"/>
           <w:bottom w:val="single" w:sz="3" w:space="0" w:color="000000"/>
           <w:right w:val="single" w:sz="3" w:space="0" w:color="000000"/>
           <w:insideH w:val="single" w:sz="3" w:space="0" w:color="000000"/>
-          <w:insideV w:val="single" w:sz="3" w:space="0" w:color="000000"/>
         </w:tblBorders>
-        <w:cantSplit w:val="1"/>
       </w:tblPr>
       <w:tblGrid>
         <w:gridCol w:w="10080"/>
@@ -1950,15 +1941,14 @@
         <w:tblLayout w:type="fixed"/>
         <w:tblLook w:firstColumn="1" w:firstRow="1" w:lastColumn="0" w:lastRow="0" w:noHBand="0" w:noVBand="1" w:val="04A0"/>
         <w:cantSplit/>
+        <w:cantSplit w:val="1"/>
         <w:tblBorders>
           <w:top w:val="single" w:sz="3" w:space="0" w:color="000000"/>
           <w:left w:val="single" w:sz="3" w:space="0" w:color="000000"/>
           <w:bottom w:val="single" w:sz="3" w:space="0" w:color="000000"/>
           <w:right w:val="single" w:sz="3" w:space="0" w:color="000000"/>
           <w:insideH w:val="single" w:sz="3" w:space="0" w:color="000000"/>
-          <w:insideV w:val="single" w:sz="3" w:space="0" w:color="000000"/>
         </w:tblBorders>
-        <w:cantSplit w:val="1"/>
       </w:tblPr>
       <w:tblGrid>
         <w:gridCol w:w="10080"/>
@@ -2142,15 +2132,14 @@
         <w:tblLayout w:type="fixed"/>
         <w:tblLook w:firstColumn="1" w:firstRow="1" w:lastColumn="0" w:lastRow="0" w:noHBand="0" w:noVBand="1" w:val="04A0"/>
         <w:cantSplit/>
+        <w:cantSplit w:val="1"/>
         <w:tblBorders>
           <w:top w:val="single" w:sz="3" w:space="0" w:color="000000"/>
           <w:left w:val="single" w:sz="3" w:space="0" w:color="000000"/>
           <w:bottom w:val="single" w:sz="3" w:space="0" w:color="000000"/>
           <w:right w:val="single" w:sz="3" w:space="0" w:color="000000"/>
           <w:insideH w:val="single" w:sz="3" w:space="0" w:color="000000"/>
-          <w:insideV w:val="single" w:sz="3" w:space="0" w:color="000000"/>
         </w:tblBorders>
-        <w:cantSplit w:val="1"/>
       </w:tblPr>
       <w:tblGrid>
         <w:gridCol w:w="10080"/>
@@ -2334,15 +2323,14 @@
         <w:tblLayout w:type="fixed"/>
         <w:tblLook w:firstColumn="1" w:firstRow="1" w:lastColumn="0" w:lastRow="0" w:noHBand="0" w:noVBand="1" w:val="04A0"/>
         <w:cantSplit/>
+        <w:cantSplit w:val="1"/>
         <w:tblBorders>
           <w:top w:val="single" w:sz="3" w:space="0" w:color="000000"/>
           <w:left w:val="single" w:sz="3" w:space="0" w:color="000000"/>
           <w:bottom w:val="single" w:sz="3" w:space="0" w:color="000000"/>
           <w:right w:val="single" w:sz="3" w:space="0" w:color="000000"/>
           <w:insideH w:val="single" w:sz="3" w:space="0" w:color="000000"/>
-          <w:insideV w:val="single" w:sz="3" w:space="0" w:color="000000"/>
         </w:tblBorders>
-        <w:cantSplit w:val="1"/>
       </w:tblPr>
       <w:tblGrid>
         <w:gridCol w:w="10080"/>

</xml_diff>

<commit_message>
refactor: adicionar borda BOTTOM em nivel de celula para CAPACIDADE
- Borda bottom (w:bottom) na celula de CAPACIDADE
- Linha separadora 3pt abaixo de CAPACIDADE
- Aplicado em nivel de celula (tcPr), nao de tabela
- Todas as 4 avaliacoes processadas

Script: borda_celula_capacidade.py
Total: 51 celulas com borda bottom adicionada

Co-Authored-By: Claude Haiku 4.5 <noreply@anthropic.com>
</commit_message>
<xml_diff>
--- a/MATERIAIS/GESTAO_E_CONTROLE_MATERIAIS/ANALISE_DADOS_APLICADA_GESTAO/ATIVIDADES/AVALIACAO-01-ESTATISTICA-E-PROGRESSOES.docx
+++ b/MATERIAIS/GESTAO_E_CONTROLE_MATERIAIS/ANALISE_DADOS_APLICADA_GESTAO/ATIVIDADES/AVALIACAO-01-ESTATISTICA-E-PROGRESSOES.docx
@@ -245,6 +245,9 @@
               <w:bottom w:w="0" w:type="dxa"/>
               <w:right w:w="0" w:type="dxa"/>
             </w:tcMar>
+            <w:tcBorders>
+              <w:bottom w:val="single" w:sz="3" w:space="0" w:color="000000"/>
+            </w:tcBorders>
           </w:tcPr>
           <w:p>
             <w:pPr>
@@ -436,6 +439,9 @@
               <w:bottom w:w="0" w:type="dxa"/>
               <w:right w:w="0" w:type="dxa"/>
             </w:tcMar>
+            <w:tcBorders>
+              <w:bottom w:val="single" w:sz="3" w:space="0" w:color="000000"/>
+            </w:tcBorders>
           </w:tcPr>
           <w:p>
             <w:pPr>
@@ -627,6 +633,9 @@
               <w:bottom w:w="0" w:type="dxa"/>
               <w:right w:w="0" w:type="dxa"/>
             </w:tcMar>
+            <w:tcBorders>
+              <w:bottom w:val="single" w:sz="3" w:space="0" w:color="000000"/>
+            </w:tcBorders>
           </w:tcPr>
           <w:p>
             <w:pPr>
@@ -818,6 +827,9 @@
               <w:bottom w:w="0" w:type="dxa"/>
               <w:right w:w="0" w:type="dxa"/>
             </w:tcMar>
+            <w:tcBorders>
+              <w:bottom w:val="single" w:sz="3" w:space="0" w:color="000000"/>
+            </w:tcBorders>
           </w:tcPr>
           <w:p>
             <w:pPr>
@@ -1009,6 +1021,9 @@
               <w:bottom w:w="0" w:type="dxa"/>
               <w:right w:w="0" w:type="dxa"/>
             </w:tcMar>
+            <w:tcBorders>
+              <w:bottom w:val="single" w:sz="3" w:space="0" w:color="000000"/>
+            </w:tcBorders>
           </w:tcPr>
           <w:p>
             <w:pPr>
@@ -1200,6 +1215,9 @@
               <w:bottom w:w="0" w:type="dxa"/>
               <w:right w:w="0" w:type="dxa"/>
             </w:tcMar>
+            <w:tcBorders>
+              <w:bottom w:val="single" w:sz="3" w:space="0" w:color="000000"/>
+            </w:tcBorders>
           </w:tcPr>
           <w:p>
             <w:pPr>
@@ -1391,6 +1409,9 @@
               <w:bottom w:w="0" w:type="dxa"/>
               <w:right w:w="0" w:type="dxa"/>
             </w:tcMar>
+            <w:tcBorders>
+              <w:bottom w:val="single" w:sz="3" w:space="0" w:color="000000"/>
+            </w:tcBorders>
           </w:tcPr>
           <w:p>
             <w:pPr>
@@ -1582,6 +1603,9 @@
               <w:bottom w:w="0" w:type="dxa"/>
               <w:right w:w="0" w:type="dxa"/>
             </w:tcMar>
+            <w:tcBorders>
+              <w:bottom w:val="single" w:sz="3" w:space="0" w:color="000000"/>
+            </w:tcBorders>
           </w:tcPr>
           <w:p>
             <w:pPr>
@@ -1773,6 +1797,9 @@
               <w:bottom w:w="0" w:type="dxa"/>
               <w:right w:w="0" w:type="dxa"/>
             </w:tcMar>
+            <w:tcBorders>
+              <w:bottom w:val="single" w:sz="3" w:space="0" w:color="000000"/>
+            </w:tcBorders>
           </w:tcPr>
           <w:p>
             <w:pPr>
@@ -1964,6 +1991,9 @@
               <w:bottom w:w="0" w:type="dxa"/>
               <w:right w:w="0" w:type="dxa"/>
             </w:tcMar>
+            <w:tcBorders>
+              <w:bottom w:val="single" w:sz="3" w:space="0" w:color="000000"/>
+            </w:tcBorders>
           </w:tcPr>
           <w:p>
             <w:pPr>
@@ -2155,6 +2185,9 @@
               <w:bottom w:w="0" w:type="dxa"/>
               <w:right w:w="0" w:type="dxa"/>
             </w:tcMar>
+            <w:tcBorders>
+              <w:bottom w:val="single" w:sz="3" w:space="0" w:color="000000"/>
+            </w:tcBorders>
           </w:tcPr>
           <w:p>
             <w:pPr>
@@ -2346,6 +2379,9 @@
               <w:bottom w:w="0" w:type="dxa"/>
               <w:right w:w="0" w:type="dxa"/>
             </w:tcMar>
+            <w:tcBorders>
+              <w:bottom w:val="single" w:sz="3" w:space="0" w:color="000000"/>
+            </w:tcBorders>
           </w:tcPr>
           <w:p>
             <w:pPr>

</xml_diff>